<commit_message>
Remove all emoji icons for professional appearance
</commit_message>
<xml_diff>
--- a/MLDP Program Codes Submission Declaration.docx
+++ b/MLDP Program Codes Submission Declaration.docx
@@ -7,7 +7,7 @@
         <w:spacing w:after="0" w:line="240" w:lineRule="auto"/>
         <w:jc w:val="center"/>
         <w:rPr>
-          <w:rFonts w:ascii="Arial" w:eastAsia="DengXian" w:hAnsi="Arial" w:cs="Arial"/>
+          <w:rFonts w:ascii="Arial" w:eastAsia="等线" w:hAnsi="Arial" w:cs="Arial"/>
           <w:kern w:val="0"/>
           <w:szCs w:val="20"/>
           <w:lang w:val="en-GB" w:eastAsia="en-US"/>
@@ -16,7 +16,7 @@
       </w:pPr>
       <w:r>
         <w:rPr>
-          <w:rFonts w:ascii="Arial" w:eastAsia="DengXian" w:hAnsi="Arial" w:cs="Arial"/>
+          <w:rFonts w:ascii="Arial" w:eastAsia="等线" w:hAnsi="Arial" w:cs="Arial"/>
           <w:noProof/>
           <w:kern w:val="0"/>
           <w:szCs w:val="20"/>
@@ -24,7 +24,7 @@
           <w14:ligatures w14:val="none"/>
         </w:rPr>
         <w:drawing>
-          <wp:inline distT="0" distB="0" distL="0" distR="0" wp14:anchorId="0FD526D5" wp14:editId="409F83B2">
+          <wp:inline distT="0" distB="0" distL="0" distR="0" wp14:anchorId="669E89CD" wp14:editId="6B196446">
             <wp:extent cx="1905000" cy="533400"/>
             <wp:effectExtent l="0" t="0" r="0" b="0"/>
             <wp:docPr id="1485741365" name="Picture 3" descr="A red text on a white background&#10;&#10;AI-generated content may be incorrect."/>
@@ -41,7 +41,7 @@
                     </pic:cNvPicPr>
                   </pic:nvPicPr>
                   <pic:blipFill>
-                    <a:blip r:embed="rId10" cstate="print">
+                    <a:blip r:embed="rId11" cstate="print">
                       <a:extLst>
                         <a:ext uri="{28A0092B-C50C-407E-A947-70E740481C1C}">
                           <a14:useLocalDpi xmlns:a14="http://schemas.microsoft.com/office/drawing/2010/main" val="0"/>
@@ -53,7 +53,7 @@
                       <a:fillRect/>
                     </a:stretch>
                   </pic:blipFill>
-                  <pic:spPr bwMode="auto">
+                  <pic:spPr>
                     <a:xfrm>
                       <a:off x="0" y="0"/>
                       <a:ext cx="1905000" cy="533400"/>
@@ -78,7 +78,7 @@
         <w:spacing w:after="0" w:line="240" w:lineRule="auto"/>
         <w:jc w:val="center"/>
         <w:rPr>
-          <w:rFonts w:ascii="Arial" w:eastAsia="DengXian" w:hAnsi="Arial" w:cs="Arial"/>
+          <w:rFonts w:ascii="Arial" w:eastAsia="等线" w:hAnsi="Arial" w:cs="Arial"/>
           <w:kern w:val="0"/>
           <w:szCs w:val="20"/>
           <w:lang w:val="en-GB" w:eastAsia="en-US"/>
@@ -90,7 +90,7 @@
       <w:pPr>
         <w:spacing w:after="0" w:line="240" w:lineRule="auto"/>
         <w:rPr>
-          <w:rFonts w:ascii="Arial" w:eastAsia="DengXian" w:hAnsi="Arial" w:cs="Arial"/>
+          <w:rFonts w:ascii="Arial" w:eastAsia="等线" w:hAnsi="Arial" w:cs="Arial"/>
           <w:kern w:val="0"/>
           <w:szCs w:val="20"/>
           <w:lang w:val="en-GB" w:eastAsia="en-US"/>
@@ -103,7 +103,7 @@
         <w:spacing w:after="0" w:line="240" w:lineRule="auto"/>
         <w:jc w:val="center"/>
         <w:rPr>
-          <w:rFonts w:ascii="Arial" w:eastAsia="DengXian" w:hAnsi="Arial" w:cs="Arial"/>
+          <w:rFonts w:ascii="Arial" w:eastAsia="等线" w:hAnsi="Arial" w:cs="Arial"/>
           <w:b/>
           <w:bCs/>
           <w:kern w:val="0"/>
@@ -115,7 +115,7 @@
       </w:pPr>
       <w:r>
         <w:rPr>
-          <w:rFonts w:ascii="Arial" w:eastAsia="DengXian" w:hAnsi="Arial" w:cs="Arial"/>
+          <w:rFonts w:ascii="Arial" w:eastAsia="等线" w:hAnsi="Arial" w:cs="Arial"/>
           <w:b/>
           <w:bCs/>
           <w:kern w:val="0"/>
@@ -132,7 +132,7 @@
         <w:spacing w:after="0" w:line="240" w:lineRule="auto"/>
         <w:jc w:val="center"/>
         <w:rPr>
-          <w:rFonts w:ascii="Arial" w:eastAsia="DengXian" w:hAnsi="Arial" w:cs="Arial"/>
+          <w:rFonts w:ascii="Arial" w:eastAsia="等线" w:hAnsi="Arial" w:cs="Arial"/>
           <w:b/>
           <w:bCs/>
           <w:kern w:val="0"/>
@@ -144,7 +144,7 @@
       </w:pPr>
       <w:r>
         <w:rPr>
-          <w:rFonts w:ascii="Arial" w:eastAsia="DengXian" w:hAnsi="Arial" w:cs="Arial"/>
+          <w:rFonts w:ascii="Arial" w:eastAsia="等线" w:hAnsi="Arial" w:cs="Arial"/>
           <w:b/>
           <w:bCs/>
           <w:kern w:val="0"/>
@@ -153,11 +153,15 @@
           <w:lang w:val="en-GB" w:eastAsia="en-US"/>
           <w14:ligatures w14:val="none"/>
         </w:rPr>
-        <w:t xml:space="preserve">Diploma in </w:t>
-      </w:r>
-      <w:r>
-        <w:rPr>
-          <w:rFonts w:ascii="Arial" w:eastAsia="DengXian" w:hAnsi="Arial" w:cs="Arial"/>
+        <w:t>Diploma in Information Technology</w:t>
+      </w:r>
+    </w:p>
+    <w:p>
+      <w:pPr>
+        <w:spacing w:after="0" w:line="240" w:lineRule="auto"/>
+        <w:jc w:val="center"/>
+        <w:rPr>
+          <w:rFonts w:ascii="Arial" w:eastAsia="等线" w:hAnsi="Arial" w:cs="Arial"/>
           <w:b/>
           <w:bCs/>
           <w:kern w:val="0"/>
@@ -166,15 +170,14 @@
           <w:lang w:val="en-GB" w:eastAsia="en-US"/>
           <w14:ligatures w14:val="none"/>
         </w:rPr>
-        <w:t>Information Technology</w:t>
-      </w:r>
+      </w:pPr>
     </w:p>
     <w:p>
       <w:pPr>
         <w:spacing w:after="0" w:line="240" w:lineRule="auto"/>
         <w:jc w:val="center"/>
         <w:rPr>
-          <w:rFonts w:ascii="Arial" w:eastAsia="DengXian" w:hAnsi="Arial" w:cs="Arial"/>
+          <w:rFonts w:ascii="Arial" w:eastAsia="等线" w:hAnsi="Arial" w:cs="Arial"/>
           <w:b/>
           <w:bCs/>
           <w:kern w:val="0"/>
@@ -184,13 +187,26 @@
           <w14:ligatures w14:val="none"/>
         </w:rPr>
       </w:pPr>
+      <w:r>
+        <w:rPr>
+          <w:rFonts w:ascii="Arial" w:eastAsia="等线" w:hAnsi="Arial" w:cs="Arial"/>
+          <w:b/>
+          <w:bCs/>
+          <w:kern w:val="0"/>
+          <w:sz w:val="40"/>
+          <w:szCs w:val="40"/>
+          <w:lang w:val="en-GB" w:eastAsia="en-US"/>
+          <w14:ligatures w14:val="none"/>
+        </w:rPr>
+        <w:t>Machine Learning for Developers (CAI2C08)</w:t>
+      </w:r>
     </w:p>
     <w:p>
       <w:pPr>
         <w:spacing w:after="0" w:line="240" w:lineRule="auto"/>
         <w:jc w:val="center"/>
         <w:rPr>
-          <w:rFonts w:ascii="Arial" w:eastAsia="DengXian" w:hAnsi="Arial" w:cs="Arial"/>
+          <w:rFonts w:ascii="Arial" w:eastAsia="等线" w:hAnsi="Arial" w:cs="Arial"/>
           <w:b/>
           <w:bCs/>
           <w:kern w:val="0"/>
@@ -202,7 +218,7 @@
       </w:pPr>
       <w:r>
         <w:rPr>
-          <w:rFonts w:ascii="Arial" w:eastAsia="DengXian" w:hAnsi="Arial" w:cs="Arial"/>
+          <w:rFonts w:ascii="Arial" w:eastAsia="等线" w:hAnsi="Arial" w:cs="Arial"/>
           <w:b/>
           <w:bCs/>
           <w:kern w:val="0"/>
@@ -211,79 +227,11 @@
           <w:lang w:val="en-GB" w:eastAsia="en-US"/>
           <w14:ligatures w14:val="none"/>
         </w:rPr>
-        <w:t>Machine Learning for Developers</w:t>
-      </w:r>
-      <w:r>
-        <w:rPr>
-          <w:rFonts w:ascii="Arial" w:eastAsia="DengXian" w:hAnsi="Arial" w:cs="Arial"/>
-          <w:b/>
-          <w:bCs/>
-          <w:kern w:val="0"/>
-          <w:sz w:val="40"/>
-          <w:szCs w:val="40"/>
-          <w:lang w:val="en-GB" w:eastAsia="en-US"/>
-          <w14:ligatures w14:val="none"/>
-        </w:rPr>
-        <w:t xml:space="preserve"> (CAI2C0</w:t>
-      </w:r>
-      <w:r>
-        <w:rPr>
-          <w:rFonts w:ascii="Arial" w:eastAsia="DengXian" w:hAnsi="Arial" w:cs="Arial"/>
-          <w:b/>
-          <w:bCs/>
-          <w:kern w:val="0"/>
-          <w:sz w:val="40"/>
-          <w:szCs w:val="40"/>
-          <w:lang w:val="en-GB" w:eastAsia="en-US"/>
-          <w14:ligatures w14:val="none"/>
-        </w:rPr>
-        <w:t>8</w:t>
-      </w:r>
-      <w:r>
-        <w:rPr>
-          <w:rFonts w:ascii="Arial" w:eastAsia="DengXian" w:hAnsi="Arial" w:cs="Arial"/>
-          <w:b/>
-          <w:bCs/>
-          <w:kern w:val="0"/>
-          <w:sz w:val="40"/>
-          <w:szCs w:val="40"/>
-          <w:lang w:val="en-GB" w:eastAsia="en-US"/>
-          <w14:ligatures w14:val="none"/>
-        </w:rPr>
-        <w:t>)</w:t>
-      </w:r>
-    </w:p>
-    <w:p>
-      <w:pPr>
-        <w:spacing w:after="0" w:line="240" w:lineRule="auto"/>
-        <w:jc w:val="center"/>
-        <w:rPr>
-          <w:rFonts w:ascii="Arial" w:eastAsia="DengXian" w:hAnsi="Arial" w:cs="Arial"/>
-          <w:b/>
-          <w:bCs/>
-          <w:kern w:val="0"/>
-          <w:sz w:val="40"/>
-          <w:szCs w:val="40"/>
-          <w:lang w:val="en-GB" w:eastAsia="en-US"/>
-          <w14:ligatures w14:val="none"/>
-        </w:rPr>
-      </w:pPr>
-      <w:r>
-        <w:rPr>
-          <w:rFonts w:ascii="Arial" w:eastAsia="DengXian" w:hAnsi="Arial" w:cs="Arial"/>
-          <w:b/>
-          <w:bCs/>
-          <w:kern w:val="0"/>
-          <w:sz w:val="40"/>
-          <w:szCs w:val="40"/>
-          <w:lang w:val="en-GB" w:eastAsia="en-US"/>
-          <w14:ligatures w14:val="none"/>
-        </w:rPr>
         <w:t>AY202</w:t>
       </w:r>
       <w:r>
         <w:rPr>
-          <w:rFonts w:ascii="Arial" w:eastAsia="DengXian" w:hAnsi="Arial" w:cs="Arial"/>
+          <w:rFonts w:ascii="Arial" w:eastAsia="等线" w:hAnsi="Arial" w:cs="Arial"/>
           <w:b/>
           <w:bCs/>
           <w:kern w:val="0"/>
@@ -296,7 +244,7 @@
       </w:r>
       <w:r>
         <w:rPr>
-          <w:rFonts w:ascii="Arial" w:eastAsia="DengXian" w:hAnsi="Arial" w:cs="Arial"/>
+          <w:rFonts w:ascii="Arial" w:eastAsia="等线" w:hAnsi="Arial" w:cs="Arial"/>
           <w:b/>
           <w:bCs/>
           <w:kern w:val="0"/>
@@ -309,7 +257,7 @@
       </w:r>
       <w:r>
         <w:rPr>
-          <w:rFonts w:ascii="Arial" w:eastAsia="DengXian" w:hAnsi="Arial" w:cs="Arial"/>
+          <w:rFonts w:ascii="Arial" w:eastAsia="等线" w:hAnsi="Arial" w:cs="Arial"/>
           <w:b/>
           <w:bCs/>
           <w:kern w:val="0"/>
@@ -322,7 +270,7 @@
       </w:r>
       <w:r>
         <w:rPr>
-          <w:rFonts w:ascii="Arial" w:eastAsia="DengXian" w:hAnsi="Arial" w:cs="Arial"/>
+          <w:rFonts w:ascii="Arial" w:eastAsia="等线" w:hAnsi="Arial" w:cs="Arial"/>
           <w:b/>
           <w:bCs/>
           <w:kern w:val="0"/>
@@ -339,7 +287,7 @@
         <w:spacing w:after="0" w:line="240" w:lineRule="auto"/>
         <w:jc w:val="center"/>
         <w:rPr>
-          <w:rFonts w:ascii="Arial" w:eastAsia="DengXian" w:hAnsi="Arial" w:cs="Arial"/>
+          <w:rFonts w:ascii="Arial" w:eastAsia="等线" w:hAnsi="Arial" w:cs="Arial"/>
           <w:b/>
           <w:bCs/>
           <w:kern w:val="0"/>
@@ -355,7 +303,7 @@
         <w:spacing w:after="0" w:line="240" w:lineRule="auto"/>
         <w:jc w:val="center"/>
         <w:rPr>
-          <w:rFonts w:ascii="Arial" w:eastAsia="DengXian" w:hAnsi="Arial" w:cs="Arial"/>
+          <w:rFonts w:ascii="Arial" w:eastAsia="等线" w:hAnsi="Arial" w:cs="Arial"/>
           <w:b/>
           <w:bCs/>
           <w:color w:val="C00000"/>
@@ -368,7 +316,7 @@
       </w:pPr>
       <w:r>
         <w:rPr>
-          <w:rFonts w:ascii="Arial" w:eastAsia="DengXian" w:hAnsi="Arial" w:cs="Arial"/>
+          <w:rFonts w:ascii="Arial" w:eastAsia="等线" w:hAnsi="Arial" w:cs="Arial"/>
           <w:b/>
           <w:bCs/>
           <w:color w:val="C00000"/>
@@ -378,42 +326,14 @@
           <w:lang w:val="en-GB" w:eastAsia="en-US"/>
           <w14:ligatures w14:val="none"/>
         </w:rPr>
-        <w:t>Program</w:t>
-      </w:r>
-      <w:r>
-        <w:rPr>
-          <w:rFonts w:ascii="Arial" w:eastAsia="DengXian" w:hAnsi="Arial" w:cs="Arial"/>
-          <w:b/>
-          <w:bCs/>
-          <w:color w:val="C00000"/>
-          <w:kern w:val="0"/>
-          <w:sz w:val="40"/>
-          <w:szCs w:val="20"/>
-          <w:lang w:val="en-GB" w:eastAsia="en-US"/>
-          <w14:ligatures w14:val="none"/>
-        </w:rPr>
-        <w:t xml:space="preserve"> </w:t>
-      </w:r>
-      <w:r>
-        <w:rPr>
-          <w:rFonts w:ascii="Arial" w:eastAsia="DengXian" w:hAnsi="Arial" w:cs="Arial"/>
-          <w:b/>
-          <w:bCs/>
-          <w:color w:val="C00000"/>
-          <w:kern w:val="0"/>
-          <w:sz w:val="40"/>
-          <w:szCs w:val="20"/>
-          <w:lang w:val="en-GB" w:eastAsia="en-US"/>
-          <w14:ligatures w14:val="none"/>
-        </w:rPr>
-        <w:t>Codes</w:t>
+        <w:t>Program Codes</w:t>
       </w:r>
     </w:p>
     <w:p>
       <w:pPr>
         <w:spacing w:after="0" w:line="240" w:lineRule="auto"/>
         <w:rPr>
-          <w:rFonts w:ascii="Arial" w:eastAsia="DengXian" w:hAnsi="Arial" w:cs="Arial"/>
+          <w:rFonts w:ascii="Arial" w:eastAsia="等线" w:hAnsi="Arial" w:cs="Arial"/>
           <w:b/>
           <w:bCs/>
           <w:kern w:val="0"/>
@@ -428,7 +348,7 @@
         <w:spacing w:after="0" w:line="240" w:lineRule="auto"/>
         <w:jc w:val="both"/>
         <w:rPr>
-          <w:rFonts w:ascii="Arial" w:eastAsia="DengXian" w:hAnsi="Arial" w:cs="Arial"/>
+          <w:rFonts w:ascii="Arial" w:eastAsia="等线" w:hAnsi="Arial" w:cs="Arial"/>
           <w:kern w:val="0"/>
           <w:szCs w:val="20"/>
           <w:lang w:eastAsia="en-US"/>
@@ -440,160 +360,294 @@
       <w:pPr>
         <w:spacing w:after="0" w:line="240" w:lineRule="auto"/>
         <w:rPr>
-          <w:rFonts w:ascii="Arial" w:eastAsia="DengXian" w:hAnsi="Arial" w:cs="Arial"/>
+          <w:rFonts w:ascii="Arial" w:eastAsia="等线" w:hAnsi="Arial" w:cs="Arial"/>
+          <w:kern w:val="0"/>
+          <w:sz w:val="28"/>
+          <w:szCs w:val="28"/>
+          <w:lang w:val="en-US"/>
+          <w14:ligatures w14:val="none"/>
+        </w:rPr>
+      </w:pPr>
+      <w:r>
+        <w:rPr>
+          <w:rFonts w:ascii="Arial" w:eastAsia="等线" w:hAnsi="Arial" w:cs="Arial"/>
           <w:kern w:val="0"/>
           <w:sz w:val="28"/>
           <w:szCs w:val="28"/>
           <w:lang w:eastAsia="en-US"/>
           <w14:ligatures w14:val="none"/>
         </w:rPr>
-      </w:pPr>
-      <w:r>
-        <w:rPr>
-          <w:rFonts w:ascii="Arial" w:eastAsia="DengXian" w:hAnsi="Arial" w:cs="Arial"/>
+        <w:t>Student Name (Matric Number)</w:t>
+      </w:r>
+      <w:r>
+        <w:rPr>
+          <w:rFonts w:ascii="Arial" w:eastAsia="等线" w:hAnsi="Arial" w:cs="Arial"/>
           <w:kern w:val="0"/>
           <w:sz w:val="28"/>
           <w:szCs w:val="28"/>
           <w:lang w:eastAsia="en-US"/>
           <w14:ligatures w14:val="none"/>
         </w:rPr>
-        <w:t>Student Name (Matric Number)</w:t>
-      </w:r>
-      <w:r>
-        <w:rPr>
-          <w:rFonts w:ascii="Arial" w:eastAsia="DengXian" w:hAnsi="Arial" w:cs="Arial"/>
+        <w:tab/>
+        <w:t>:</w:t>
+      </w:r>
+      <w:r>
+        <w:rPr>
+          <w:rFonts w:ascii="Arial" w:eastAsia="等线" w:hAnsi="Arial" w:cs="Arial" w:hint="eastAsia"/>
+          <w:kern w:val="0"/>
+          <w:sz w:val="28"/>
+          <w:szCs w:val="28"/>
+          <w:lang w:val="en-US"/>
+          <w14:ligatures w14:val="none"/>
+        </w:rPr>
+        <w:t xml:space="preserve"> Geng Yue</w:t>
+      </w:r>
+    </w:p>
+    <w:p>
+      <w:pPr>
+        <w:spacing w:after="0" w:line="240" w:lineRule="auto"/>
+        <w:rPr>
+          <w:rFonts w:ascii="Arial" w:eastAsia="等线" w:hAnsi="Arial" w:cs="Arial"/>
           <w:kern w:val="0"/>
           <w:sz w:val="28"/>
           <w:szCs w:val="28"/>
           <w:lang w:eastAsia="en-US"/>
           <w14:ligatures w14:val="none"/>
         </w:rPr>
-        <w:tab/>
-        <w:t>:</w:t>
-      </w:r>
+      </w:pPr>
     </w:p>
     <w:p>
       <w:pPr>
         <w:spacing w:after="0" w:line="240" w:lineRule="auto"/>
         <w:rPr>
-          <w:rFonts w:ascii="Arial" w:eastAsia="DengXian" w:hAnsi="Arial" w:cs="Arial"/>
+          <w:rFonts w:ascii="Arial" w:eastAsia="等线" w:hAnsi="Arial" w:cs="Arial"/>
+          <w:kern w:val="0"/>
+          <w:sz w:val="28"/>
+          <w:szCs w:val="28"/>
+          <w:lang w:val="en-US"/>
+          <w14:ligatures w14:val="none"/>
+        </w:rPr>
+      </w:pPr>
+      <w:r>
+        <w:rPr>
+          <w:rFonts w:ascii="Arial" w:eastAsia="等线" w:hAnsi="Arial" w:cs="Arial"/>
           <w:kern w:val="0"/>
           <w:sz w:val="28"/>
           <w:szCs w:val="28"/>
           <w:lang w:eastAsia="en-US"/>
           <w14:ligatures w14:val="none"/>
         </w:rPr>
-      </w:pPr>
-    </w:p>
-    <w:p>
-      <w:pPr>
-        <w:spacing w:after="0" w:line="240" w:lineRule="auto"/>
-        <w:rPr>
-          <w:rFonts w:ascii="Arial" w:eastAsia="DengXian" w:hAnsi="Arial" w:cs="Arial"/>
+        <w:t>Tutorial Group</w:t>
+      </w:r>
+      <w:r>
+        <w:rPr>
+          <w:rFonts w:ascii="Arial" w:eastAsia="等线" w:hAnsi="Arial" w:cs="Arial"/>
+          <w:kern w:val="0"/>
+          <w:sz w:val="28"/>
+          <w:szCs w:val="28"/>
+          <w:lang w:val="en-GB" w:eastAsia="en-US"/>
+          <w14:ligatures w14:val="none"/>
+        </w:rPr>
+        <w:tab/>
+      </w:r>
+      <w:r>
+        <w:rPr>
+          <w:rFonts w:ascii="Arial" w:eastAsia="等线" w:hAnsi="Arial" w:cs="Arial"/>
+          <w:kern w:val="0"/>
+          <w:sz w:val="28"/>
+          <w:szCs w:val="28"/>
+          <w:lang w:val="en-GB" w:eastAsia="en-US"/>
+          <w14:ligatures w14:val="none"/>
+        </w:rPr>
+        <w:tab/>
+      </w:r>
+      <w:r>
+        <w:rPr>
+          <w:rFonts w:ascii="Arial" w:eastAsia="等线" w:hAnsi="Arial" w:cs="Arial"/>
+          <w:kern w:val="0"/>
+          <w:sz w:val="28"/>
+          <w:szCs w:val="28"/>
+          <w:lang w:val="en-GB" w:eastAsia="en-US"/>
+          <w14:ligatures w14:val="none"/>
+        </w:rPr>
+        <w:tab/>
+      </w:r>
+      <w:r>
+        <w:rPr>
+          <w:rFonts w:ascii="Arial" w:eastAsia="等线" w:hAnsi="Arial" w:cs="Arial"/>
+          <w:kern w:val="0"/>
+          <w:sz w:val="28"/>
+          <w:szCs w:val="28"/>
+          <w:lang w:val="en-GB" w:eastAsia="en-US"/>
+          <w14:ligatures w14:val="none"/>
+        </w:rPr>
+        <w:tab/>
+      </w:r>
+      <w:r>
+        <w:rPr>
+          <w:rFonts w:ascii="Arial" w:eastAsia="等线" w:hAnsi="Arial" w:cs="Arial"/>
           <w:kern w:val="0"/>
           <w:sz w:val="28"/>
           <w:szCs w:val="28"/>
           <w:lang w:eastAsia="en-US"/>
           <w14:ligatures w14:val="none"/>
         </w:rPr>
-      </w:pPr>
-      <w:r>
-        <w:rPr>
-          <w:rFonts w:ascii="Arial" w:eastAsia="DengXian" w:hAnsi="Arial" w:cs="Arial"/>
+        <w:t xml:space="preserve">:  </w:t>
+      </w:r>
+      <w:r>
+        <w:rPr>
+          <w:rFonts w:ascii="Arial" w:eastAsia="等线" w:hAnsi="Arial" w:cs="Arial" w:hint="eastAsia"/>
+          <w:kern w:val="0"/>
+          <w:sz w:val="28"/>
+          <w:szCs w:val="28"/>
+          <w:lang w:val="en-US"/>
+          <w14:ligatures w14:val="none"/>
+        </w:rPr>
+        <w:t>P02</w:t>
+      </w:r>
+    </w:p>
+    <w:p>
+      <w:pPr>
+        <w:spacing w:after="0" w:line="240" w:lineRule="auto"/>
+        <w:rPr>
+          <w:rFonts w:ascii="Arial" w:eastAsia="Arial" w:hAnsi="Arial" w:cs="Arial"/>
           <w:kern w:val="0"/>
           <w:sz w:val="28"/>
           <w:szCs w:val="28"/>
           <w:lang w:eastAsia="en-US"/>
           <w14:ligatures w14:val="none"/>
         </w:rPr>
-        <w:t>Tutorial Group</w:t>
-      </w:r>
-      <w:r>
-        <w:rPr>
-          <w:rFonts w:ascii="Arial" w:eastAsia="DengXian" w:hAnsi="Arial" w:cs="Arial"/>
-          <w:kern w:val="0"/>
-          <w:sz w:val="28"/>
-          <w:szCs w:val="28"/>
-          <w:lang w:val="en-GB" w:eastAsia="en-US"/>
-          <w14:ligatures w14:val="none"/>
-        </w:rPr>
-        <w:tab/>
-      </w:r>
-      <w:r>
-        <w:rPr>
-          <w:rFonts w:ascii="Arial" w:eastAsia="DengXian" w:hAnsi="Arial" w:cs="Arial"/>
-          <w:kern w:val="0"/>
-          <w:sz w:val="28"/>
-          <w:szCs w:val="28"/>
-          <w:lang w:val="en-GB" w:eastAsia="en-US"/>
-          <w14:ligatures w14:val="none"/>
-        </w:rPr>
-        <w:tab/>
-      </w:r>
-      <w:r>
-        <w:rPr>
-          <w:rFonts w:ascii="Arial" w:eastAsia="DengXian" w:hAnsi="Arial" w:cs="Arial"/>
-          <w:kern w:val="0"/>
-          <w:sz w:val="28"/>
-          <w:szCs w:val="28"/>
-          <w:lang w:val="en-GB" w:eastAsia="en-US"/>
-          <w14:ligatures w14:val="none"/>
-        </w:rPr>
-        <w:tab/>
-      </w:r>
-      <w:r>
-        <w:rPr>
-          <w:rFonts w:ascii="Arial" w:eastAsia="DengXian" w:hAnsi="Arial" w:cs="Arial"/>
-          <w:kern w:val="0"/>
-          <w:sz w:val="28"/>
-          <w:szCs w:val="28"/>
-          <w:lang w:val="en-GB" w:eastAsia="en-US"/>
-          <w14:ligatures w14:val="none"/>
-        </w:rPr>
-        <w:tab/>
-      </w:r>
-      <w:r>
-        <w:rPr>
-          <w:rFonts w:ascii="Arial" w:eastAsia="DengXian" w:hAnsi="Arial" w:cs="Arial"/>
+      </w:pPr>
+      <w:r>
+        <w:rPr>
+          <w:rFonts w:ascii="Arial" w:eastAsia="Segoe UI" w:hAnsi="Arial" w:cs="Arial"/>
+          <w:color w:val="FFFFFF"/>
           <w:kern w:val="0"/>
           <w:sz w:val="28"/>
           <w:szCs w:val="28"/>
           <w:lang w:eastAsia="en-US"/>
           <w14:ligatures w14:val="none"/>
         </w:rPr>
-        <w:t xml:space="preserve">:  </w:t>
+        <w:t>Jenny LING (TP)</w:t>
       </w:r>
     </w:p>
     <w:p>
       <w:pPr>
         <w:spacing w:after="0" w:line="240" w:lineRule="auto"/>
         <w:rPr>
-          <w:rFonts w:ascii="Arial" w:eastAsia="Arial" w:hAnsi="Arial" w:cs="Arial"/>
+          <w:rFonts w:ascii="Arial" w:eastAsia="等线" w:hAnsi="Arial" w:cs="Arial"/>
+          <w:kern w:val="0"/>
+          <w:sz w:val="28"/>
+          <w:szCs w:val="28"/>
+          <w:lang w:val="en-US"/>
+          <w14:ligatures w14:val="none"/>
+        </w:rPr>
+      </w:pPr>
+      <w:r>
+        <w:rPr>
+          <w:rFonts w:ascii="Arial" w:eastAsia="等线" w:hAnsi="Arial" w:cs="Arial"/>
           <w:kern w:val="0"/>
           <w:sz w:val="28"/>
           <w:szCs w:val="28"/>
           <w:lang w:eastAsia="en-US"/>
           <w14:ligatures w14:val="none"/>
         </w:rPr>
-      </w:pPr>
-      <w:r>
-        <w:rPr>
-          <w:rFonts w:ascii="Arial" w:eastAsia="Segoe UI" w:hAnsi="Arial" w:cs="Arial"/>
-          <w:color w:val="FFFFFF"/>
+        <w:t>Tutor</w:t>
+      </w:r>
+      <w:r>
+        <w:rPr>
+          <w:rFonts w:ascii="Arial" w:eastAsia="等线" w:hAnsi="Arial" w:cs="Arial"/>
+          <w:kern w:val="0"/>
+          <w:sz w:val="28"/>
+          <w:szCs w:val="28"/>
+          <w:lang w:val="en-GB" w:eastAsia="en-US"/>
+          <w14:ligatures w14:val="none"/>
+        </w:rPr>
+        <w:tab/>
+      </w:r>
+      <w:r>
+        <w:rPr>
+          <w:rFonts w:ascii="Arial" w:eastAsia="等线" w:hAnsi="Arial" w:cs="Arial"/>
+          <w:kern w:val="0"/>
+          <w:sz w:val="28"/>
+          <w:szCs w:val="28"/>
+          <w:lang w:val="en-GB" w:eastAsia="en-US"/>
+          <w14:ligatures w14:val="none"/>
+        </w:rPr>
+        <w:tab/>
+      </w:r>
+      <w:r>
+        <w:rPr>
+          <w:rFonts w:ascii="Arial" w:eastAsia="等线" w:hAnsi="Arial" w:cs="Arial"/>
+          <w:kern w:val="0"/>
+          <w:sz w:val="28"/>
+          <w:szCs w:val="28"/>
+          <w:lang w:val="en-GB" w:eastAsia="en-US"/>
+          <w14:ligatures w14:val="none"/>
+        </w:rPr>
+        <w:tab/>
+      </w:r>
+      <w:r>
+        <w:rPr>
+          <w:rFonts w:ascii="Arial" w:eastAsia="等线" w:hAnsi="Arial" w:cs="Arial"/>
+          <w:kern w:val="0"/>
+          <w:sz w:val="28"/>
+          <w:szCs w:val="28"/>
+          <w:lang w:val="en-GB" w:eastAsia="en-US"/>
+          <w14:ligatures w14:val="none"/>
+        </w:rPr>
+        <w:tab/>
+      </w:r>
+      <w:r>
+        <w:rPr>
+          <w:rFonts w:ascii="Arial" w:eastAsia="等线" w:hAnsi="Arial" w:cs="Arial"/>
+          <w:kern w:val="0"/>
+          <w:sz w:val="28"/>
+          <w:szCs w:val="28"/>
+          <w:lang w:val="en-GB" w:eastAsia="en-US"/>
+          <w14:ligatures w14:val="none"/>
+        </w:rPr>
+        <w:tab/>
+      </w:r>
+      <w:r>
+        <w:rPr>
+          <w:rFonts w:ascii="Arial" w:eastAsia="等线" w:hAnsi="Arial" w:cs="Arial"/>
+          <w:kern w:val="0"/>
+          <w:sz w:val="28"/>
+          <w:szCs w:val="28"/>
+          <w:lang w:val="en-GB" w:eastAsia="en-US"/>
+          <w14:ligatures w14:val="none"/>
+        </w:rPr>
+        <w:tab/>
+      </w:r>
+      <w:r>
+        <w:rPr>
+          <w:rFonts w:ascii="Arial" w:eastAsia="等线" w:hAnsi="Arial" w:cs="Arial"/>
           <w:kern w:val="0"/>
           <w:sz w:val="28"/>
           <w:szCs w:val="28"/>
           <w:lang w:eastAsia="en-US"/>
           <w14:ligatures w14:val="none"/>
         </w:rPr>
-        <w:t>Jenny LING (TP)</w:t>
+        <w:t xml:space="preserve">: </w:t>
+      </w:r>
+      <w:r>
+        <w:rPr>
+          <w:rFonts w:ascii="Arial" w:eastAsia="等线" w:hAnsi="Arial" w:cs="Arial" w:hint="eastAsia"/>
+          <w:kern w:val="0"/>
+          <w:sz w:val="28"/>
+          <w:szCs w:val="28"/>
+          <w:lang w:val="en-US"/>
+          <w14:ligatures w14:val="none"/>
+        </w:rPr>
+        <w:t>Ester Goh</w:t>
       </w:r>
     </w:p>
     <w:p>
       <w:pPr>
         <w:spacing w:after="0" w:line="240" w:lineRule="auto"/>
         <w:rPr>
-          <w:rFonts w:ascii="Arial" w:eastAsia="DengXian" w:hAnsi="Arial" w:cs="Arial"/>
+          <w:rFonts w:ascii="Arial" w:eastAsia="等线" w:hAnsi="Arial" w:cs="Arial"/>
           <w:kern w:val="0"/>
           <w:sz w:val="28"/>
           <w:szCs w:val="28"/>
@@ -601,20 +655,33 @@
           <w14:ligatures w14:val="none"/>
         </w:rPr>
       </w:pPr>
-      <w:r>
-        <w:rPr>
-          <w:rFonts w:ascii="Arial" w:eastAsia="DengXian" w:hAnsi="Arial" w:cs="Arial"/>
+    </w:p>
+    <w:p>
+      <w:pPr>
+        <w:spacing w:after="0" w:line="240" w:lineRule="auto"/>
+        <w:rPr>
+          <w:rFonts w:ascii="Arial" w:eastAsia="等线" w:hAnsi="Arial" w:cs="Arial"/>
+          <w:kern w:val="0"/>
+          <w:sz w:val="28"/>
+          <w:szCs w:val="28"/>
+          <w:lang w:val="en-US"/>
+          <w14:ligatures w14:val="none"/>
+        </w:rPr>
+      </w:pPr>
+      <w:r>
+        <w:rPr>
+          <w:rFonts w:ascii="Arial" w:eastAsia="等线" w:hAnsi="Arial" w:cs="Arial"/>
           <w:kern w:val="0"/>
           <w:sz w:val="28"/>
           <w:szCs w:val="28"/>
           <w:lang w:eastAsia="en-US"/>
           <w14:ligatures w14:val="none"/>
         </w:rPr>
-        <w:t>Tutor</w:t>
-      </w:r>
-      <w:r>
-        <w:rPr>
-          <w:rFonts w:ascii="Arial" w:eastAsia="DengXian" w:hAnsi="Arial" w:cs="Arial"/>
+        <w:t>Submission Date</w:t>
+      </w:r>
+      <w:r>
+        <w:rPr>
+          <w:rFonts w:ascii="Arial" w:eastAsia="等线" w:hAnsi="Arial" w:cs="Arial"/>
           <w:kern w:val="0"/>
           <w:sz w:val="28"/>
           <w:szCs w:val="28"/>
@@ -625,7 +692,7 @@
       </w:r>
       <w:r>
         <w:rPr>
-          <w:rFonts w:ascii="Arial" w:eastAsia="DengXian" w:hAnsi="Arial" w:cs="Arial"/>
+          <w:rFonts w:ascii="Arial" w:eastAsia="等线" w:hAnsi="Arial" w:cs="Arial"/>
           <w:kern w:val="0"/>
           <w:sz w:val="28"/>
           <w:szCs w:val="28"/>
@@ -636,7 +703,7 @@
       </w:r>
       <w:r>
         <w:rPr>
-          <w:rFonts w:ascii="Arial" w:eastAsia="DengXian" w:hAnsi="Arial" w:cs="Arial"/>
+          <w:rFonts w:ascii="Arial" w:eastAsia="等线" w:hAnsi="Arial" w:cs="Arial"/>
           <w:kern w:val="0"/>
           <w:sz w:val="28"/>
           <w:szCs w:val="28"/>
@@ -647,7 +714,7 @@
       </w:r>
       <w:r>
         <w:rPr>
-          <w:rFonts w:ascii="Arial" w:eastAsia="DengXian" w:hAnsi="Arial" w:cs="Arial"/>
+          <w:rFonts w:ascii="Arial" w:eastAsia="等线" w:hAnsi="Arial" w:cs="Arial"/>
           <w:kern w:val="0"/>
           <w:sz w:val="28"/>
           <w:szCs w:val="28"/>
@@ -658,29 +725,7 @@
       </w:r>
       <w:r>
         <w:rPr>
-          <w:rFonts w:ascii="Arial" w:eastAsia="DengXian" w:hAnsi="Arial" w:cs="Arial"/>
-          <w:kern w:val="0"/>
-          <w:sz w:val="28"/>
-          <w:szCs w:val="28"/>
-          <w:lang w:val="en-GB" w:eastAsia="en-US"/>
-          <w14:ligatures w14:val="none"/>
-        </w:rPr>
-        <w:tab/>
-      </w:r>
-      <w:r>
-        <w:rPr>
-          <w:rFonts w:ascii="Arial" w:eastAsia="DengXian" w:hAnsi="Arial" w:cs="Arial"/>
-          <w:kern w:val="0"/>
-          <w:sz w:val="28"/>
-          <w:szCs w:val="28"/>
-          <w:lang w:val="en-GB" w:eastAsia="en-US"/>
-          <w14:ligatures w14:val="none"/>
-        </w:rPr>
-        <w:tab/>
-      </w:r>
-      <w:r>
-        <w:rPr>
-          <w:rFonts w:ascii="Arial" w:eastAsia="DengXian" w:hAnsi="Arial" w:cs="Arial"/>
+          <w:rFonts w:ascii="Arial" w:eastAsia="等线" w:hAnsi="Arial" w:cs="Arial"/>
           <w:kern w:val="0"/>
           <w:sz w:val="28"/>
           <w:szCs w:val="28"/>
@@ -689,109 +734,28 @@
         </w:rPr>
         <w:t xml:space="preserve">: </w:t>
       </w:r>
-    </w:p>
-    <w:p>
-      <w:pPr>
-        <w:spacing w:after="0" w:line="240" w:lineRule="auto"/>
-        <w:rPr>
-          <w:rFonts w:ascii="Arial" w:eastAsia="DengXian" w:hAnsi="Arial" w:cs="Arial"/>
+      <w:r>
+        <w:rPr>
+          <w:rFonts w:ascii="Arial" w:eastAsia="等线" w:hAnsi="Arial" w:cs="Arial" w:hint="eastAsia"/>
           <w:kern w:val="0"/>
           <w:sz w:val="28"/>
           <w:szCs w:val="28"/>
-          <w:lang w:eastAsia="en-US"/>
-          <w14:ligatures w14:val="none"/>
-        </w:rPr>
-      </w:pPr>
+          <w:lang w:val="en-US"/>
+          <w14:ligatures w14:val="none"/>
+        </w:rPr>
+        <w:t>12/02/2026</w:t>
+      </w:r>
     </w:p>
     <w:p>
       <w:pPr>
         <w:spacing w:after="0" w:line="240" w:lineRule="auto"/>
-        <w:rPr>
-          <w:rFonts w:ascii="Arial" w:eastAsia="DengXian" w:hAnsi="Arial" w:cs="Arial"/>
+        <w:jc w:val="both"/>
+        <w:rPr>
+          <w:rFonts w:ascii="Arial" w:eastAsia="等线" w:hAnsi="Arial" w:cs="Arial"/>
           <w:kern w:val="0"/>
           <w:sz w:val="28"/>
           <w:szCs w:val="28"/>
-          <w:lang w:eastAsia="en-US"/>
-          <w14:ligatures w14:val="none"/>
-        </w:rPr>
-      </w:pPr>
-      <w:r>
-        <w:rPr>
-          <w:rFonts w:ascii="Arial" w:eastAsia="DengXian" w:hAnsi="Arial" w:cs="Arial"/>
-          <w:kern w:val="0"/>
-          <w:sz w:val="28"/>
-          <w:szCs w:val="28"/>
-          <w:lang w:eastAsia="en-US"/>
-          <w14:ligatures w14:val="none"/>
-        </w:rPr>
-        <w:t>Submission Date</w:t>
-      </w:r>
-      <w:r>
-        <w:rPr>
-          <w:rFonts w:ascii="Arial" w:eastAsia="DengXian" w:hAnsi="Arial" w:cs="Arial"/>
-          <w:kern w:val="0"/>
-          <w:sz w:val="28"/>
-          <w:szCs w:val="28"/>
-          <w:lang w:val="en-GB" w:eastAsia="en-US"/>
-          <w14:ligatures w14:val="none"/>
-        </w:rPr>
-        <w:tab/>
-      </w:r>
-      <w:r>
-        <w:rPr>
-          <w:rFonts w:ascii="Arial" w:eastAsia="DengXian" w:hAnsi="Arial" w:cs="Arial"/>
-          <w:kern w:val="0"/>
-          <w:sz w:val="28"/>
-          <w:szCs w:val="28"/>
-          <w:lang w:val="en-GB" w:eastAsia="en-US"/>
-          <w14:ligatures w14:val="none"/>
-        </w:rPr>
-        <w:tab/>
-      </w:r>
-      <w:r>
-        <w:rPr>
-          <w:rFonts w:ascii="Arial" w:eastAsia="DengXian" w:hAnsi="Arial" w:cs="Arial"/>
-          <w:kern w:val="0"/>
-          <w:sz w:val="28"/>
-          <w:szCs w:val="28"/>
-          <w:lang w:val="en-GB" w:eastAsia="en-US"/>
-          <w14:ligatures w14:val="none"/>
-        </w:rPr>
-        <w:tab/>
-      </w:r>
-      <w:r>
-        <w:rPr>
-          <w:rFonts w:ascii="Arial" w:eastAsia="DengXian" w:hAnsi="Arial" w:cs="Arial"/>
-          <w:kern w:val="0"/>
-          <w:sz w:val="28"/>
-          <w:szCs w:val="28"/>
-          <w:lang w:val="en-GB" w:eastAsia="en-US"/>
-          <w14:ligatures w14:val="none"/>
-        </w:rPr>
-        <w:tab/>
-      </w:r>
-      <w:r>
-        <w:rPr>
-          <w:rFonts w:ascii="Arial" w:eastAsia="DengXian" w:hAnsi="Arial" w:cs="Arial"/>
-          <w:kern w:val="0"/>
-          <w:sz w:val="28"/>
-          <w:szCs w:val="28"/>
-          <w:lang w:eastAsia="en-US"/>
-          <w14:ligatures w14:val="none"/>
-        </w:rPr>
-        <w:t xml:space="preserve">: </w:t>
-      </w:r>
-    </w:p>
-    <w:p>
-      <w:pPr>
-        <w:spacing w:after="0" w:line="240" w:lineRule="auto"/>
-        <w:jc w:val="both"/>
-        <w:rPr>
-          <w:rFonts w:ascii="Arial" w:eastAsia="DengXian" w:hAnsi="Arial" w:cs="Arial"/>
-          <w:kern w:val="0"/>
-          <w:sz w:val="28"/>
-          <w:szCs w:val="28"/>
-          <w:lang w:eastAsia="en-US"/>
+          <w:lang w:val="en-US"/>
           <w14:ligatures w14:val="none"/>
         </w:rPr>
       </w:pPr>
@@ -801,7 +765,7 @@
         <w:spacing w:after="0" w:line="240" w:lineRule="auto"/>
         <w:jc w:val="center"/>
         <w:rPr>
-          <w:rFonts w:ascii="Arial" w:eastAsia="DengXian" w:hAnsi="Arial" w:cs="Arial"/>
+          <w:rFonts w:ascii="Arial" w:eastAsia="等线" w:hAnsi="Arial" w:cs="Arial"/>
           <w:b/>
           <w:bCs/>
           <w:kern w:val="0"/>
@@ -818,7 +782,7 @@
         <w:jc w:val="center"/>
         <w:outlineLvl w:val="0"/>
         <w:rPr>
-          <w:rFonts w:ascii="Arial" w:eastAsia="DengXian" w:hAnsi="Arial" w:cs="Arial"/>
+          <w:rFonts w:ascii="Arial" w:eastAsia="等线" w:hAnsi="Arial" w:cs="Arial"/>
           <w:b/>
           <w:bCs/>
           <w:color w:val="FF0000"/>
@@ -831,7 +795,7 @@
       </w:pPr>
       <w:r>
         <w:rPr>
-          <w:rFonts w:ascii="Arial" w:eastAsia="DengXian" w:hAnsi="Arial" w:cs="Arial"/>
+          <w:rFonts w:ascii="Arial" w:eastAsia="等线" w:hAnsi="Arial" w:cs="Arial"/>
           <w:b/>
           <w:bCs/>
           <w:color w:val="FF0000"/>
@@ -852,7 +816,7 @@
         <w:spacing w:after="0" w:line="240" w:lineRule="auto"/>
         <w:jc w:val="center"/>
         <w:rPr>
-          <w:rFonts w:ascii="Arial" w:eastAsia="DengXian" w:hAnsi="Arial" w:cs="Arial"/>
+          <w:rFonts w:ascii="Arial" w:eastAsia="等线" w:hAnsi="Arial" w:cs="Arial"/>
           <w:kern w:val="0"/>
           <w:sz w:val="28"/>
           <w:szCs w:val="28"/>
@@ -869,7 +833,7 @@
         <w:spacing w:after="0" w:line="240" w:lineRule="auto"/>
         <w:jc w:val="center"/>
         <w:rPr>
-          <w:rFonts w:ascii="Arial" w:eastAsia="DengXian" w:hAnsi="Arial" w:cs="Arial"/>
+          <w:rFonts w:ascii="Arial" w:eastAsia="等线" w:hAnsi="Arial" w:cs="Arial"/>
           <w:kern w:val="0"/>
           <w:sz w:val="28"/>
           <w:szCs w:val="28"/>
@@ -880,7 +844,7 @@
       <w:bookmarkStart w:id="0" w:name="_Hlk177135724"/>
       <w:r>
         <w:rPr>
-          <w:rFonts w:ascii="Arial" w:eastAsia="DengXian" w:hAnsi="Arial" w:cs="Arial"/>
+          <w:rFonts w:ascii="Arial" w:eastAsia="等线" w:hAnsi="Arial" w:cs="Arial"/>
           <w:kern w:val="0"/>
           <w:sz w:val="28"/>
           <w:szCs w:val="28"/>
@@ -891,7 +855,7 @@
       </w:r>
       <w:r>
         <w:rPr>
-          <w:rFonts w:ascii="Arial" w:eastAsia="DengXian" w:hAnsi="Arial" w:cs="Arial"/>
+          <w:rFonts w:ascii="Arial" w:eastAsia="等线" w:hAnsi="Arial" w:cs="Arial"/>
           <w:kern w:val="0"/>
           <w:sz w:val="28"/>
           <w:szCs w:val="28"/>
@@ -902,7 +866,7 @@
       </w:r>
       <w:r>
         <w:rPr>
-          <w:rFonts w:ascii="Arial" w:eastAsia="DengXian" w:hAnsi="Arial" w:cs="Arial"/>
+          <w:rFonts w:ascii="Arial" w:eastAsia="等线" w:hAnsi="Arial" w:cs="Arial"/>
           <w:kern w:val="0"/>
           <w:sz w:val="28"/>
           <w:szCs w:val="28"/>
@@ -920,7 +884,7 @@
         <w:spacing w:after="0" w:line="240" w:lineRule="auto"/>
         <w:jc w:val="center"/>
         <w:rPr>
-          <w:rFonts w:ascii="Arial" w:eastAsia="DengXian" w:hAnsi="Arial" w:cs="Arial"/>
+          <w:rFonts w:ascii="Arial" w:eastAsia="等线" w:hAnsi="Arial" w:cs="Arial"/>
           <w:kern w:val="0"/>
           <w:sz w:val="28"/>
           <w:szCs w:val="28"/>
@@ -937,7 +901,7 @@
         <w:spacing w:after="0" w:line="240" w:lineRule="auto"/>
         <w:jc w:val="center"/>
         <w:rPr>
-          <w:rFonts w:ascii="Arial" w:eastAsia="DengXian" w:hAnsi="Arial" w:cs="Arial"/>
+          <w:rFonts w:ascii="Arial" w:eastAsia="等线" w:hAnsi="Arial" w:cs="Arial"/>
           <w:kern w:val="0"/>
           <w:sz w:val="28"/>
           <w:szCs w:val="28"/>
@@ -947,7 +911,7 @@
       </w:pPr>
       <w:r>
         <w:rPr>
-          <w:rFonts w:ascii="Arial" w:eastAsia="DengXian" w:hAnsi="Arial" w:cs="Arial"/>
+          <w:rFonts w:ascii="Arial" w:eastAsia="等线" w:hAnsi="Arial" w:cs="Arial"/>
           <w:kern w:val="0"/>
           <w:sz w:val="28"/>
           <w:szCs w:val="28"/>
@@ -965,7 +929,7 @@
         <w:spacing w:after="0" w:line="240" w:lineRule="auto"/>
         <w:jc w:val="center"/>
         <w:rPr>
-          <w:rFonts w:ascii="Arial" w:eastAsia="DengXian" w:hAnsi="Arial" w:cs="Arial"/>
+          <w:rFonts w:ascii="Arial" w:eastAsia="等线" w:hAnsi="Arial" w:cs="Arial"/>
           <w:kern w:val="0"/>
           <w:sz w:val="28"/>
           <w:szCs w:val="28"/>
@@ -982,7 +946,7 @@
         <w:spacing w:after="0" w:line="240" w:lineRule="auto"/>
         <w:jc w:val="center"/>
         <w:rPr>
-          <w:rFonts w:ascii="Arial" w:eastAsia="DengXian" w:hAnsi="Arial" w:cs="Arial"/>
+          <w:rFonts w:ascii="Arial" w:eastAsia="等线" w:hAnsi="Arial" w:cs="Arial"/>
           <w:kern w:val="0"/>
           <w:sz w:val="28"/>
           <w:szCs w:val="28"/>
@@ -992,7 +956,7 @@
       </w:pPr>
       <w:r>
         <w:rPr>
-          <w:rFonts w:ascii="Arial" w:eastAsia="DengXian" w:hAnsi="Arial" w:cs="Arial"/>
+          <w:rFonts w:ascii="Arial" w:eastAsia="等线" w:hAnsi="Arial" w:cs="Arial"/>
           <w:kern w:val="0"/>
           <w:sz w:val="28"/>
           <w:szCs w:val="28"/>
@@ -1010,7 +974,7 @@
         <w:spacing w:after="0" w:line="240" w:lineRule="auto"/>
         <w:jc w:val="center"/>
         <w:rPr>
-          <w:rFonts w:ascii="Arial" w:eastAsia="DengXian" w:hAnsi="Arial" w:cs="Arial"/>
+          <w:rFonts w:ascii="Arial" w:eastAsia="等线" w:hAnsi="Arial" w:cs="Arial"/>
           <w:kern w:val="0"/>
           <w:sz w:val="28"/>
           <w:szCs w:val="28"/>
@@ -1020,7 +984,7 @@
       </w:pPr>
       <w:r>
         <w:rPr>
-          <w:rFonts w:ascii="Arial" w:eastAsia="DengXian" w:hAnsi="Arial" w:cs="Arial"/>
+          <w:rFonts w:ascii="Arial" w:eastAsia="等线" w:hAnsi="Arial" w:cs="Arial"/>
           <w:kern w:val="0"/>
           <w:sz w:val="28"/>
           <w:szCs w:val="28"/>
@@ -1036,7 +1000,7 @@
         <w:spacing w:after="0" w:line="240" w:lineRule="auto"/>
         <w:jc w:val="center"/>
         <w:rPr>
-          <w:rFonts w:ascii="Arial" w:eastAsia="DengXian" w:hAnsi="Arial" w:cs="Arial"/>
+          <w:rFonts w:ascii="Arial" w:eastAsia="等线" w:hAnsi="Arial" w:cs="Arial"/>
           <w:b/>
           <w:bCs/>
           <w:kern w:val="0"/>
@@ -1049,7 +1013,7 @@
       <w:pPr>
         <w:spacing w:after="0" w:line="240" w:lineRule="auto"/>
         <w:rPr>
-          <w:rFonts w:ascii="Arial" w:eastAsia="DengXian" w:hAnsi="Arial" w:cs="Arial"/>
+          <w:rFonts w:ascii="Arial" w:eastAsia="等线" w:hAnsi="Arial" w:cs="Arial"/>
           <w:b/>
           <w:bCs/>
           <w:kern w:val="0"/>
@@ -1064,7 +1028,7 @@
           <w:rFonts w:ascii="Arial" w:hAnsi="Arial" w:cs="Arial"/>
         </w:rPr>
         <w:sectPr>
-          <w:headerReference w:type="default" r:id="rId11"/>
+          <w:headerReference w:type="default" r:id="rId12"/>
           <w:pgSz w:w="11906" w:h="16838"/>
           <w:pgMar w:top="1440" w:right="1440" w:bottom="1440" w:left="1440" w:header="720" w:footer="720" w:gutter="0"/>
           <w:cols w:space="720"/>
@@ -1178,25 +1142,7 @@
                 <w:lang w:val="en-GB" w:eastAsia="en-US"/>
                 <w14:ligatures w14:val="none"/>
               </w:rPr>
-              <w:t>Describe how you have used Generative AI tools such as ChatGPT or Dall</w:t>
-            </w:r>
-            <w:r>
-              <w:rPr>
-                <w:rFonts w:ascii="Arial" w:eastAsia="Times New Roman" w:hAnsi="Arial" w:cs="Arial"/>
-                <w:kern w:val="0"/>
-                <w:lang w:val="en-GB" w:eastAsia="en-US"/>
-                <w14:ligatures w14:val="none"/>
-              </w:rPr>
-              <w:t>-</w:t>
-            </w:r>
-            <w:r>
-              <w:rPr>
-                <w:rFonts w:ascii="Arial" w:eastAsia="Times New Roman" w:hAnsi="Arial" w:cs="Arial"/>
-                <w:kern w:val="0"/>
-                <w:lang w:val="en-GB" w:eastAsia="en-US"/>
-                <w14:ligatures w14:val="none"/>
-              </w:rPr>
-              <w:t xml:space="preserve">E in your assignment. </w:t>
+              <w:t xml:space="preserve">Describe how you have used Generative AI tools such as ChatGPT or Dall-E in your assignment. </w:t>
             </w:r>
           </w:p>
           <w:p>
@@ -1312,7 +1258,7 @@
                 <w:lang w:val="en-GB" w:eastAsia="en-US"/>
                 <w14:ligatures w14:val="none"/>
               </w:rPr>
-              <w:object w:dxaOrig="1488" w:dyaOrig="992" w14:anchorId="37ACD829">
+              <w:object w:dxaOrig="1493" w:dyaOrig="987" w14:anchorId="4828B35C">
                 <v:shapetype id="_x0000_t75" coordsize="21600,21600" o:spt="75" o:preferrelative="t" path="m@4@5l@4@11@9@11@9@5xe" filled="f" stroked="f">
                   <v:stroke joinstyle="miter"/>
                   <v:formulas>
@@ -1332,10 +1278,10 @@
                   <v:path o:extrusionok="f" gradientshapeok="t" o:connecttype="rect"/>
                   <o:lock v:ext="edit" aspectratio="t"/>
                 </v:shapetype>
-                <v:shape id="_x0000_i1025" type="#_x0000_t75" style="width:74.65pt;height:49.35pt" o:ole="">
-                  <v:imagedata r:id="rId12" o:title=""/>
+                <v:shape id="_x0000_i1025" type="#_x0000_t75" style="width:74.5pt;height:49.5pt" o:ole="">
+                  <v:imagedata r:id="rId13" o:title=""/>
                 </v:shape>
-                <o:OLEObject Type="Embed" ProgID="Acrobat.Document.DC" ShapeID="_x0000_i1025" DrawAspect="Icon" ObjectID="_1826877311" r:id="rId13"/>
+                <o:OLEObject Type="Embed" ProgID="Acrobat.Document.DC" ShapeID="_x0000_i1025" DrawAspect="Icon" ObjectID="_1832467279" r:id="rId14"/>
               </w:object>
             </w:r>
           </w:p>
@@ -1410,16 +1356,29 @@
             <w:pPr>
               <w:spacing w:after="0" w:line="240" w:lineRule="auto"/>
               <w:rPr>
-                <w:rFonts w:ascii="Arial" w:eastAsia="Times New Roman" w:hAnsi="Arial" w:cs="Arial"/>
+                <w:rFonts w:ascii="Arial" w:eastAsia="宋体" w:hAnsi="Arial" w:cs="Arial"/>
                 <w:b/>
                 <w:bCs/>
                 <w:kern w:val="0"/>
                 <w:sz w:val="22"/>
                 <w:szCs w:val="22"/>
-                <w:lang w:val="en-GB" w:eastAsia="en-US"/>
+                <w:lang w:val="en-US"/>
                 <w14:ligatures w14:val="none"/>
               </w:rPr>
             </w:pPr>
+            <w:r>
+              <w:rPr>
+                <w:rFonts w:ascii="Arial" w:eastAsia="宋体" w:hAnsi="Arial" w:cs="Arial" w:hint="eastAsia"/>
+                <w:b/>
+                <w:bCs/>
+                <w:kern w:val="0"/>
+                <w:sz w:val="22"/>
+                <w:szCs w:val="22"/>
+                <w:lang w:val="en-US"/>
+                <w14:ligatures w14:val="none"/>
+              </w:rPr>
+              <w:t>Use ai to understand about the concept of ML</w:t>
+            </w:r>
           </w:p>
           <w:p>
             <w:pPr>
@@ -1559,7 +1518,27 @@
                 <w:lang w:val="en-US"/>
                 <w14:ligatures w14:val="none"/>
               </w:rPr>
-              <w:t>The content generated by AI tools are not retrievable except by the user who generated them, so they are considered non-recoverable sources. Although non-recoverable data or quotations in APA Style papers are usually cited as personal communications, with ChatGPT-generated text there is no person communicating. Quoting text from ChatGPT chat is therefore more like sharing the output of an algorithm, with a reference list entry and the corresponding in-text citation.</w:t>
+              <w:t xml:space="preserve">The content generated by AI tools </w:t>
+            </w:r>
+            <w:proofErr w:type="gramStart"/>
+            <w:r>
+              <w:rPr>
+                <w:rFonts w:ascii="Arial" w:eastAsia="Times New Roman" w:hAnsi="Arial" w:cs="Arial"/>
+                <w:kern w:val="0"/>
+                <w:lang w:val="en-US"/>
+                <w14:ligatures w14:val="none"/>
+              </w:rPr>
+              <w:t>are</w:t>
+            </w:r>
+            <w:proofErr w:type="gramEnd"/>
+            <w:r>
+              <w:rPr>
+                <w:rFonts w:ascii="Arial" w:eastAsia="Times New Roman" w:hAnsi="Arial" w:cs="Arial"/>
+                <w:kern w:val="0"/>
+                <w:lang w:val="en-US"/>
+                <w14:ligatures w14:val="none"/>
+              </w:rPr>
+              <w:t xml:space="preserve"> not retrievable except by the user who generated them, so they are considered non-recoverable sources. Although non-recoverable data or quotations in APA Style papers are usually cited as personal communications, with ChatGPT-generated text there is no person communicating. Quoting text from ChatGPT chat is therefore more like sharing the output of an algorithm, with a reference list entry and the corresponding in-text citation.</w:t>
             </w:r>
           </w:p>
           <w:p>
@@ -1647,7 +1626,7 @@
               </w:rPr>
               <w:t xml:space="preserve">                    </w:t>
             </w:r>
-            <w:hyperlink r:id="rId14" w:history="1">
+            <w:hyperlink r:id="rId15" w:history="1">
               <w:r>
                 <w:rPr>
                   <w:rFonts w:ascii="Arial" w:eastAsia="Times New Roman" w:hAnsi="Arial" w:cs="Arial"/>
@@ -1946,20 +1925,59 @@
         <w:lastRenderedPageBreak/>
         <w:t>References / Citations / Use of Gen AI tools</w:t>
       </w:r>
-      <w:r>
-        <w:rPr>
+    </w:p>
+    <w:p>
+      <w:pPr>
+        <w:rPr>
+          <w:rFonts w:hint="eastAsia"/>
           <w:b/>
           <w:bCs/>
           <w:sz w:val="22"/>
           <w:szCs w:val="22"/>
           <w:u w:val="single"/>
-        </w:rPr>
-        <w:br w:type="page"/>
+          <w:lang w:val="en-US"/>
+        </w:rPr>
+      </w:pPr>
+      <w:r>
+        <w:rPr>
+          <w:rFonts w:hint="eastAsia"/>
+          <w:b/>
+          <w:bCs/>
+          <w:sz w:val="22"/>
+          <w:szCs w:val="22"/>
+          <w:u w:val="single"/>
+          <w:lang w:val="en-US"/>
+        </w:rPr>
+        <w:t>Screenshots</w:t>
+      </w:r>
+      <w:r>
+        <w:rPr>
+          <w:rFonts w:hint="eastAsia"/>
+          <w:b/>
+          <w:bCs/>
+          <w:sz w:val="22"/>
+          <w:szCs w:val="22"/>
+          <w:u w:val="single"/>
+          <w:lang w:val="en-US"/>
+        </w:rPr>
+        <w:t xml:space="preserve"> original</w:t>
+      </w:r>
+      <w:r>
+        <w:rPr>
+          <w:rFonts w:hint="eastAsia"/>
+          <w:b/>
+          <w:bCs/>
+          <w:sz w:val="22"/>
+          <w:szCs w:val="22"/>
+          <w:u w:val="single"/>
+          <w:lang w:val="en-US"/>
+        </w:rPr>
+        <w:t>：</w:t>
       </w:r>
     </w:p>
     <w:tbl>
       <w:tblPr>
-        <w:tblStyle w:val="TableGrid"/>
+        <w:tblStyle w:val="af"/>
         <w:tblW w:w="0" w:type="auto"/>
         <w:tblLook w:val="04A0" w:firstRow="1" w:lastRow="0" w:firstColumn="1" w:lastColumn="0" w:noHBand="0" w:noVBand="1"/>
       </w:tblPr>
@@ -1974,6 +1992,7 @@
           </w:tcPr>
           <w:p>
             <w:pPr>
+              <w:spacing w:after="0" w:line="240" w:lineRule="auto"/>
               <w:rPr>
                 <w:rFonts w:ascii="Arial" w:hAnsi="Arial" w:cs="Arial"/>
                 <w:b/>
@@ -1990,7 +2009,6 @@
                 <w:sz w:val="22"/>
                 <w:szCs w:val="22"/>
               </w:rPr>
-              <w:lastRenderedPageBreak/>
               <w:t>Source of dataset</w:t>
             </w:r>
           </w:p>
@@ -2001,12 +2019,32 @@
           </w:tcPr>
           <w:p>
             <w:pPr>
-              <w:rPr>
-                <w:rFonts w:ascii="Arial" w:hAnsi="Arial" w:cs="Arial"/>
+              <w:spacing w:after="0" w:line="240" w:lineRule="auto"/>
+              <w:rPr>
+                <w:rFonts w:ascii="Arial" w:hAnsi="Arial" w:cs="Arial" w:hint="eastAsia"/>
                 <w:sz w:val="22"/>
                 <w:szCs w:val="22"/>
               </w:rPr>
             </w:pPr>
+            <w:hyperlink r:id="rId16" w:history="1">
+              <w:r>
+                <w:rPr>
+                  <w:rStyle w:val="af6"/>
+                  <w:rFonts w:ascii="Arial" w:hAnsi="Arial" w:cs="Arial"/>
+                  <w:sz w:val="22"/>
+                  <w:szCs w:val="22"/>
+                </w:rPr>
+                <w:t>https://www.kaggle.com/competitions/house-prices-advanced-regression-techniques/data</w:t>
+              </w:r>
+            </w:hyperlink>
+            <w:r>
+              <w:rPr>
+                <w:rFonts w:ascii="Arial" w:hAnsi="Arial" w:cs="Arial" w:hint="eastAsia"/>
+                <w:sz w:val="22"/>
+                <w:szCs w:val="22"/>
+              </w:rPr>
+              <w:t xml:space="preserve">  </w:t>
+            </w:r>
           </w:p>
         </w:tc>
       </w:tr>
@@ -2017,6 +2055,7 @@
           </w:tcPr>
           <w:p>
             <w:pPr>
+              <w:spacing w:after="0" w:line="240" w:lineRule="auto"/>
               <w:rPr>
                 <w:rFonts w:ascii="Arial" w:hAnsi="Arial" w:cs="Arial"/>
                 <w:b/>
@@ -2043,12 +2082,32 @@
           </w:tcPr>
           <w:p>
             <w:pPr>
-              <w:rPr>
-                <w:rFonts w:ascii="Arial" w:hAnsi="Arial" w:cs="Arial"/>
+              <w:spacing w:after="0" w:line="240" w:lineRule="auto"/>
+              <w:rPr>
+                <w:rFonts w:ascii="Arial" w:hAnsi="Arial" w:cs="Arial" w:hint="eastAsia"/>
                 <w:sz w:val="22"/>
                 <w:szCs w:val="22"/>
               </w:rPr>
             </w:pPr>
+            <w:hyperlink r:id="rId17" w:history="1">
+              <w:r>
+                <w:rPr>
+                  <w:rStyle w:val="af6"/>
+                  <w:rFonts w:ascii="Arial" w:hAnsi="Arial" w:cs="Arial"/>
+                  <w:sz w:val="22"/>
+                  <w:szCs w:val="22"/>
+                </w:rPr>
+                <w:t>https://github.com/yorhagengyue/MLDP-Project</w:t>
+              </w:r>
+            </w:hyperlink>
+            <w:r>
+              <w:rPr>
+                <w:rFonts w:ascii="Arial" w:hAnsi="Arial" w:cs="Arial" w:hint="eastAsia"/>
+                <w:sz w:val="22"/>
+                <w:szCs w:val="22"/>
+              </w:rPr>
+              <w:t xml:space="preserve">  </w:t>
+            </w:r>
           </w:p>
         </w:tc>
       </w:tr>
@@ -2059,6 +2118,7 @@
           </w:tcPr>
           <w:p>
             <w:pPr>
+              <w:spacing w:after="0" w:line="240" w:lineRule="auto"/>
               <w:rPr>
                 <w:rFonts w:ascii="Arial" w:hAnsi="Arial" w:cs="Arial"/>
                 <w:b/>
@@ -2067,6 +2127,7 @@
                 <w:szCs w:val="22"/>
               </w:rPr>
             </w:pPr>
+            <w:proofErr w:type="spellStart"/>
             <w:r>
               <w:rPr>
                 <w:rFonts w:ascii="Arial" w:hAnsi="Arial" w:cs="Arial"/>
@@ -2075,7 +2136,18 @@
                 <w:sz w:val="22"/>
                 <w:szCs w:val="22"/>
               </w:rPr>
-              <w:t>Streamlit link</w:t>
+              <w:t>Streamlit</w:t>
+            </w:r>
+            <w:proofErr w:type="spellEnd"/>
+            <w:r>
+              <w:rPr>
+                <w:rFonts w:ascii="Arial" w:hAnsi="Arial" w:cs="Arial"/>
+                <w:b/>
+                <w:bCs/>
+                <w:sz w:val="22"/>
+                <w:szCs w:val="22"/>
+              </w:rPr>
+              <w:t xml:space="preserve"> link</w:t>
             </w:r>
           </w:p>
         </w:tc>
@@ -2085,12 +2157,32 @@
           </w:tcPr>
           <w:p>
             <w:pPr>
-              <w:rPr>
-                <w:rFonts w:ascii="Arial" w:hAnsi="Arial" w:cs="Arial"/>
+              <w:spacing w:after="0" w:line="240" w:lineRule="auto"/>
+              <w:rPr>
+                <w:rFonts w:ascii="Arial" w:hAnsi="Arial" w:cs="Arial" w:hint="eastAsia"/>
                 <w:sz w:val="22"/>
                 <w:szCs w:val="22"/>
               </w:rPr>
             </w:pPr>
+            <w:hyperlink r:id="rId18" w:history="1">
+              <w:r>
+                <w:rPr>
+                  <w:rStyle w:val="af6"/>
+                  <w:rFonts w:ascii="Arial" w:hAnsi="Arial" w:cs="Arial"/>
+                  <w:sz w:val="22"/>
+                  <w:szCs w:val="22"/>
+                </w:rPr>
+                <w:t>https://mldp-project-zbea3dffzbfwqehxobauat.streamlit.app/</w:t>
+              </w:r>
+            </w:hyperlink>
+            <w:r>
+              <w:rPr>
+                <w:rFonts w:ascii="Arial" w:hAnsi="Arial" w:cs="Arial" w:hint="eastAsia"/>
+                <w:sz w:val="22"/>
+                <w:szCs w:val="22"/>
+              </w:rPr>
+              <w:t xml:space="preserve">  </w:t>
+            </w:r>
           </w:p>
         </w:tc>
       </w:tr>
@@ -2139,6 +2231,67 @@
       </w:pPr>
       <w:r>
         <w:rPr>
+          <w:noProof/>
+          <w14:ligatures w14:val="none"/>
+        </w:rPr>
+        <w:drawing>
+          <wp:anchor distT="0" distB="0" distL="114300" distR="114300" simplePos="0" relativeHeight="251658240" behindDoc="0" locked="0" layoutInCell="1" allowOverlap="1" wp14:anchorId="7B29B375" wp14:editId="348AE263">
+            <wp:simplePos x="0" y="0"/>
+            <wp:positionH relativeFrom="margin">
+              <wp:posOffset>-32385</wp:posOffset>
+            </wp:positionH>
+            <wp:positionV relativeFrom="paragraph">
+              <wp:posOffset>261620</wp:posOffset>
+            </wp:positionV>
+            <wp:extent cx="4202430" cy="2458085"/>
+            <wp:effectExtent l="0" t="0" r="7620" b="0"/>
+            <wp:wrapTopAndBottom/>
+            <wp:docPr id="818840751" name="图片 1" descr="图形用户界面, 应用程序&#10;&#10;AI 生成的内容可能不正确。"/>
+            <wp:cNvGraphicFramePr>
+              <a:graphicFrameLocks xmlns:a="http://schemas.openxmlformats.org/drawingml/2006/main" noChangeAspect="1"/>
+            </wp:cNvGraphicFramePr>
+            <a:graphic xmlns:a="http://schemas.openxmlformats.org/drawingml/2006/main">
+              <a:graphicData uri="http://schemas.openxmlformats.org/drawingml/2006/picture">
+                <pic:pic xmlns:pic="http://schemas.openxmlformats.org/drawingml/2006/picture">
+                  <pic:nvPicPr>
+                    <pic:cNvPr id="818840751" name="图片 1" descr="图形用户界面, 应用程序&#10;&#10;AI 生成的内容可能不正确。"/>
+                    <pic:cNvPicPr/>
+                  </pic:nvPicPr>
+                  <pic:blipFill>
+                    <a:blip r:embed="rId19" cstate="print">
+                      <a:extLst>
+                        <a:ext uri="{28A0092B-C50C-407E-A947-70E740481C1C}">
+                          <a14:useLocalDpi xmlns:a14="http://schemas.microsoft.com/office/drawing/2010/main" val="0"/>
+                        </a:ext>
+                      </a:extLst>
+                    </a:blip>
+                    <a:stretch>
+                      <a:fillRect/>
+                    </a:stretch>
+                  </pic:blipFill>
+                  <pic:spPr>
+                    <a:xfrm>
+                      <a:off x="0" y="0"/>
+                      <a:ext cx="4202430" cy="2458085"/>
+                    </a:xfrm>
+                    <a:prstGeom prst="rect">
+                      <a:avLst/>
+                    </a:prstGeom>
+                  </pic:spPr>
+                </pic:pic>
+              </a:graphicData>
+            </a:graphic>
+            <wp14:sizeRelH relativeFrom="margin">
+              <wp14:pctWidth>0</wp14:pctWidth>
+            </wp14:sizeRelH>
+            <wp14:sizeRelV relativeFrom="margin">
+              <wp14:pctHeight>0</wp14:pctHeight>
+            </wp14:sizeRelV>
+          </wp:anchor>
+        </w:drawing>
+      </w:r>
+      <w:r>
+        <w:rPr>
           <w:rFonts w:ascii="Arial" w:hAnsi="Arial" w:cs="Arial"/>
           <w:b/>
           <w:bCs/>
@@ -2158,6 +2311,128 @@
           <w:szCs w:val="22"/>
         </w:rPr>
       </w:pPr>
+      <w:r>
+        <w:rPr>
+          <w:noProof/>
+          <w14:ligatures w14:val="none"/>
+        </w:rPr>
+        <w:drawing>
+          <wp:anchor distT="0" distB="0" distL="114300" distR="114300" simplePos="0" relativeHeight="251660288" behindDoc="0" locked="0" layoutInCell="1" allowOverlap="1" wp14:anchorId="5BCBAD34" wp14:editId="118BA022">
+            <wp:simplePos x="0" y="0"/>
+            <wp:positionH relativeFrom="column">
+              <wp:posOffset>-63500</wp:posOffset>
+            </wp:positionH>
+            <wp:positionV relativeFrom="paragraph">
+              <wp:posOffset>4827270</wp:posOffset>
+            </wp:positionV>
+            <wp:extent cx="4542155" cy="2378075"/>
+            <wp:effectExtent l="0" t="0" r="0" b="3175"/>
+            <wp:wrapTopAndBottom/>
+            <wp:docPr id="483877798" name="图片 1" descr="图表, 直方图&#10;&#10;AI 生成的内容可能不正确。"/>
+            <wp:cNvGraphicFramePr>
+              <a:graphicFrameLocks xmlns:a="http://schemas.openxmlformats.org/drawingml/2006/main" noChangeAspect="1"/>
+            </wp:cNvGraphicFramePr>
+            <a:graphic xmlns:a="http://schemas.openxmlformats.org/drawingml/2006/main">
+              <a:graphicData uri="http://schemas.openxmlformats.org/drawingml/2006/picture">
+                <pic:pic xmlns:pic="http://schemas.openxmlformats.org/drawingml/2006/picture">
+                  <pic:nvPicPr>
+                    <pic:cNvPr id="483877798" name="图片 1" descr="图表, 直方图&#10;&#10;AI 生成的内容可能不正确。"/>
+                    <pic:cNvPicPr/>
+                  </pic:nvPicPr>
+                  <pic:blipFill>
+                    <a:blip r:embed="rId20" cstate="print">
+                      <a:extLst>
+                        <a:ext uri="{28A0092B-C50C-407E-A947-70E740481C1C}">
+                          <a14:useLocalDpi xmlns:a14="http://schemas.microsoft.com/office/drawing/2010/main" val="0"/>
+                        </a:ext>
+                      </a:extLst>
+                    </a:blip>
+                    <a:stretch>
+                      <a:fillRect/>
+                    </a:stretch>
+                  </pic:blipFill>
+                  <pic:spPr>
+                    <a:xfrm>
+                      <a:off x="0" y="0"/>
+                      <a:ext cx="4542155" cy="2378075"/>
+                    </a:xfrm>
+                    <a:prstGeom prst="rect">
+                      <a:avLst/>
+                    </a:prstGeom>
+                  </pic:spPr>
+                </pic:pic>
+              </a:graphicData>
+            </a:graphic>
+            <wp14:sizeRelH relativeFrom="margin">
+              <wp14:pctWidth>0</wp14:pctWidth>
+            </wp14:sizeRelH>
+            <wp14:sizeRelV relativeFrom="margin">
+              <wp14:pctHeight>0</wp14:pctHeight>
+            </wp14:sizeRelV>
+          </wp:anchor>
+        </w:drawing>
+      </w:r>
+      <w:r>
+        <w:rPr>
+          <w:noProof/>
+          <w14:ligatures w14:val="none"/>
+        </w:rPr>
+        <w:drawing>
+          <wp:anchor distT="0" distB="0" distL="114300" distR="114300" simplePos="0" relativeHeight="251659264" behindDoc="0" locked="0" layoutInCell="1" allowOverlap="1" wp14:anchorId="1844D050" wp14:editId="47C2A6F3">
+            <wp:simplePos x="0" y="0"/>
+            <wp:positionH relativeFrom="margin">
+              <wp:align>left</wp:align>
+            </wp:positionH>
+            <wp:positionV relativeFrom="paragraph">
+              <wp:posOffset>2623820</wp:posOffset>
+            </wp:positionV>
+            <wp:extent cx="4159250" cy="2205355"/>
+            <wp:effectExtent l="0" t="0" r="0" b="4445"/>
+            <wp:wrapTopAndBottom/>
+            <wp:docPr id="1542234455" name="图片 1" descr="图片包含 图表&#10;&#10;AI 生成的内容可能不正确。"/>
+            <wp:cNvGraphicFramePr>
+              <a:graphicFrameLocks xmlns:a="http://schemas.openxmlformats.org/drawingml/2006/main" noChangeAspect="1"/>
+            </wp:cNvGraphicFramePr>
+            <a:graphic xmlns:a="http://schemas.openxmlformats.org/drawingml/2006/main">
+              <a:graphicData uri="http://schemas.openxmlformats.org/drawingml/2006/picture">
+                <pic:pic xmlns:pic="http://schemas.openxmlformats.org/drawingml/2006/picture">
+                  <pic:nvPicPr>
+                    <pic:cNvPr id="1542234455" name="图片 1" descr="图片包含 图表&#10;&#10;AI 生成的内容可能不正确。"/>
+                    <pic:cNvPicPr/>
+                  </pic:nvPicPr>
+                  <pic:blipFill>
+                    <a:blip r:embed="rId21" cstate="print">
+                      <a:extLst>
+                        <a:ext uri="{28A0092B-C50C-407E-A947-70E740481C1C}">
+                          <a14:useLocalDpi xmlns:a14="http://schemas.microsoft.com/office/drawing/2010/main" val="0"/>
+                        </a:ext>
+                      </a:extLst>
+                    </a:blip>
+                    <a:stretch>
+                      <a:fillRect/>
+                    </a:stretch>
+                  </pic:blipFill>
+                  <pic:spPr>
+                    <a:xfrm>
+                      <a:off x="0" y="0"/>
+                      <a:ext cx="4159250" cy="2205355"/>
+                    </a:xfrm>
+                    <a:prstGeom prst="rect">
+                      <a:avLst/>
+                    </a:prstGeom>
+                  </pic:spPr>
+                </pic:pic>
+              </a:graphicData>
+            </a:graphic>
+            <wp14:sizeRelH relativeFrom="margin">
+              <wp14:pctWidth>0</wp14:pctWidth>
+            </wp14:sizeRelH>
+            <wp14:sizeRelV relativeFrom="margin">
+              <wp14:pctHeight>0</wp14:pctHeight>
+            </wp14:sizeRelV>
+          </wp:anchor>
+        </w:drawing>
+      </w:r>
     </w:p>
     <w:p>
       <w:pPr>
@@ -2177,31 +2452,33 @@
           <w:sz w:val="22"/>
           <w:szCs w:val="22"/>
         </w:rPr>
+        <w:lastRenderedPageBreak/>
         <w:t>(2) After an option is selected (should show a prediction)</w:t>
       </w:r>
     </w:p>
     <w:p>
       <w:pPr>
         <w:rPr>
-          <w:rFonts w:ascii="Arial" w:hAnsi="Arial" w:cs="Arial"/>
+          <w:rFonts w:ascii="Arial" w:hAnsi="Arial" w:cs="Arial" w:hint="eastAsia"/>
           <w:b/>
           <w:bCs/>
           <w:sz w:val="22"/>
           <w:szCs w:val="22"/>
         </w:rPr>
       </w:pPr>
-    </w:p>
-    <w:p>
-      <w:pPr>
-        <w:rPr>
-          <w:rFonts w:ascii="Arial" w:hAnsi="Arial" w:cs="Arial"/>
+      <w:r>
+        <w:rPr>
+          <w:rFonts w:ascii="Arial" w:hAnsi="Arial" w:cs="Arial" w:hint="eastAsia"/>
           <w:b/>
           <w:bCs/>
           <w:sz w:val="22"/>
           <w:szCs w:val="22"/>
         </w:rPr>
-      </w:pPr>
-      <w:r>
+        <w:t>Pre-set data</w:t>
+      </w:r>
+    </w:p>
+    <w:p>
+      <w:pPr>
         <w:rPr>
           <w:rFonts w:ascii="Arial" w:hAnsi="Arial" w:cs="Arial"/>
           <w:b/>
@@ -2209,7 +2486,116 @@
           <w:sz w:val="22"/>
           <w:szCs w:val="22"/>
         </w:rPr>
-        <w:t>(3) After another option is selected (should show a change in value for the</w:t>
+      </w:pPr>
+      <w:r>
+        <w:rPr>
+          <w:noProof/>
+          <w14:ligatures w14:val="none"/>
+        </w:rPr>
+        <w:drawing>
+          <wp:anchor distT="0" distB="0" distL="114300" distR="114300" simplePos="0" relativeHeight="251664384" behindDoc="0" locked="0" layoutInCell="1" allowOverlap="1" wp14:anchorId="779F9431" wp14:editId="49F62086">
+            <wp:simplePos x="0" y="0"/>
+            <wp:positionH relativeFrom="column">
+              <wp:posOffset>0</wp:posOffset>
+            </wp:positionH>
+            <wp:positionV relativeFrom="paragraph">
+              <wp:posOffset>3185795</wp:posOffset>
+            </wp:positionV>
+            <wp:extent cx="5731510" cy="3400425"/>
+            <wp:effectExtent l="0" t="0" r="2540" b="9525"/>
+            <wp:wrapTopAndBottom/>
+            <wp:docPr id="1858074898" name="图片 1" descr="图片包含 图形用户界面&#10;&#10;AI 生成的内容可能不正确。"/>
+            <wp:cNvGraphicFramePr>
+              <a:graphicFrameLocks xmlns:a="http://schemas.openxmlformats.org/drawingml/2006/main" noChangeAspect="1"/>
+            </wp:cNvGraphicFramePr>
+            <a:graphic xmlns:a="http://schemas.openxmlformats.org/drawingml/2006/main">
+              <a:graphicData uri="http://schemas.openxmlformats.org/drawingml/2006/picture">
+                <pic:pic xmlns:pic="http://schemas.openxmlformats.org/drawingml/2006/picture">
+                  <pic:nvPicPr>
+                    <pic:cNvPr id="1858074898" name="图片 1" descr="图片包含 图形用户界面&#10;&#10;AI 生成的内容可能不正确。"/>
+                    <pic:cNvPicPr/>
+                  </pic:nvPicPr>
+                  <pic:blipFill>
+                    <a:blip r:embed="rId22" cstate="print">
+                      <a:extLst>
+                        <a:ext uri="{28A0092B-C50C-407E-A947-70E740481C1C}">
+                          <a14:useLocalDpi xmlns:a14="http://schemas.microsoft.com/office/drawing/2010/main" val="0"/>
+                        </a:ext>
+                      </a:extLst>
+                    </a:blip>
+                    <a:stretch>
+                      <a:fillRect/>
+                    </a:stretch>
+                  </pic:blipFill>
+                  <pic:spPr>
+                    <a:xfrm>
+                      <a:off x="0" y="0"/>
+                      <a:ext cx="5731510" cy="3400425"/>
+                    </a:xfrm>
+                    <a:prstGeom prst="rect">
+                      <a:avLst/>
+                    </a:prstGeom>
+                  </pic:spPr>
+                </pic:pic>
+              </a:graphicData>
+            </a:graphic>
+          </wp:anchor>
+        </w:drawing>
+      </w:r>
+      <w:r>
+        <w:rPr>
+          <w:noProof/>
+          <w14:ligatures w14:val="none"/>
+        </w:rPr>
+        <w:drawing>
+          <wp:anchor distT="0" distB="0" distL="114300" distR="114300" simplePos="0" relativeHeight="251663360" behindDoc="0" locked="0" layoutInCell="1" allowOverlap="1" wp14:anchorId="1AF88CC2" wp14:editId="1F77975A">
+            <wp:simplePos x="0" y="0"/>
+            <wp:positionH relativeFrom="column">
+              <wp:posOffset>0</wp:posOffset>
+            </wp:positionH>
+            <wp:positionV relativeFrom="paragraph">
+              <wp:posOffset>-1905</wp:posOffset>
+            </wp:positionV>
+            <wp:extent cx="5731510" cy="3185795"/>
+            <wp:effectExtent l="0" t="0" r="2540" b="0"/>
+            <wp:wrapTopAndBottom/>
+            <wp:docPr id="597768652" name="图片 1" descr="图形用户界面, 应用程序&#10;&#10;AI 生成的内容可能不正确。"/>
+            <wp:cNvGraphicFramePr>
+              <a:graphicFrameLocks xmlns:a="http://schemas.openxmlformats.org/drawingml/2006/main" noChangeAspect="1"/>
+            </wp:cNvGraphicFramePr>
+            <a:graphic xmlns:a="http://schemas.openxmlformats.org/drawingml/2006/main">
+              <a:graphicData uri="http://schemas.openxmlformats.org/drawingml/2006/picture">
+                <pic:pic xmlns:pic="http://schemas.openxmlformats.org/drawingml/2006/picture">
+                  <pic:nvPicPr>
+                    <pic:cNvPr id="597768652" name="图片 1" descr="图形用户界面, 应用程序&#10;&#10;AI 生成的内容可能不正确。"/>
+                    <pic:cNvPicPr/>
+                  </pic:nvPicPr>
+                  <pic:blipFill>
+                    <a:blip r:embed="rId23" cstate="print">
+                      <a:extLst>
+                        <a:ext uri="{28A0092B-C50C-407E-A947-70E740481C1C}">
+                          <a14:useLocalDpi xmlns:a14="http://schemas.microsoft.com/office/drawing/2010/main" val="0"/>
+                        </a:ext>
+                      </a:extLst>
+                    </a:blip>
+                    <a:stretch>
+                      <a:fillRect/>
+                    </a:stretch>
+                  </pic:blipFill>
+                  <pic:spPr>
+                    <a:xfrm>
+                      <a:off x="0" y="0"/>
+                      <a:ext cx="5731510" cy="3185795"/>
+                    </a:xfrm>
+                    <a:prstGeom prst="rect">
+                      <a:avLst/>
+                    </a:prstGeom>
+                  </pic:spPr>
+                </pic:pic>
+              </a:graphicData>
+            </a:graphic>
+          </wp:anchor>
+        </w:drawing>
       </w:r>
     </w:p>
     <w:p>
@@ -2224,25 +2610,459 @@
       </w:pPr>
       <w:r>
         <w:rPr>
-          <w:rFonts w:ascii="Arial" w:hAnsi="Arial" w:cs="Arial"/>
+          <w:rFonts w:ascii="Arial" w:hAnsi="Arial" w:cs="Arial" w:hint="eastAsia"/>
           <w:b/>
           <w:bCs/>
           <w:sz w:val="22"/>
           <w:szCs w:val="22"/>
         </w:rPr>
-        <w:t>prediction)</w:t>
-      </w:r>
-    </w:p>
-    <w:p>
-      <w:pPr>
-        <w:rPr>
-          <w:rFonts w:ascii="Arial" w:hAnsi="Arial" w:cs="Arial"/>
+        <w:t>Manual data selected</w:t>
+      </w:r>
+    </w:p>
+    <w:p>
+      <w:pPr>
+        <w:rPr>
+          <w:rFonts w:ascii="Arial" w:hAnsi="Arial" w:cs="Arial" w:hint="eastAsia"/>
           <w:b/>
           <w:bCs/>
           <w:sz w:val="22"/>
           <w:szCs w:val="22"/>
         </w:rPr>
       </w:pPr>
+      <w:r>
+        <w:rPr>
+          <w:noProof/>
+          <w14:ligatures w14:val="none"/>
+        </w:rPr>
+        <w:lastRenderedPageBreak/>
+        <w:drawing>
+          <wp:anchor distT="0" distB="0" distL="114300" distR="114300" simplePos="0" relativeHeight="251662336" behindDoc="0" locked="0" layoutInCell="1" allowOverlap="1" wp14:anchorId="09EA1C05" wp14:editId="338F6738">
+            <wp:simplePos x="0" y="0"/>
+            <wp:positionH relativeFrom="margin">
+              <wp:align>left</wp:align>
+            </wp:positionH>
+            <wp:positionV relativeFrom="paragraph">
+              <wp:posOffset>2432050</wp:posOffset>
+            </wp:positionV>
+            <wp:extent cx="4521200" cy="2419985"/>
+            <wp:effectExtent l="0" t="0" r="0" b="0"/>
+            <wp:wrapTopAndBottom/>
+            <wp:docPr id="1418178506" name="图片 1" descr="图片包含 图形用户界面&#10;&#10;AI 生成的内容可能不正确。"/>
+            <wp:cNvGraphicFramePr>
+              <a:graphicFrameLocks xmlns:a="http://schemas.openxmlformats.org/drawingml/2006/main" noChangeAspect="1"/>
+            </wp:cNvGraphicFramePr>
+            <a:graphic xmlns:a="http://schemas.openxmlformats.org/drawingml/2006/main">
+              <a:graphicData uri="http://schemas.openxmlformats.org/drawingml/2006/picture">
+                <pic:pic xmlns:pic="http://schemas.openxmlformats.org/drawingml/2006/picture">
+                  <pic:nvPicPr>
+                    <pic:cNvPr id="1418178506" name="图片 1" descr="图片包含 图形用户界面&#10;&#10;AI 生成的内容可能不正确。"/>
+                    <pic:cNvPicPr/>
+                  </pic:nvPicPr>
+                  <pic:blipFill>
+                    <a:blip r:embed="rId24" cstate="print">
+                      <a:extLst>
+                        <a:ext uri="{28A0092B-C50C-407E-A947-70E740481C1C}">
+                          <a14:useLocalDpi xmlns:a14="http://schemas.microsoft.com/office/drawing/2010/main" val="0"/>
+                        </a:ext>
+                      </a:extLst>
+                    </a:blip>
+                    <a:stretch>
+                      <a:fillRect/>
+                    </a:stretch>
+                  </pic:blipFill>
+                  <pic:spPr>
+                    <a:xfrm>
+                      <a:off x="0" y="0"/>
+                      <a:ext cx="4521200" cy="2419985"/>
+                    </a:xfrm>
+                    <a:prstGeom prst="rect">
+                      <a:avLst/>
+                    </a:prstGeom>
+                  </pic:spPr>
+                </pic:pic>
+              </a:graphicData>
+            </a:graphic>
+            <wp14:sizeRelH relativeFrom="margin">
+              <wp14:pctWidth>0</wp14:pctWidth>
+            </wp14:sizeRelH>
+            <wp14:sizeRelV relativeFrom="margin">
+              <wp14:pctHeight>0</wp14:pctHeight>
+            </wp14:sizeRelV>
+          </wp:anchor>
+        </w:drawing>
+      </w:r>
+      <w:r>
+        <w:rPr>
+          <w:noProof/>
+          <w14:ligatures w14:val="none"/>
+        </w:rPr>
+        <w:drawing>
+          <wp:inline distT="0" distB="0" distL="0" distR="0" wp14:anchorId="33B98BDA" wp14:editId="641471EF">
+            <wp:extent cx="4260850" cy="2252689"/>
+            <wp:effectExtent l="0" t="0" r="6350" b="0"/>
+            <wp:docPr id="1242605016" name="图片 1" descr="图形用户界面&#10;&#10;AI 生成的内容可能不正确。"/>
+            <wp:cNvGraphicFramePr>
+              <a:graphicFrameLocks xmlns:a="http://schemas.openxmlformats.org/drawingml/2006/main" noChangeAspect="1"/>
+            </wp:cNvGraphicFramePr>
+            <a:graphic xmlns:a="http://schemas.openxmlformats.org/drawingml/2006/main">
+              <a:graphicData uri="http://schemas.openxmlformats.org/drawingml/2006/picture">
+                <pic:pic xmlns:pic="http://schemas.openxmlformats.org/drawingml/2006/picture">
+                  <pic:nvPicPr>
+                    <pic:cNvPr id="1242605016" name="图片 1" descr="图形用户界面&#10;&#10;AI 生成的内容可能不正确。"/>
+                    <pic:cNvPicPr/>
+                  </pic:nvPicPr>
+                  <pic:blipFill>
+                    <a:blip r:embed="rId25"/>
+                    <a:stretch>
+                      <a:fillRect/>
+                    </a:stretch>
+                  </pic:blipFill>
+                  <pic:spPr>
+                    <a:xfrm>
+                      <a:off x="0" y="0"/>
+                      <a:ext cx="4268385" cy="2256673"/>
+                    </a:xfrm>
+                    <a:prstGeom prst="rect">
+                      <a:avLst/>
+                    </a:prstGeom>
+                  </pic:spPr>
+                </pic:pic>
+              </a:graphicData>
+            </a:graphic>
+          </wp:inline>
+        </w:drawing>
+      </w:r>
+    </w:p>
+    <w:p>
+      <w:pPr>
+        <w:rPr>
+          <w:rFonts w:ascii="Arial" w:hAnsi="Arial" w:cs="Arial"/>
+          <w:b/>
+          <w:bCs/>
+          <w:sz w:val="22"/>
+          <w:szCs w:val="22"/>
+        </w:rPr>
+      </w:pPr>
+      <w:r>
+        <w:rPr>
+          <w:rFonts w:ascii="Arial" w:hAnsi="Arial" w:cs="Arial"/>
+          <w:b/>
+          <w:bCs/>
+          <w:sz w:val="22"/>
+          <w:szCs w:val="22"/>
+        </w:rPr>
+        <w:t>(3) After another option is selected (should show a change in value for the</w:t>
+      </w:r>
+    </w:p>
+    <w:p>
+      <w:pPr>
+        <w:rPr>
+          <w:rFonts w:ascii="Arial" w:hAnsi="Arial" w:cs="Arial"/>
+          <w:b/>
+          <w:bCs/>
+          <w:sz w:val="22"/>
+          <w:szCs w:val="22"/>
+        </w:rPr>
+      </w:pPr>
+      <w:r>
+        <w:rPr>
+          <w:rFonts w:ascii="Arial" w:hAnsi="Arial" w:cs="Arial"/>
+          <w:b/>
+          <w:bCs/>
+          <w:sz w:val="22"/>
+          <w:szCs w:val="22"/>
+        </w:rPr>
+        <w:t>prediction)</w:t>
+      </w:r>
+    </w:p>
+    <w:p>
+      <w:pPr>
+        <w:rPr>
+          <w:rFonts w:ascii="Arial" w:hAnsi="Arial" w:cs="Arial" w:hint="eastAsia"/>
+          <w:b/>
+          <w:bCs/>
+          <w:sz w:val="22"/>
+          <w:szCs w:val="22"/>
+        </w:rPr>
+      </w:pPr>
+      <w:r>
+        <w:rPr>
+          <w:rFonts w:ascii="Arial" w:hAnsi="Arial" w:cs="Arial" w:hint="eastAsia"/>
+          <w:b/>
+          <w:bCs/>
+          <w:sz w:val="22"/>
+          <w:szCs w:val="22"/>
+        </w:rPr>
+        <w:t>Pre-set data</w:t>
+      </w:r>
+    </w:p>
+    <w:p>
+      <w:pPr>
+        <w:rPr>
+          <w:rFonts w:ascii="Arial" w:hAnsi="Arial" w:cs="Arial"/>
+          <w:b/>
+          <w:bCs/>
+          <w:sz w:val="22"/>
+          <w:szCs w:val="22"/>
+        </w:rPr>
+      </w:pPr>
+      <w:r>
+        <w:rPr>
+          <w:noProof/>
+          <w14:ligatures w14:val="none"/>
+        </w:rPr>
+        <w:drawing>
+          <wp:inline distT="0" distB="0" distL="0" distR="0" wp14:anchorId="081FBEBD" wp14:editId="27B22A79">
+            <wp:extent cx="5321300" cy="3059777"/>
+            <wp:effectExtent l="0" t="0" r="0" b="7620"/>
+            <wp:docPr id="361361061" name="图片 1" descr="图形用户界面, 应用程序&#10;&#10;AI 生成的内容可能不正确。"/>
+            <wp:cNvGraphicFramePr>
+              <a:graphicFrameLocks xmlns:a="http://schemas.openxmlformats.org/drawingml/2006/main" noChangeAspect="1"/>
+            </wp:cNvGraphicFramePr>
+            <a:graphic xmlns:a="http://schemas.openxmlformats.org/drawingml/2006/main">
+              <a:graphicData uri="http://schemas.openxmlformats.org/drawingml/2006/picture">
+                <pic:pic xmlns:pic="http://schemas.openxmlformats.org/drawingml/2006/picture">
+                  <pic:nvPicPr>
+                    <pic:cNvPr id="361361061" name="图片 1" descr="图形用户界面, 应用程序&#10;&#10;AI 生成的内容可能不正确。"/>
+                    <pic:cNvPicPr/>
+                  </pic:nvPicPr>
+                  <pic:blipFill>
+                    <a:blip r:embed="rId26"/>
+                    <a:stretch>
+                      <a:fillRect/>
+                    </a:stretch>
+                  </pic:blipFill>
+                  <pic:spPr>
+                    <a:xfrm>
+                      <a:off x="0" y="0"/>
+                      <a:ext cx="5323125" cy="3060826"/>
+                    </a:xfrm>
+                    <a:prstGeom prst="rect">
+                      <a:avLst/>
+                    </a:prstGeom>
+                  </pic:spPr>
+                </pic:pic>
+              </a:graphicData>
+            </a:graphic>
+          </wp:inline>
+        </w:drawing>
+      </w:r>
+    </w:p>
+    <w:p>
+      <w:pPr>
+        <w:rPr>
+          <w:rFonts w:ascii="Arial" w:hAnsi="Arial" w:cs="Arial"/>
+          <w:b/>
+          <w:bCs/>
+          <w:sz w:val="22"/>
+          <w:szCs w:val="22"/>
+        </w:rPr>
+      </w:pPr>
+      <w:r>
+        <w:rPr>
+          <w:noProof/>
+          <w14:ligatures w14:val="none"/>
+        </w:rPr>
+        <w:lastRenderedPageBreak/>
+        <w:drawing>
+          <wp:anchor distT="0" distB="0" distL="114300" distR="114300" simplePos="0" relativeHeight="251666432" behindDoc="0" locked="0" layoutInCell="1" allowOverlap="1" wp14:anchorId="23D48ECA" wp14:editId="261CA269">
+            <wp:simplePos x="0" y="0"/>
+            <wp:positionH relativeFrom="margin">
+              <wp:posOffset>-44450</wp:posOffset>
+            </wp:positionH>
+            <wp:positionV relativeFrom="paragraph">
+              <wp:posOffset>2984500</wp:posOffset>
+            </wp:positionV>
+            <wp:extent cx="4851400" cy="2892425"/>
+            <wp:effectExtent l="0" t="0" r="6350" b="3175"/>
+            <wp:wrapTopAndBottom/>
+            <wp:docPr id="1898829766" name="图片 1" descr="图形用户界面, 应用程序&#10;&#10;AI 生成的内容可能不正确。"/>
+            <wp:cNvGraphicFramePr>
+              <a:graphicFrameLocks xmlns:a="http://schemas.openxmlformats.org/drawingml/2006/main" noChangeAspect="1"/>
+            </wp:cNvGraphicFramePr>
+            <a:graphic xmlns:a="http://schemas.openxmlformats.org/drawingml/2006/main">
+              <a:graphicData uri="http://schemas.openxmlformats.org/drawingml/2006/picture">
+                <pic:pic xmlns:pic="http://schemas.openxmlformats.org/drawingml/2006/picture">
+                  <pic:nvPicPr>
+                    <pic:cNvPr id="1898829766" name="图片 1" descr="图形用户界面, 应用程序&#10;&#10;AI 生成的内容可能不正确。"/>
+                    <pic:cNvPicPr/>
+                  </pic:nvPicPr>
+                  <pic:blipFill>
+                    <a:blip r:embed="rId27" cstate="print">
+                      <a:extLst>
+                        <a:ext uri="{28A0092B-C50C-407E-A947-70E740481C1C}">
+                          <a14:useLocalDpi xmlns:a14="http://schemas.microsoft.com/office/drawing/2010/main" val="0"/>
+                        </a:ext>
+                      </a:extLst>
+                    </a:blip>
+                    <a:stretch>
+                      <a:fillRect/>
+                    </a:stretch>
+                  </pic:blipFill>
+                  <pic:spPr>
+                    <a:xfrm>
+                      <a:off x="0" y="0"/>
+                      <a:ext cx="4851400" cy="2892425"/>
+                    </a:xfrm>
+                    <a:prstGeom prst="rect">
+                      <a:avLst/>
+                    </a:prstGeom>
+                  </pic:spPr>
+                </pic:pic>
+              </a:graphicData>
+            </a:graphic>
+            <wp14:sizeRelH relativeFrom="margin">
+              <wp14:pctWidth>0</wp14:pctWidth>
+            </wp14:sizeRelH>
+            <wp14:sizeRelV relativeFrom="margin">
+              <wp14:pctHeight>0</wp14:pctHeight>
+            </wp14:sizeRelV>
+          </wp:anchor>
+        </w:drawing>
+      </w:r>
+      <w:r>
+        <w:rPr>
+          <w:noProof/>
+          <w14:ligatures w14:val="none"/>
+        </w:rPr>
+        <w:drawing>
+          <wp:anchor distT="0" distB="0" distL="114300" distR="114300" simplePos="0" relativeHeight="251665408" behindDoc="0" locked="0" layoutInCell="1" allowOverlap="1" wp14:anchorId="30598C0A" wp14:editId="3B437642">
+            <wp:simplePos x="0" y="0"/>
+            <wp:positionH relativeFrom="margin">
+              <wp:align>left</wp:align>
+            </wp:positionH>
+            <wp:positionV relativeFrom="paragraph">
+              <wp:posOffset>0</wp:posOffset>
+            </wp:positionV>
+            <wp:extent cx="4699000" cy="2753995"/>
+            <wp:effectExtent l="0" t="0" r="6350" b="8255"/>
+            <wp:wrapTopAndBottom/>
+            <wp:docPr id="245359366" name="图片 1" descr="图形用户界面&#10;&#10;AI 生成的内容可能不正确。"/>
+            <wp:cNvGraphicFramePr>
+              <a:graphicFrameLocks xmlns:a="http://schemas.openxmlformats.org/drawingml/2006/main" noChangeAspect="1"/>
+            </wp:cNvGraphicFramePr>
+            <a:graphic xmlns:a="http://schemas.openxmlformats.org/drawingml/2006/main">
+              <a:graphicData uri="http://schemas.openxmlformats.org/drawingml/2006/picture">
+                <pic:pic xmlns:pic="http://schemas.openxmlformats.org/drawingml/2006/picture">
+                  <pic:nvPicPr>
+                    <pic:cNvPr id="245359366" name="图片 1" descr="图形用户界面&#10;&#10;AI 生成的内容可能不正确。"/>
+                    <pic:cNvPicPr/>
+                  </pic:nvPicPr>
+                  <pic:blipFill>
+                    <a:blip r:embed="rId28" cstate="print">
+                      <a:extLst>
+                        <a:ext uri="{28A0092B-C50C-407E-A947-70E740481C1C}">
+                          <a14:useLocalDpi xmlns:a14="http://schemas.microsoft.com/office/drawing/2010/main" val="0"/>
+                        </a:ext>
+                      </a:extLst>
+                    </a:blip>
+                    <a:stretch>
+                      <a:fillRect/>
+                    </a:stretch>
+                  </pic:blipFill>
+                  <pic:spPr>
+                    <a:xfrm>
+                      <a:off x="0" y="0"/>
+                      <a:ext cx="4701541" cy="2756096"/>
+                    </a:xfrm>
+                    <a:prstGeom prst="rect">
+                      <a:avLst/>
+                    </a:prstGeom>
+                  </pic:spPr>
+                </pic:pic>
+              </a:graphicData>
+            </a:graphic>
+            <wp14:sizeRelH relativeFrom="margin">
+              <wp14:pctWidth>0</wp14:pctWidth>
+            </wp14:sizeRelH>
+            <wp14:sizeRelV relativeFrom="margin">
+              <wp14:pctHeight>0</wp14:pctHeight>
+            </wp14:sizeRelV>
+          </wp:anchor>
+        </w:drawing>
+      </w:r>
+      <w:r>
+        <w:rPr>
+          <w:rFonts w:ascii="Arial" w:hAnsi="Arial" w:cs="Arial" w:hint="eastAsia"/>
+          <w:b/>
+          <w:bCs/>
+          <w:sz w:val="22"/>
+          <w:szCs w:val="22"/>
+        </w:rPr>
+        <w:t>Manual data selected</w:t>
+      </w:r>
+    </w:p>
+    <w:p>
+      <w:pPr>
+        <w:rPr>
+          <w:rFonts w:ascii="Arial" w:hAnsi="Arial" w:cs="Arial"/>
+          <w:sz w:val="22"/>
+          <w:szCs w:val="22"/>
+        </w:rPr>
+      </w:pPr>
+      <w:r>
+        <w:rPr>
+          <w:noProof/>
+          <w14:ligatures w14:val="none"/>
+        </w:rPr>
+        <w:drawing>
+          <wp:anchor distT="0" distB="0" distL="114300" distR="114300" simplePos="0" relativeHeight="251667456" behindDoc="0" locked="0" layoutInCell="1" allowOverlap="1" wp14:anchorId="211FED45" wp14:editId="6D49976F">
+            <wp:simplePos x="0" y="0"/>
+            <wp:positionH relativeFrom="margin">
+              <wp:align>left</wp:align>
+            </wp:positionH>
+            <wp:positionV relativeFrom="paragraph">
+              <wp:posOffset>3001645</wp:posOffset>
+            </wp:positionV>
+            <wp:extent cx="4976495" cy="2794000"/>
+            <wp:effectExtent l="0" t="0" r="0" b="6350"/>
+            <wp:wrapTopAndBottom/>
+            <wp:docPr id="535841218" name="图片 1" descr="图表&#10;&#10;AI 生成的内容可能不正确。"/>
+            <wp:cNvGraphicFramePr>
+              <a:graphicFrameLocks xmlns:a="http://schemas.openxmlformats.org/drawingml/2006/main" noChangeAspect="1"/>
+            </wp:cNvGraphicFramePr>
+            <a:graphic xmlns:a="http://schemas.openxmlformats.org/drawingml/2006/main">
+              <a:graphicData uri="http://schemas.openxmlformats.org/drawingml/2006/picture">
+                <pic:pic xmlns:pic="http://schemas.openxmlformats.org/drawingml/2006/picture">
+                  <pic:nvPicPr>
+                    <pic:cNvPr id="535841218" name="图片 1" descr="图表&#10;&#10;AI 生成的内容可能不正确。"/>
+                    <pic:cNvPicPr/>
+                  </pic:nvPicPr>
+                  <pic:blipFill>
+                    <a:blip r:embed="rId29" cstate="print">
+                      <a:extLst>
+                        <a:ext uri="{28A0092B-C50C-407E-A947-70E740481C1C}">
+                          <a14:useLocalDpi xmlns:a14="http://schemas.microsoft.com/office/drawing/2010/main" val="0"/>
+                        </a:ext>
+                      </a:extLst>
+                    </a:blip>
+                    <a:stretch>
+                      <a:fillRect/>
+                    </a:stretch>
+                  </pic:blipFill>
+                  <pic:spPr>
+                    <a:xfrm>
+                      <a:off x="0" y="0"/>
+                      <a:ext cx="4976495" cy="2794000"/>
+                    </a:xfrm>
+                    <a:prstGeom prst="rect">
+                      <a:avLst/>
+                    </a:prstGeom>
+                  </pic:spPr>
+                </pic:pic>
+              </a:graphicData>
+            </a:graphic>
+          </wp:anchor>
+        </w:drawing>
+      </w:r>
+      <w:r>
+        <w:rPr>
+          <w:rFonts w:ascii="Arial" w:hAnsi="Arial" w:cs="Arial"/>
+          <w:sz w:val="22"/>
+          <w:szCs w:val="22"/>
+        </w:rPr>
+        <w:br w:type="page"/>
+      </w:r>
     </w:p>
     <w:p>
       <w:pPr>
@@ -2255,11 +3075,120 @@
       </w:pPr>
       <w:r>
         <w:rPr>
-          <w:rFonts w:ascii="Arial" w:hAnsi="Arial" w:cs="Arial"/>
-          <w:sz w:val="22"/>
-          <w:szCs w:val="22"/>
-        </w:rPr>
-        <w:br w:type="page"/>
+          <w:noProof/>
+          <w14:ligatures w14:val="none"/>
+        </w:rPr>
+        <w:lastRenderedPageBreak/>
+        <w:drawing>
+          <wp:anchor distT="0" distB="0" distL="114300" distR="114300" simplePos="0" relativeHeight="251668480" behindDoc="0" locked="0" layoutInCell="1" allowOverlap="1" wp14:anchorId="520D88E8" wp14:editId="7C3ADA07">
+            <wp:simplePos x="0" y="0"/>
+            <wp:positionH relativeFrom="column">
+              <wp:posOffset>-177800</wp:posOffset>
+            </wp:positionH>
+            <wp:positionV relativeFrom="paragraph">
+              <wp:posOffset>3587750</wp:posOffset>
+            </wp:positionV>
+            <wp:extent cx="5731510" cy="3265805"/>
+            <wp:effectExtent l="0" t="0" r="2540" b="0"/>
+            <wp:wrapTopAndBottom/>
+            <wp:docPr id="1919016752" name="图片 1" descr="图形用户界面, 文本&#10;&#10;AI 生成的内容可能不正确。"/>
+            <wp:cNvGraphicFramePr>
+              <a:graphicFrameLocks xmlns:a="http://schemas.openxmlformats.org/drawingml/2006/main" noChangeAspect="1"/>
+            </wp:cNvGraphicFramePr>
+            <a:graphic xmlns:a="http://schemas.openxmlformats.org/drawingml/2006/main">
+              <a:graphicData uri="http://schemas.openxmlformats.org/drawingml/2006/picture">
+                <pic:pic xmlns:pic="http://schemas.openxmlformats.org/drawingml/2006/picture">
+                  <pic:nvPicPr>
+                    <pic:cNvPr id="1919016752" name="图片 1" descr="图形用户界面, 文本&#10;&#10;AI 生成的内容可能不正确。"/>
+                    <pic:cNvPicPr/>
+                  </pic:nvPicPr>
+                  <pic:blipFill>
+                    <a:blip r:embed="rId30" cstate="print">
+                      <a:extLst>
+                        <a:ext uri="{28A0092B-C50C-407E-A947-70E740481C1C}">
+                          <a14:useLocalDpi xmlns:a14="http://schemas.microsoft.com/office/drawing/2010/main" val="0"/>
+                        </a:ext>
+                      </a:extLst>
+                    </a:blip>
+                    <a:stretch>
+                      <a:fillRect/>
+                    </a:stretch>
+                  </pic:blipFill>
+                  <pic:spPr>
+                    <a:xfrm>
+                      <a:off x="0" y="0"/>
+                      <a:ext cx="5731510" cy="3265805"/>
+                    </a:xfrm>
+                    <a:prstGeom prst="rect">
+                      <a:avLst/>
+                    </a:prstGeom>
+                  </pic:spPr>
+                </pic:pic>
+              </a:graphicData>
+            </a:graphic>
+          </wp:anchor>
+        </w:drawing>
+      </w:r>
+      <w:r>
+        <w:rPr>
+          <w:noProof/>
+          <w14:ligatures w14:val="none"/>
+        </w:rPr>
+        <w:drawing>
+          <wp:anchor distT="0" distB="0" distL="114300" distR="114300" simplePos="0" relativeHeight="251669504" behindDoc="0" locked="0" layoutInCell="1" allowOverlap="1" wp14:anchorId="732EE010" wp14:editId="3B4FB761">
+            <wp:simplePos x="0" y="0"/>
+            <wp:positionH relativeFrom="margin">
+              <wp:posOffset>31750</wp:posOffset>
+            </wp:positionH>
+            <wp:positionV relativeFrom="paragraph">
+              <wp:posOffset>374650</wp:posOffset>
+            </wp:positionV>
+            <wp:extent cx="5774055" cy="3016250"/>
+            <wp:effectExtent l="0" t="0" r="0" b="0"/>
+            <wp:wrapTopAndBottom/>
+            <wp:docPr id="1186276494" name="图片 1" descr="图形用户界面, 文本, 应用程序, 电子邮件&#10;&#10;AI 生成的内容可能不正确。"/>
+            <wp:cNvGraphicFramePr>
+              <a:graphicFrameLocks xmlns:a="http://schemas.openxmlformats.org/drawingml/2006/main" noChangeAspect="1"/>
+            </wp:cNvGraphicFramePr>
+            <a:graphic xmlns:a="http://schemas.openxmlformats.org/drawingml/2006/main">
+              <a:graphicData uri="http://schemas.openxmlformats.org/drawingml/2006/picture">
+                <pic:pic xmlns:pic="http://schemas.openxmlformats.org/drawingml/2006/picture">
+                  <pic:nvPicPr>
+                    <pic:cNvPr id="1186276494" name="图片 1" descr="图形用户界面, 文本, 应用程序, 电子邮件&#10;&#10;AI 生成的内容可能不正确。"/>
+                    <pic:cNvPicPr/>
+                  </pic:nvPicPr>
+                  <pic:blipFill>
+                    <a:blip r:embed="rId31" cstate="print">
+                      <a:extLst>
+                        <a:ext uri="{28A0092B-C50C-407E-A947-70E740481C1C}">
+                          <a14:useLocalDpi xmlns:a14="http://schemas.microsoft.com/office/drawing/2010/main" val="0"/>
+                        </a:ext>
+                      </a:extLst>
+                    </a:blip>
+                    <a:stretch>
+                      <a:fillRect/>
+                    </a:stretch>
+                  </pic:blipFill>
+                  <pic:spPr>
+                    <a:xfrm>
+                      <a:off x="0" y="0"/>
+                      <a:ext cx="5774055" cy="3016250"/>
+                    </a:xfrm>
+                    <a:prstGeom prst="rect">
+                      <a:avLst/>
+                    </a:prstGeom>
+                  </pic:spPr>
+                </pic:pic>
+              </a:graphicData>
+            </a:graphic>
+            <wp14:sizeRelH relativeFrom="margin">
+              <wp14:pctWidth>0</wp14:pctWidth>
+            </wp14:sizeRelH>
+            <wp14:sizeRelV relativeFrom="margin">
+              <wp14:pctHeight>0</wp14:pctHeight>
+            </wp14:sizeRelV>
+          </wp:anchor>
+        </w:drawing>
       </w:r>
       <w:r>
         <w:rPr>
@@ -2270,7 +3199,6 @@
           <w:szCs w:val="22"/>
           <w:u w:val="single"/>
         </w:rPr>
-        <w:lastRenderedPageBreak/>
         <w:t>Screenshots of version control or development logs (if applicable)</w:t>
       </w:r>
     </w:p>
@@ -2282,7 +3210,7 @@
       </w:pPr>
     </w:p>
     <w:sectPr>
-      <w:headerReference w:type="default" r:id="rId15"/>
+      <w:headerReference w:type="default" r:id="rId32"/>
       <w:pgSz w:w="11906" w:h="16838"/>
       <w:pgMar w:top="1440" w:right="1440" w:bottom="1440" w:left="1440" w:header="720" w:footer="720" w:gutter="0"/>
       <w:cols w:space="720"/>
@@ -2297,7 +3225,7 @@
   <w:endnote w:type="separator" w:id="-1">
     <w:p>
       <w:pPr>
-        <w:spacing w:after="0" w:line="240" w:lineRule="auto"/>
+        <w:spacing w:line="240" w:lineRule="auto"/>
       </w:pPr>
       <w:r>
         <w:separator/>
@@ -2307,7 +3235,7 @@
   <w:endnote w:type="continuationSeparator" w:id="0">
     <w:p>
       <w:pPr>
-        <w:spacing w:after="0" w:line="240" w:lineRule="auto"/>
+        <w:spacing w:line="240" w:lineRule="auto"/>
       </w:pPr>
       <w:r>
         <w:continuationSeparator/>
@@ -2322,7 +3250,7 @@
   <w:footnote w:type="separator" w:id="-1">
     <w:p>
       <w:pPr>
-        <w:spacing w:after="0" w:line="240" w:lineRule="auto"/>
+        <w:spacing w:after="0"/>
       </w:pPr>
       <w:r>
         <w:separator/>
@@ -2332,7 +3260,7 @@
   <w:footnote w:type="continuationSeparator" w:id="0">
     <w:p>
       <w:pPr>
-        <w:spacing w:after="0" w:line="240" w:lineRule="auto"/>
+        <w:spacing w:after="0"/>
       </w:pPr>
       <w:r>
         <w:continuationSeparator/>
@@ -2346,7 +3274,7 @@
 <w:hdr xmlns:wpc="http://schemas.microsoft.com/office/word/2010/wordprocessingCanvas" xmlns:cx="http://schemas.microsoft.com/office/drawing/2014/chartex" xmlns:cx1="http://schemas.microsoft.com/office/drawing/2015/9/8/chartex" xmlns:cx2="http://schemas.microsoft.com/office/drawing/2015/10/21/chartex" xmlns:cx3="http://schemas.microsoft.com/office/drawing/2016/5/9/chartex" xmlns:cx4="http://schemas.microsoft.com/office/drawing/2016/5/10/chartex" xmlns:cx5="http://schemas.microsoft.com/office/drawing/2016/5/11/chartex" xmlns:cx6="http://schemas.microsoft.com/office/drawing/2016/5/12/chartex" xmlns:cx7="http://schemas.microsoft.com/office/drawing/2016/5/13/chartex" xmlns:cx8="http://schemas.microsoft.com/office/drawing/2016/5/14/chartex" xmlns:mc="http://schemas.openxmlformats.org/markup-compatibility/2006" xmlns:aink="http://schemas.microsoft.com/office/drawing/2016/ink" xmlns:am3d="http://schemas.microsoft.com/office/drawing/2017/model3d" xmlns:o="urn:schemas-microsoft-com:office:office" xmlns:oel="http://schemas.microsoft.com/office/2019/extlst" xmlns:r="http://schemas.openxmlformats.org/officeDocument/2006/relationships" xmlns:m="http://schemas.openxmlformats.org/officeDocument/2006/math" xmlns:v="urn:schemas-microsoft-com:vml" xmlns:wp14="http://schemas.microsoft.com/office/word/2010/wordprocessingDrawing" xmlns:wp="http://schemas.openxmlformats.org/drawingml/2006/wordprocessingDrawing" xmlns:w10="urn:schemas-microsoft-com:office:word" xmlns:w="http://schemas.openxmlformats.org/wordprocessingml/2006/main" xmlns:w14="http://schemas.microsoft.com/office/word/2010/wordml" xmlns:w15="http://schemas.microsoft.com/office/word/2012/wordml" xmlns:w16cex="http://schemas.microsoft.com/office/word/2018/wordml/cex" xmlns:w16cid="http://schemas.microsoft.com/office/word/2016/wordml/cid" xmlns:w16="http://schemas.microsoft.com/office/word/2018/wordml" xmlns:w16du="http://schemas.microsoft.com/office/word/2023/wordml/word16du" xmlns:w16sdtdh="http://schemas.microsoft.com/office/word/2020/wordml/sdtdatahash" xmlns:w16sdtfl="http://schemas.microsoft.com/office/word/2024/wordml/sdtformatlock" xmlns:w16se="http://schemas.microsoft.com/office/word/2015/wordml/symex" xmlns:wpg="http://schemas.microsoft.com/office/word/2010/wordprocessingGroup" xmlns:wpi="http://schemas.microsoft.com/office/word/2010/wordprocessingInk" xmlns:wne="http://schemas.microsoft.com/office/word/2006/wordml" xmlns:wps="http://schemas.microsoft.com/office/word/2010/wordprocessingShape" mc:Ignorable="w14 w15 w16se w16cid w16 w16cex w16sdtdh w16sdtfl w16du wp14">
   <w:p>
     <w:pPr>
-      <w:pStyle w:val="Header"/>
+      <w:pStyle w:val="a7"/>
       <w:rPr>
         <w:lang w:val="en-US"/>
       </w:rPr>
@@ -2359,7 +3287,7 @@
       <mc:AlternateContent>
         <mc:Choice Requires="wps">
           <w:drawing>
-            <wp:anchor distT="0" distB="0" distL="114300" distR="114300" simplePos="0" relativeHeight="251658240" behindDoc="0" locked="0" layoutInCell="1" allowOverlap="1" wp14:anchorId="10122656" wp14:editId="23935A75">
+            <wp:anchor distT="0" distB="0" distL="114300" distR="114300" simplePos="0" relativeHeight="251659264" behindDoc="0" locked="0" layoutInCell="1" allowOverlap="1" wp14:anchorId="4FDE7D0A" wp14:editId="256FC8B1">
               <wp:simplePos x="0" y="0"/>
               <wp:positionH relativeFrom="column">
                 <wp:posOffset>-411480</wp:posOffset>
@@ -2403,23 +3331,22 @@
                       </a:fontRef>
                     </wps:style>
                     <wps:bodyPr rot="0" spcFirstLastPara="0" vertOverflow="overflow" horzOverflow="overflow" vert="horz" wrap="square" lIns="91440" tIns="45720" rIns="91440" bIns="45720" numCol="1" spcCol="0" rtlCol="0" fromWordArt="0" anchor="ctr" anchorCtr="0" forceAA="0" compatLnSpc="1">
-                      <a:prstTxWarp prst="textNoShape">
-                        <a:avLst/>
-                      </a:prstTxWarp>
                       <a:noAutofit/>
                     </wps:bodyPr>
                   </wps:wsp>
                 </a:graphicData>
               </a:graphic>
-              <wp14:sizeRelV relativeFrom="margin">
-                <wp14:pctHeight>0</wp14:pctHeight>
-              </wp14:sizeRelV>
             </wp:anchor>
           </w:drawing>
         </mc:Choice>
-        <mc:Fallback>
+        <mc:Fallback xmlns:wpsCustomData="http://www.wps.cn/officeDocument/2013/wpsCustomData">
           <w:pict>
-            <v:rect w14:anchorId="3769B7F9" id="Rectangle 6" o:spid="_x0000_s1026" style="position:absolute;margin-left:-32.4pt;margin-top:9.6pt;width:513.6pt;height:747.6pt;z-index:251659264;visibility:visible;mso-wrap-style:square;mso-height-percent:0;mso-wrap-distance-left:9pt;mso-wrap-distance-top:0;mso-wrap-distance-right:9pt;mso-wrap-distance-bottom:0;mso-position-horizontal:absolute;mso-position-horizontal-relative:text;mso-position-vertical:absolute;mso-position-vertical-relative:text;mso-height-percent:0;mso-height-relative:margin;v-text-anchor:middle" o:gfxdata="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" filled="f" strokecolor="#030e13 [484]" strokeweight="1.5pt"/>
+            <v:rect id="Rectangle 6" o:spid="_x0000_s1026" o:spt="1" style="position:absolute;left:0pt;margin-left:-32.4pt;margin-top:9.6pt;height:747.6pt;width:513.6pt;z-index:251659264;v-text-anchor:middle;mso-width-relative:page;mso-height-relative:page;" filled="f" stroked="t" coordsize="21600,21600" o:gfxdata="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">
+              <v:fill on="f" focussize="0,0"/>
+              <v:stroke weight="1.5pt" color="#042433 [3204]" miterlimit="8" joinstyle="miter"/>
+              <v:imagedata o:title=""/>
+              <o:lock v:ext="edit" aspectratio="f"/>
+            </v:rect>
           </w:pict>
         </mc:Fallback>
       </mc:AlternateContent>
@@ -2432,7 +3359,7 @@
 <w:hdr xmlns:wpc="http://schemas.microsoft.com/office/word/2010/wordprocessingCanvas" xmlns:cx="http://schemas.microsoft.com/office/drawing/2014/chartex" xmlns:cx1="http://schemas.microsoft.com/office/drawing/2015/9/8/chartex" xmlns:cx2="http://schemas.microsoft.com/office/drawing/2015/10/21/chartex" xmlns:cx3="http://schemas.microsoft.com/office/drawing/2016/5/9/chartex" xmlns:cx4="http://schemas.microsoft.com/office/drawing/2016/5/10/chartex" xmlns:cx5="http://schemas.microsoft.com/office/drawing/2016/5/11/chartex" xmlns:cx6="http://schemas.microsoft.com/office/drawing/2016/5/12/chartex" xmlns:cx7="http://schemas.microsoft.com/office/drawing/2016/5/13/chartex" xmlns:cx8="http://schemas.microsoft.com/office/drawing/2016/5/14/chartex" xmlns:mc="http://schemas.openxmlformats.org/markup-compatibility/2006" xmlns:aink="http://schemas.microsoft.com/office/drawing/2016/ink" xmlns:am3d="http://schemas.microsoft.com/office/drawing/2017/model3d" xmlns:o="urn:schemas-microsoft-com:office:office" xmlns:oel="http://schemas.microsoft.com/office/2019/extlst" xmlns:r="http://schemas.openxmlformats.org/officeDocument/2006/relationships" xmlns:m="http://schemas.openxmlformats.org/officeDocument/2006/math" xmlns:v="urn:schemas-microsoft-com:vml" xmlns:wp14="http://schemas.microsoft.com/office/word/2010/wordprocessingDrawing" xmlns:wp="http://schemas.openxmlformats.org/drawingml/2006/wordprocessingDrawing" xmlns:w10="urn:schemas-microsoft-com:office:word" xmlns:w="http://schemas.openxmlformats.org/wordprocessingml/2006/main" xmlns:w14="http://schemas.microsoft.com/office/word/2010/wordml" xmlns:w15="http://schemas.microsoft.com/office/word/2012/wordml" xmlns:w16cex="http://schemas.microsoft.com/office/word/2018/wordml/cex" xmlns:w16cid="http://schemas.microsoft.com/office/word/2016/wordml/cid" xmlns:w16="http://schemas.microsoft.com/office/word/2018/wordml" xmlns:w16du="http://schemas.microsoft.com/office/word/2023/wordml/word16du" xmlns:w16sdtdh="http://schemas.microsoft.com/office/word/2020/wordml/sdtdatahash" xmlns:w16sdtfl="http://schemas.microsoft.com/office/word/2024/wordml/sdtformatlock" xmlns:w16se="http://schemas.microsoft.com/office/word/2015/wordml/symex" xmlns:wpg="http://schemas.microsoft.com/office/word/2010/wordprocessingGroup" xmlns:wpi="http://schemas.microsoft.com/office/word/2010/wordprocessingInk" xmlns:wne="http://schemas.microsoft.com/office/word/2006/wordml" xmlns:wps="http://schemas.microsoft.com/office/word/2010/wordprocessingShape" mc:Ignorable="w14 w15 w16se w16cid w16 w16cex w16sdtdh w16sdtfl w16du wp14">
   <w:p>
     <w:pPr>
-      <w:pStyle w:val="Header"/>
+      <w:pStyle w:val="a7"/>
       <w:rPr>
         <w:lang w:val="en-US"/>
       </w:rPr>
@@ -2445,9 +3372,9 @@
 <w:numbering xmlns:wpc="http://schemas.microsoft.com/office/word/2010/wordprocessingCanvas" xmlns:cx="http://schemas.microsoft.com/office/drawing/2014/chartex" xmlns:cx1="http://schemas.microsoft.com/office/drawing/2015/9/8/chartex" xmlns:cx2="http://schemas.microsoft.com/office/drawing/2015/10/21/chartex" xmlns:cx3="http://schemas.microsoft.com/office/drawing/2016/5/9/chartex" xmlns:cx4="http://schemas.microsoft.com/office/drawing/2016/5/10/chartex" xmlns:cx5="http://schemas.microsoft.com/office/drawing/2016/5/11/chartex" xmlns:cx6="http://schemas.microsoft.com/office/drawing/2016/5/12/chartex" xmlns:cx7="http://schemas.microsoft.com/office/drawing/2016/5/13/chartex" xmlns:cx8="http://schemas.microsoft.com/office/drawing/2016/5/14/chartex" xmlns:mc="http://schemas.openxmlformats.org/markup-compatibility/2006" xmlns:aink="http://schemas.microsoft.com/office/drawing/2016/ink" xmlns:am3d="http://schemas.microsoft.com/office/drawing/2017/model3d" xmlns:o="urn:schemas-microsoft-com:office:office" xmlns:oel="http://schemas.microsoft.com/office/2019/extlst" xmlns:r="http://schemas.openxmlformats.org/officeDocument/2006/relationships" xmlns:m="http://schemas.openxmlformats.org/officeDocument/2006/math" xmlns:v="urn:schemas-microsoft-com:vml" xmlns:wp14="http://schemas.microsoft.com/office/word/2010/wordprocessingDrawing" xmlns:wp="http://schemas.openxmlformats.org/drawingml/2006/wordprocessingDrawing" xmlns:w10="urn:schemas-microsoft-com:office:word" xmlns:w="http://schemas.openxmlformats.org/wordprocessingml/2006/main" xmlns:w14="http://schemas.microsoft.com/office/word/2010/wordml" xmlns:w15="http://schemas.microsoft.com/office/word/2012/wordml" xmlns:w16cex="http://schemas.microsoft.com/office/word/2018/wordml/cex" xmlns:w16cid="http://schemas.microsoft.com/office/word/2016/wordml/cid" xmlns:w16="http://schemas.microsoft.com/office/word/2018/wordml" xmlns:w16du="http://schemas.microsoft.com/office/word/2023/wordml/word16du" xmlns:w16sdtdh="http://schemas.microsoft.com/office/word/2020/wordml/sdtdatahash" xmlns:w16sdtfl="http://schemas.microsoft.com/office/word/2024/wordml/sdtformatlock" xmlns:w16se="http://schemas.microsoft.com/office/word/2015/wordml/symex" xmlns:wpg="http://schemas.microsoft.com/office/word/2010/wordprocessingGroup" xmlns:wpi="http://schemas.microsoft.com/office/word/2010/wordprocessingInk" xmlns:wne="http://schemas.microsoft.com/office/word/2006/wordml" xmlns:wps="http://schemas.microsoft.com/office/word/2010/wordprocessingShape" mc:Ignorable="w14 w15 w16se w16cid w16 w16cex w16sdtdh w16sdtfl w16du wp14">
   <w:abstractNum w:abstractNumId="0" w15:restartNumberingAfterBreak="0">
     <w:nsid w:val="34F56372"/>
-    <w:multiLevelType w:val="hybridMultilevel"/>
-    <w:tmpl w:val="D540869E"/>
-    <w:lvl w:ilvl="0" w:tplc="48090001">
+    <w:multiLevelType w:val="multilevel"/>
+    <w:tmpl w:val="34F56372"/>
+    <w:lvl w:ilvl="0">
       <w:start w:val="1"/>
       <w:numFmt w:val="bullet"/>
       <w:lvlText w:val=""/>
@@ -2459,7 +3386,7 @@
         <w:rFonts w:ascii="Symbol" w:hAnsi="Symbol" w:hint="default"/>
       </w:rPr>
     </w:lvl>
-    <w:lvl w:ilvl="1" w:tplc="04090003" w:tentative="1">
+    <w:lvl w:ilvl="1">
       <w:start w:val="1"/>
       <w:numFmt w:val="bullet"/>
       <w:lvlText w:val="o"/>
@@ -2471,7 +3398,7 @@
         <w:rFonts w:ascii="Courier New" w:hAnsi="Courier New" w:cs="Courier New" w:hint="default"/>
       </w:rPr>
     </w:lvl>
-    <w:lvl w:ilvl="2" w:tplc="04090005" w:tentative="1">
+    <w:lvl w:ilvl="2">
       <w:start w:val="1"/>
       <w:numFmt w:val="bullet"/>
       <w:lvlText w:val=""/>
@@ -2483,7 +3410,7 @@
         <w:rFonts w:ascii="Wingdings" w:hAnsi="Wingdings" w:hint="default"/>
       </w:rPr>
     </w:lvl>
-    <w:lvl w:ilvl="3" w:tplc="04090001" w:tentative="1">
+    <w:lvl w:ilvl="3">
       <w:start w:val="1"/>
       <w:numFmt w:val="bullet"/>
       <w:lvlText w:val=""/>
@@ -2495,7 +3422,7 @@
         <w:rFonts w:ascii="Symbol" w:hAnsi="Symbol" w:hint="default"/>
       </w:rPr>
     </w:lvl>
-    <w:lvl w:ilvl="4" w:tplc="04090003" w:tentative="1">
+    <w:lvl w:ilvl="4">
       <w:start w:val="1"/>
       <w:numFmt w:val="bullet"/>
       <w:lvlText w:val="o"/>
@@ -2507,7 +3434,7 @@
         <w:rFonts w:ascii="Courier New" w:hAnsi="Courier New" w:cs="Courier New" w:hint="default"/>
       </w:rPr>
     </w:lvl>
-    <w:lvl w:ilvl="5" w:tplc="04090005" w:tentative="1">
+    <w:lvl w:ilvl="5">
       <w:start w:val="1"/>
       <w:numFmt w:val="bullet"/>
       <w:lvlText w:val=""/>
@@ -2519,7 +3446,7 @@
         <w:rFonts w:ascii="Wingdings" w:hAnsi="Wingdings" w:hint="default"/>
       </w:rPr>
     </w:lvl>
-    <w:lvl w:ilvl="6" w:tplc="04090001" w:tentative="1">
+    <w:lvl w:ilvl="6">
       <w:start w:val="1"/>
       <w:numFmt w:val="bullet"/>
       <w:lvlText w:val=""/>
@@ -2531,7 +3458,7 @@
         <w:rFonts w:ascii="Symbol" w:hAnsi="Symbol" w:hint="default"/>
       </w:rPr>
     </w:lvl>
-    <w:lvl w:ilvl="7" w:tplc="04090003" w:tentative="1">
+    <w:lvl w:ilvl="7">
       <w:start w:val="1"/>
       <w:numFmt w:val="bullet"/>
       <w:lvlText w:val="o"/>
@@ -2543,7 +3470,7 @@
         <w:rFonts w:ascii="Courier New" w:hAnsi="Courier New" w:cs="Courier New" w:hint="default"/>
       </w:rPr>
     </w:lvl>
-    <w:lvl w:ilvl="8" w:tplc="04090005" w:tentative="1">
+    <w:lvl w:ilvl="8">
       <w:start w:val="1"/>
       <w:numFmt w:val="bullet"/>
       <w:lvlText w:val=""/>
@@ -2556,7 +3483,7 @@
       </w:rPr>
     </w:lvl>
   </w:abstractNum>
-  <w:num w:numId="1" w16cid:durableId="2131702900">
+  <w:num w:numId="1" w16cid:durableId="1926375194">
     <w:abstractNumId w:val="0"/>
   </w:num>
 </w:numbering>
@@ -2568,18 +3495,10 @@
     <w:rPrDefault>
       <w:rPr>
         <w:rFonts w:asciiTheme="minorHAnsi" w:eastAsiaTheme="minorEastAsia" w:hAnsiTheme="minorHAnsi" w:cstheme="minorBidi"/>
-        <w:kern w:val="2"/>
-        <w:sz w:val="24"/>
-        <w:szCs w:val="24"/>
-        <w:lang w:val="en-SG" w:eastAsia="zh-CN" w:bidi="ar-SA"/>
-        <w14:ligatures w14:val="standardContextual"/>
+        <w:lang w:val="en-US" w:eastAsia="zh-CN" w:bidi="ar-SA"/>
       </w:rPr>
     </w:rPrDefault>
-    <w:pPrDefault>
-      <w:pPr>
-        <w:spacing w:after="160" w:line="278" w:lineRule="auto"/>
-      </w:pPr>
-    </w:pPrDefault>
+    <w:pPrDefault/>
   </w:docDefaults>
   <w:latentStyles w:defLockedState="0" w:defUIPriority="99" w:defSemiHidden="0" w:defUnhideWhenUsed="0" w:defQFormat="0" w:count="376">
     <w:lsdException w:name="Normal" w:uiPriority="0" w:qFormat="1"/>
@@ -2612,9 +3531,9 @@
     <w:lsdException w:name="toc 9" w:semiHidden="1" w:uiPriority="39" w:unhideWhenUsed="1"/>
     <w:lsdException w:name="Normal Indent" w:semiHidden="1" w:unhideWhenUsed="1"/>
     <w:lsdException w:name="footnote text" w:semiHidden="1" w:unhideWhenUsed="1"/>
-    <w:lsdException w:name="annotation text" w:semiHidden="1" w:unhideWhenUsed="1"/>
-    <w:lsdException w:name="header" w:semiHidden="1" w:unhideWhenUsed="1"/>
-    <w:lsdException w:name="footer" w:semiHidden="1" w:unhideWhenUsed="1"/>
+    <w:lsdException w:name="annotation text" w:unhideWhenUsed="1"/>
+    <w:lsdException w:name="header" w:unhideWhenUsed="1"/>
+    <w:lsdException w:name="footer" w:unhideWhenUsed="1"/>
     <w:lsdException w:name="index heading" w:semiHidden="1" w:unhideWhenUsed="1"/>
     <w:lsdException w:name="caption" w:semiHidden="1" w:uiPriority="35" w:unhideWhenUsed="1" w:qFormat="1"/>
     <w:lsdException w:name="table of figures" w:semiHidden="1" w:unhideWhenUsed="1"/>
@@ -2738,8 +3657,8 @@
     <w:lsdException w:name="Balloon Text" w:semiHidden="1" w:unhideWhenUsed="1"/>
     <w:lsdException w:name="Table Grid" w:uiPriority="39"/>
     <w:lsdException w:name="Table Theme" w:semiHidden="1" w:unhideWhenUsed="1"/>
-    <w:lsdException w:name="Placeholder Text" w:semiHidden="1"/>
-    <w:lsdException w:name="No Spacing" w:uiPriority="1" w:qFormat="1"/>
+    <w:lsdException w:name="Placeholder Text" w:semiHidden="1" w:unhideWhenUsed="1"/>
+    <w:lsdException w:name="No Spacing" w:semiHidden="1" w:unhideWhenUsed="1"/>
     <w:lsdException w:name="Light Shading" w:uiPriority="60"/>
     <w:lsdException w:name="Light List" w:uiPriority="61"/>
     <w:lsdException w:name="Light Grid" w:uiPriority="62"/>
@@ -2760,7 +3679,7 @@
     <w:lsdException w:name="Medium Shading 1 Accent 1" w:uiPriority="63"/>
     <w:lsdException w:name="Medium Shading 2 Accent 1" w:uiPriority="64"/>
     <w:lsdException w:name="Medium List 1 Accent 1" w:uiPriority="65"/>
-    <w:lsdException w:name="Revision" w:semiHidden="1"/>
+    <w:lsdException w:name="Revision" w:semiHidden="1" w:unhideWhenUsed="1"/>
     <w:lsdException w:name="List Paragraph" w:uiPriority="34" w:qFormat="1"/>
     <w:lsdException w:name="Quote" w:uiPriority="29" w:qFormat="1"/>
     <w:lsdException w:name="Intense Quote" w:uiPriority="30" w:qFormat="1"/>
@@ -2959,18 +3878,28 @@
     <w:lsdException w:name="Unresolved Mention" w:semiHidden="1" w:unhideWhenUsed="1"/>
     <w:lsdException w:name="Smart Link" w:semiHidden="1" w:unhideWhenUsed="1"/>
   </w:latentStyles>
-  <w:style w:type="paragraph" w:default="1" w:styleId="Normal">
+  <w:style w:type="paragraph" w:default="1" w:styleId="a">
     <w:name w:val="Normal"/>
     <w:qFormat/>
+    <w:rsid w:val="00DC4A2E"/>
+    <w:pPr>
+      <w:spacing w:after="160" w:line="278" w:lineRule="auto"/>
+    </w:pPr>
+    <w:rPr>
+      <w:kern w:val="2"/>
+      <w:sz w:val="24"/>
+      <w:szCs w:val="24"/>
+      <w:lang w:val="en-SG"/>
+      <w14:ligatures w14:val="standardContextual"/>
+    </w:rPr>
   </w:style>
-  <w:style w:type="paragraph" w:styleId="Heading1">
+  <w:style w:type="paragraph" w:styleId="1">
     <w:name w:val="heading 1"/>
-    <w:basedOn w:val="Normal"/>
-    <w:next w:val="Normal"/>
-    <w:link w:val="Heading1Char"/>
+    <w:basedOn w:val="a"/>
+    <w:next w:val="a"/>
+    <w:link w:val="10"/>
     <w:uiPriority w:val="9"/>
     <w:qFormat/>
-    <w:rsid w:val="00B67A4B"/>
     <w:pPr>
       <w:keepNext/>
       <w:keepLines/>
@@ -2984,16 +3913,15 @@
       <w:szCs w:val="40"/>
     </w:rPr>
   </w:style>
-  <w:style w:type="paragraph" w:styleId="Heading2">
+  <w:style w:type="paragraph" w:styleId="2">
     <w:name w:val="heading 2"/>
-    <w:basedOn w:val="Normal"/>
-    <w:next w:val="Normal"/>
-    <w:link w:val="Heading2Char"/>
+    <w:basedOn w:val="a"/>
+    <w:next w:val="a"/>
+    <w:link w:val="20"/>
     <w:uiPriority w:val="9"/>
     <w:semiHidden/>
     <w:unhideWhenUsed/>
     <w:qFormat/>
-    <w:rsid w:val="00B67A4B"/>
     <w:pPr>
       <w:keepNext/>
       <w:keepLines/>
@@ -3007,16 +3935,15 @@
       <w:szCs w:val="32"/>
     </w:rPr>
   </w:style>
-  <w:style w:type="paragraph" w:styleId="Heading3">
+  <w:style w:type="paragraph" w:styleId="3">
     <w:name w:val="heading 3"/>
-    <w:basedOn w:val="Normal"/>
-    <w:next w:val="Normal"/>
-    <w:link w:val="Heading3Char"/>
+    <w:basedOn w:val="a"/>
+    <w:next w:val="a"/>
+    <w:link w:val="30"/>
     <w:uiPriority w:val="9"/>
     <w:semiHidden/>
     <w:unhideWhenUsed/>
     <w:qFormat/>
-    <w:rsid w:val="00B67A4B"/>
     <w:pPr>
       <w:keepNext/>
       <w:keepLines/>
@@ -3030,16 +3957,15 @@
       <w:szCs w:val="28"/>
     </w:rPr>
   </w:style>
-  <w:style w:type="paragraph" w:styleId="Heading4">
+  <w:style w:type="paragraph" w:styleId="4">
     <w:name w:val="heading 4"/>
-    <w:basedOn w:val="Normal"/>
-    <w:next w:val="Normal"/>
-    <w:link w:val="Heading4Char"/>
+    <w:basedOn w:val="a"/>
+    <w:next w:val="a"/>
+    <w:link w:val="40"/>
     <w:uiPriority w:val="9"/>
     <w:semiHidden/>
     <w:unhideWhenUsed/>
     <w:qFormat/>
-    <w:rsid w:val="00B67A4B"/>
     <w:pPr>
       <w:keepNext/>
       <w:keepLines/>
@@ -3053,16 +3979,15 @@
       <w:color w:val="0F4761" w:themeColor="accent1" w:themeShade="BF"/>
     </w:rPr>
   </w:style>
-  <w:style w:type="paragraph" w:styleId="Heading5">
+  <w:style w:type="paragraph" w:styleId="5">
     <w:name w:val="heading 5"/>
-    <w:basedOn w:val="Normal"/>
-    <w:next w:val="Normal"/>
-    <w:link w:val="Heading5Char"/>
+    <w:basedOn w:val="a"/>
+    <w:next w:val="a"/>
+    <w:link w:val="50"/>
     <w:uiPriority w:val="9"/>
     <w:semiHidden/>
     <w:unhideWhenUsed/>
     <w:qFormat/>
-    <w:rsid w:val="00B67A4B"/>
     <w:pPr>
       <w:keepNext/>
       <w:keepLines/>
@@ -3074,16 +3999,15 @@
       <w:color w:val="0F4761" w:themeColor="accent1" w:themeShade="BF"/>
     </w:rPr>
   </w:style>
-  <w:style w:type="paragraph" w:styleId="Heading6">
+  <w:style w:type="paragraph" w:styleId="6">
     <w:name w:val="heading 6"/>
-    <w:basedOn w:val="Normal"/>
-    <w:next w:val="Normal"/>
-    <w:link w:val="Heading6Char"/>
+    <w:basedOn w:val="a"/>
+    <w:next w:val="a"/>
+    <w:link w:val="60"/>
     <w:uiPriority w:val="9"/>
     <w:semiHidden/>
     <w:unhideWhenUsed/>
     <w:qFormat/>
-    <w:rsid w:val="00B67A4B"/>
     <w:pPr>
       <w:keepNext/>
       <w:keepLines/>
@@ -3097,16 +4021,15 @@
       <w:color w:val="595959" w:themeColor="text1" w:themeTint="A6"/>
     </w:rPr>
   </w:style>
-  <w:style w:type="paragraph" w:styleId="Heading7">
+  <w:style w:type="paragraph" w:styleId="7">
     <w:name w:val="heading 7"/>
-    <w:basedOn w:val="Normal"/>
-    <w:next w:val="Normal"/>
-    <w:link w:val="Heading7Char"/>
+    <w:basedOn w:val="a"/>
+    <w:next w:val="a"/>
+    <w:link w:val="70"/>
     <w:uiPriority w:val="9"/>
     <w:semiHidden/>
     <w:unhideWhenUsed/>
     <w:qFormat/>
-    <w:rsid w:val="00B67A4B"/>
     <w:pPr>
       <w:keepNext/>
       <w:keepLines/>
@@ -3118,16 +4041,15 @@
       <w:color w:val="595959" w:themeColor="text1" w:themeTint="A6"/>
     </w:rPr>
   </w:style>
-  <w:style w:type="paragraph" w:styleId="Heading8">
+  <w:style w:type="paragraph" w:styleId="8">
     <w:name w:val="heading 8"/>
-    <w:basedOn w:val="Normal"/>
-    <w:next w:val="Normal"/>
-    <w:link w:val="Heading8Char"/>
+    <w:basedOn w:val="a"/>
+    <w:next w:val="a"/>
+    <w:link w:val="80"/>
     <w:uiPriority w:val="9"/>
     <w:semiHidden/>
     <w:unhideWhenUsed/>
     <w:qFormat/>
-    <w:rsid w:val="00B67A4B"/>
     <w:pPr>
       <w:keepNext/>
       <w:keepLines/>
@@ -3138,19 +4060,18 @@
       <w:rFonts w:eastAsiaTheme="majorEastAsia" w:cstheme="majorBidi"/>
       <w:i/>
       <w:iCs/>
-      <w:color w:val="272727" w:themeColor="text1" w:themeTint="D8"/>
+      <w:color w:val="262626" w:themeColor="text1" w:themeTint="D9"/>
     </w:rPr>
   </w:style>
-  <w:style w:type="paragraph" w:styleId="Heading9">
+  <w:style w:type="paragraph" w:styleId="9">
     <w:name w:val="heading 9"/>
-    <w:basedOn w:val="Normal"/>
-    <w:next w:val="Normal"/>
-    <w:link w:val="Heading9Char"/>
+    <w:basedOn w:val="a"/>
+    <w:next w:val="a"/>
+    <w:link w:val="90"/>
     <w:uiPriority w:val="9"/>
     <w:semiHidden/>
     <w:unhideWhenUsed/>
     <w:qFormat/>
-    <w:rsid w:val="00B67A4B"/>
     <w:pPr>
       <w:keepNext/>
       <w:keepLines/>
@@ -3159,16 +4080,16 @@
     </w:pPr>
     <w:rPr>
       <w:rFonts w:eastAsiaTheme="majorEastAsia" w:cstheme="majorBidi"/>
-      <w:color w:val="272727" w:themeColor="text1" w:themeTint="D8"/>
+      <w:color w:val="262626" w:themeColor="text1" w:themeTint="D9"/>
     </w:rPr>
   </w:style>
-  <w:style w:type="character" w:default="1" w:styleId="DefaultParagraphFont">
+  <w:style w:type="character" w:default="1" w:styleId="a0">
     <w:name w:val="Default Paragraph Font"/>
     <w:uiPriority w:val="1"/>
     <w:semiHidden/>
     <w:unhideWhenUsed/>
   </w:style>
-  <w:style w:type="table" w:default="1" w:styleId="TableNormal">
+  <w:style w:type="table" w:default="1" w:styleId="a1">
     <w:name w:val="Normal Table"/>
     <w:uiPriority w:val="99"/>
     <w:semiHidden/>
@@ -3183,139 +4104,76 @@
       </w:tblCellMar>
     </w:tblPr>
   </w:style>
-  <w:style w:type="numbering" w:default="1" w:styleId="NoList">
+  <w:style w:type="numbering" w:default="1" w:styleId="a2">
     <w:name w:val="No List"/>
     <w:uiPriority w:val="99"/>
     <w:semiHidden/>
     <w:unhideWhenUsed/>
   </w:style>
-  <w:style w:type="character" w:customStyle="1" w:styleId="Heading1Char">
-    <w:name w:val="Heading 1 Char"/>
-    <w:basedOn w:val="DefaultParagraphFont"/>
-    <w:link w:val="Heading1"/>
-    <w:uiPriority w:val="9"/>
-    <w:rsid w:val="00B67A4B"/>
+  <w:style w:type="paragraph" w:styleId="a3">
+    <w:name w:val="annotation text"/>
+    <w:basedOn w:val="a"/>
+    <w:link w:val="a4"/>
+    <w:uiPriority w:val="99"/>
+    <w:unhideWhenUsed/>
+    <w:pPr>
+      <w:spacing w:line="240" w:lineRule="auto"/>
+    </w:pPr>
     <w:rPr>
-      <w:rFonts w:asciiTheme="majorHAnsi" w:eastAsiaTheme="majorEastAsia" w:hAnsiTheme="majorHAnsi" w:cstheme="majorBidi"/>
-      <w:color w:val="0F4761" w:themeColor="accent1" w:themeShade="BF"/>
-      <w:sz w:val="40"/>
-      <w:szCs w:val="40"/>
+      <w:sz w:val="20"/>
+      <w:szCs w:val="20"/>
     </w:rPr>
   </w:style>
-  <w:style w:type="character" w:customStyle="1" w:styleId="Heading2Char">
-    <w:name w:val="Heading 2 Char"/>
-    <w:basedOn w:val="DefaultParagraphFont"/>
-    <w:link w:val="Heading2"/>
-    <w:uiPriority w:val="9"/>
-    <w:semiHidden/>
-    <w:rsid w:val="00B67A4B"/>
-    <w:rPr>
-      <w:rFonts w:asciiTheme="majorHAnsi" w:eastAsiaTheme="majorEastAsia" w:hAnsiTheme="majorHAnsi" w:cstheme="majorBidi"/>
-      <w:color w:val="0F4761" w:themeColor="accent1" w:themeShade="BF"/>
-      <w:sz w:val="32"/>
-      <w:szCs w:val="32"/>
-    </w:rPr>
+  <w:style w:type="paragraph" w:styleId="a5">
+    <w:name w:val="footer"/>
+    <w:basedOn w:val="a"/>
+    <w:link w:val="a6"/>
+    <w:uiPriority w:val="99"/>
+    <w:unhideWhenUsed/>
+    <w:pPr>
+      <w:tabs>
+        <w:tab w:val="center" w:pos="4513"/>
+        <w:tab w:val="right" w:pos="9026"/>
+      </w:tabs>
+      <w:spacing w:after="0" w:line="240" w:lineRule="auto"/>
+    </w:pPr>
   </w:style>
-  <w:style w:type="character" w:customStyle="1" w:styleId="Heading3Char">
-    <w:name w:val="Heading 3 Char"/>
-    <w:basedOn w:val="DefaultParagraphFont"/>
-    <w:link w:val="Heading3"/>
-    <w:uiPriority w:val="9"/>
-    <w:semiHidden/>
-    <w:rsid w:val="00B67A4B"/>
+  <w:style w:type="paragraph" w:styleId="a7">
+    <w:name w:val="header"/>
+    <w:basedOn w:val="a"/>
+    <w:link w:val="a8"/>
+    <w:uiPriority w:val="99"/>
+    <w:unhideWhenUsed/>
+    <w:pPr>
+      <w:tabs>
+        <w:tab w:val="center" w:pos="4513"/>
+        <w:tab w:val="right" w:pos="9026"/>
+      </w:tabs>
+      <w:spacing w:after="0" w:line="240" w:lineRule="auto"/>
+    </w:pPr>
+  </w:style>
+  <w:style w:type="paragraph" w:styleId="a9">
+    <w:name w:val="Subtitle"/>
+    <w:basedOn w:val="a"/>
+    <w:next w:val="a"/>
+    <w:link w:val="aa"/>
+    <w:uiPriority w:val="11"/>
+    <w:qFormat/>
     <w:rPr>
       <w:rFonts w:eastAsiaTheme="majorEastAsia" w:cstheme="majorBidi"/>
-      <w:color w:val="0F4761" w:themeColor="accent1" w:themeShade="BF"/>
+      <w:color w:val="595959" w:themeColor="text1" w:themeTint="A6"/>
+      <w:spacing w:val="15"/>
       <w:sz w:val="28"/>
       <w:szCs w:val="28"/>
     </w:rPr>
   </w:style>
-  <w:style w:type="character" w:customStyle="1" w:styleId="Heading4Char">
-    <w:name w:val="Heading 4 Char"/>
-    <w:basedOn w:val="DefaultParagraphFont"/>
-    <w:link w:val="Heading4"/>
-    <w:uiPriority w:val="9"/>
-    <w:semiHidden/>
-    <w:rsid w:val="00B67A4B"/>
-    <w:rPr>
-      <w:rFonts w:eastAsiaTheme="majorEastAsia" w:cstheme="majorBidi"/>
-      <w:i/>
-      <w:iCs/>
-      <w:color w:val="0F4761" w:themeColor="accent1" w:themeShade="BF"/>
-    </w:rPr>
-  </w:style>
-  <w:style w:type="character" w:customStyle="1" w:styleId="Heading5Char">
-    <w:name w:val="Heading 5 Char"/>
-    <w:basedOn w:val="DefaultParagraphFont"/>
-    <w:link w:val="Heading5"/>
-    <w:uiPriority w:val="9"/>
-    <w:semiHidden/>
-    <w:rsid w:val="00B67A4B"/>
-    <w:rPr>
-      <w:rFonts w:eastAsiaTheme="majorEastAsia" w:cstheme="majorBidi"/>
-      <w:color w:val="0F4761" w:themeColor="accent1" w:themeShade="BF"/>
-    </w:rPr>
-  </w:style>
-  <w:style w:type="character" w:customStyle="1" w:styleId="Heading6Char">
-    <w:name w:val="Heading 6 Char"/>
-    <w:basedOn w:val="DefaultParagraphFont"/>
-    <w:link w:val="Heading6"/>
-    <w:uiPriority w:val="9"/>
-    <w:semiHidden/>
-    <w:rsid w:val="00B67A4B"/>
-    <w:rPr>
-      <w:rFonts w:eastAsiaTheme="majorEastAsia" w:cstheme="majorBidi"/>
-      <w:i/>
-      <w:iCs/>
-      <w:color w:val="595959" w:themeColor="text1" w:themeTint="A6"/>
-    </w:rPr>
-  </w:style>
-  <w:style w:type="character" w:customStyle="1" w:styleId="Heading7Char">
-    <w:name w:val="Heading 7 Char"/>
-    <w:basedOn w:val="DefaultParagraphFont"/>
-    <w:link w:val="Heading7"/>
-    <w:uiPriority w:val="9"/>
-    <w:semiHidden/>
-    <w:rsid w:val="00B67A4B"/>
-    <w:rPr>
-      <w:rFonts w:eastAsiaTheme="majorEastAsia" w:cstheme="majorBidi"/>
-      <w:color w:val="595959" w:themeColor="text1" w:themeTint="A6"/>
-    </w:rPr>
-  </w:style>
-  <w:style w:type="character" w:customStyle="1" w:styleId="Heading8Char">
-    <w:name w:val="Heading 8 Char"/>
-    <w:basedOn w:val="DefaultParagraphFont"/>
-    <w:link w:val="Heading8"/>
-    <w:uiPriority w:val="9"/>
-    <w:semiHidden/>
-    <w:rsid w:val="00B67A4B"/>
-    <w:rPr>
-      <w:rFonts w:eastAsiaTheme="majorEastAsia" w:cstheme="majorBidi"/>
-      <w:i/>
-      <w:iCs/>
-      <w:color w:val="272727" w:themeColor="text1" w:themeTint="D8"/>
-    </w:rPr>
-  </w:style>
-  <w:style w:type="character" w:customStyle="1" w:styleId="Heading9Char">
-    <w:name w:val="Heading 9 Char"/>
-    <w:basedOn w:val="DefaultParagraphFont"/>
-    <w:link w:val="Heading9"/>
-    <w:uiPriority w:val="9"/>
-    <w:semiHidden/>
-    <w:rsid w:val="00B67A4B"/>
-    <w:rPr>
-      <w:rFonts w:eastAsiaTheme="majorEastAsia" w:cstheme="majorBidi"/>
-      <w:color w:val="272727" w:themeColor="text1" w:themeTint="D8"/>
-    </w:rPr>
-  </w:style>
-  <w:style w:type="paragraph" w:styleId="Title">
+  <w:style w:type="paragraph" w:styleId="ab">
     <w:name w:val="Title"/>
-    <w:basedOn w:val="Normal"/>
-    <w:next w:val="Normal"/>
-    <w:link w:val="TitleChar"/>
+    <w:basedOn w:val="a"/>
+    <w:next w:val="a"/>
+    <w:link w:val="ac"/>
     <w:uiPriority w:val="10"/>
     <w:qFormat/>
-    <w:rsid w:val="00B67A4B"/>
     <w:pPr>
       <w:spacing w:after="80" w:line="240" w:lineRule="auto"/>
       <w:contextualSpacing/>
@@ -3328,12 +4186,160 @@
       <w:szCs w:val="56"/>
     </w:rPr>
   </w:style>
-  <w:style w:type="character" w:customStyle="1" w:styleId="TitleChar">
-    <w:name w:val="Title Char"/>
-    <w:basedOn w:val="DefaultParagraphFont"/>
-    <w:link w:val="Title"/>
+  <w:style w:type="paragraph" w:styleId="ad">
+    <w:name w:val="annotation subject"/>
+    <w:basedOn w:val="a3"/>
+    <w:next w:val="a3"/>
+    <w:link w:val="ae"/>
+    <w:uiPriority w:val="99"/>
+    <w:semiHidden/>
+    <w:unhideWhenUsed/>
+    <w:rPr>
+      <w:b/>
+      <w:bCs/>
+    </w:rPr>
+  </w:style>
+  <w:style w:type="table" w:styleId="af">
+    <w:name w:val="Table Grid"/>
+    <w:basedOn w:val="a1"/>
+    <w:uiPriority w:val="39"/>
+    <w:tblPr>
+      <w:tblBorders>
+        <w:top w:val="single" w:sz="4" w:space="0" w:color="auto"/>
+        <w:left w:val="single" w:sz="4" w:space="0" w:color="auto"/>
+        <w:bottom w:val="single" w:sz="4" w:space="0" w:color="auto"/>
+        <w:right w:val="single" w:sz="4" w:space="0" w:color="auto"/>
+        <w:insideH w:val="single" w:sz="4" w:space="0" w:color="auto"/>
+        <w:insideV w:val="single" w:sz="4" w:space="0" w:color="auto"/>
+      </w:tblBorders>
+    </w:tblPr>
+  </w:style>
+  <w:style w:type="character" w:styleId="af0">
+    <w:name w:val="annotation reference"/>
+    <w:basedOn w:val="a0"/>
+    <w:uiPriority w:val="99"/>
+    <w:semiHidden/>
+    <w:unhideWhenUsed/>
+    <w:rPr>
+      <w:sz w:val="16"/>
+      <w:szCs w:val="16"/>
+    </w:rPr>
+  </w:style>
+  <w:style w:type="character" w:customStyle="1" w:styleId="10">
+    <w:name w:val="标题 1 字符"/>
+    <w:basedOn w:val="a0"/>
+    <w:link w:val="1"/>
+    <w:uiPriority w:val="9"/>
+    <w:rPr>
+      <w:rFonts w:asciiTheme="majorHAnsi" w:eastAsiaTheme="majorEastAsia" w:hAnsiTheme="majorHAnsi" w:cstheme="majorBidi"/>
+      <w:color w:val="0F4761" w:themeColor="accent1" w:themeShade="BF"/>
+      <w:sz w:val="40"/>
+      <w:szCs w:val="40"/>
+    </w:rPr>
+  </w:style>
+  <w:style w:type="character" w:customStyle="1" w:styleId="20">
+    <w:name w:val="标题 2 字符"/>
+    <w:basedOn w:val="a0"/>
+    <w:link w:val="2"/>
+    <w:uiPriority w:val="9"/>
+    <w:semiHidden/>
+    <w:rPr>
+      <w:rFonts w:asciiTheme="majorHAnsi" w:eastAsiaTheme="majorEastAsia" w:hAnsiTheme="majorHAnsi" w:cstheme="majorBidi"/>
+      <w:color w:val="0F4761" w:themeColor="accent1" w:themeShade="BF"/>
+      <w:sz w:val="32"/>
+      <w:szCs w:val="32"/>
+    </w:rPr>
+  </w:style>
+  <w:style w:type="character" w:customStyle="1" w:styleId="30">
+    <w:name w:val="标题 3 字符"/>
+    <w:basedOn w:val="a0"/>
+    <w:link w:val="3"/>
+    <w:uiPriority w:val="9"/>
+    <w:semiHidden/>
+    <w:rPr>
+      <w:rFonts w:eastAsiaTheme="majorEastAsia" w:cstheme="majorBidi"/>
+      <w:color w:val="0F4761" w:themeColor="accent1" w:themeShade="BF"/>
+      <w:sz w:val="28"/>
+      <w:szCs w:val="28"/>
+    </w:rPr>
+  </w:style>
+  <w:style w:type="character" w:customStyle="1" w:styleId="40">
+    <w:name w:val="标题 4 字符"/>
+    <w:basedOn w:val="a0"/>
+    <w:link w:val="4"/>
+    <w:uiPriority w:val="9"/>
+    <w:semiHidden/>
+    <w:rPr>
+      <w:rFonts w:eastAsiaTheme="majorEastAsia" w:cstheme="majorBidi"/>
+      <w:i/>
+      <w:iCs/>
+      <w:color w:val="0F4761" w:themeColor="accent1" w:themeShade="BF"/>
+    </w:rPr>
+  </w:style>
+  <w:style w:type="character" w:customStyle="1" w:styleId="50">
+    <w:name w:val="标题 5 字符"/>
+    <w:basedOn w:val="a0"/>
+    <w:link w:val="5"/>
+    <w:uiPriority w:val="9"/>
+    <w:semiHidden/>
+    <w:rPr>
+      <w:rFonts w:eastAsiaTheme="majorEastAsia" w:cstheme="majorBidi"/>
+      <w:color w:val="0F4761" w:themeColor="accent1" w:themeShade="BF"/>
+    </w:rPr>
+  </w:style>
+  <w:style w:type="character" w:customStyle="1" w:styleId="60">
+    <w:name w:val="标题 6 字符"/>
+    <w:basedOn w:val="a0"/>
+    <w:link w:val="6"/>
+    <w:uiPriority w:val="9"/>
+    <w:semiHidden/>
+    <w:rPr>
+      <w:rFonts w:eastAsiaTheme="majorEastAsia" w:cstheme="majorBidi"/>
+      <w:i/>
+      <w:iCs/>
+      <w:color w:val="595959" w:themeColor="text1" w:themeTint="A6"/>
+    </w:rPr>
+  </w:style>
+  <w:style w:type="character" w:customStyle="1" w:styleId="70">
+    <w:name w:val="标题 7 字符"/>
+    <w:basedOn w:val="a0"/>
+    <w:link w:val="7"/>
+    <w:uiPriority w:val="9"/>
+    <w:semiHidden/>
+    <w:rPr>
+      <w:rFonts w:eastAsiaTheme="majorEastAsia" w:cstheme="majorBidi"/>
+      <w:color w:val="595959" w:themeColor="text1" w:themeTint="A6"/>
+    </w:rPr>
+  </w:style>
+  <w:style w:type="character" w:customStyle="1" w:styleId="80">
+    <w:name w:val="标题 8 字符"/>
+    <w:basedOn w:val="a0"/>
+    <w:link w:val="8"/>
+    <w:uiPriority w:val="9"/>
+    <w:semiHidden/>
+    <w:rPr>
+      <w:rFonts w:eastAsiaTheme="majorEastAsia" w:cstheme="majorBidi"/>
+      <w:i/>
+      <w:iCs/>
+      <w:color w:val="262626" w:themeColor="text1" w:themeTint="D9"/>
+    </w:rPr>
+  </w:style>
+  <w:style w:type="character" w:customStyle="1" w:styleId="90">
+    <w:name w:val="标题 9 字符"/>
+    <w:basedOn w:val="a0"/>
+    <w:link w:val="9"/>
+    <w:uiPriority w:val="9"/>
+    <w:semiHidden/>
+    <w:rPr>
+      <w:rFonts w:eastAsiaTheme="majorEastAsia" w:cstheme="majorBidi"/>
+      <w:color w:val="262626" w:themeColor="text1" w:themeTint="D9"/>
+    </w:rPr>
+  </w:style>
+  <w:style w:type="character" w:customStyle="1" w:styleId="ac">
+    <w:name w:val="标题 字符"/>
+    <w:basedOn w:val="a0"/>
+    <w:link w:val="ab"/>
     <w:uiPriority w:val="10"/>
-    <w:rsid w:val="00B67A4B"/>
     <w:rPr>
       <w:rFonts w:asciiTheme="majorHAnsi" w:eastAsiaTheme="majorEastAsia" w:hAnsiTheme="majorHAnsi" w:cstheme="majorBidi"/>
       <w:spacing w:val="-10"/>
@@ -3342,19 +4348,11 @@
       <w:szCs w:val="56"/>
     </w:rPr>
   </w:style>
-  <w:style w:type="paragraph" w:styleId="Subtitle">
-    <w:name w:val="Subtitle"/>
-    <w:basedOn w:val="Normal"/>
-    <w:next w:val="Normal"/>
-    <w:link w:val="SubtitleChar"/>
+  <w:style w:type="character" w:customStyle="1" w:styleId="aa">
+    <w:name w:val="副标题 字符"/>
+    <w:basedOn w:val="a0"/>
+    <w:link w:val="a9"/>
     <w:uiPriority w:val="11"/>
-    <w:qFormat/>
-    <w:rsid w:val="00B67A4B"/>
-    <w:pPr>
-      <w:numPr>
-        <w:ilvl w:val="1"/>
-      </w:numPr>
-    </w:pPr>
     <w:rPr>
       <w:rFonts w:eastAsiaTheme="majorEastAsia" w:cstheme="majorBidi"/>
       <w:color w:val="595959" w:themeColor="text1" w:themeTint="A6"/>
@@ -3363,28 +4361,13 @@
       <w:szCs w:val="28"/>
     </w:rPr>
   </w:style>
-  <w:style w:type="character" w:customStyle="1" w:styleId="SubtitleChar">
-    <w:name w:val="Subtitle Char"/>
-    <w:basedOn w:val="DefaultParagraphFont"/>
-    <w:link w:val="Subtitle"/>
-    <w:uiPriority w:val="11"/>
-    <w:rsid w:val="00B67A4B"/>
-    <w:rPr>
-      <w:rFonts w:eastAsiaTheme="majorEastAsia" w:cstheme="majorBidi"/>
-      <w:color w:val="595959" w:themeColor="text1" w:themeTint="A6"/>
-      <w:spacing w:val="15"/>
-      <w:sz w:val="28"/>
-      <w:szCs w:val="28"/>
-    </w:rPr>
-  </w:style>
-  <w:style w:type="paragraph" w:styleId="Quote">
+  <w:style w:type="paragraph" w:styleId="af1">
     <w:name w:val="Quote"/>
-    <w:basedOn w:val="Normal"/>
-    <w:next w:val="Normal"/>
-    <w:link w:val="QuoteChar"/>
+    <w:basedOn w:val="a"/>
+    <w:next w:val="a"/>
+    <w:link w:val="af2"/>
     <w:uiPriority w:val="29"/>
     <w:qFormat/>
-    <w:rsid w:val="00B67A4B"/>
     <w:pPr>
       <w:spacing w:before="160"/>
       <w:jc w:val="center"/>
@@ -3395,49 +4378,45 @@
       <w:color w:val="404040" w:themeColor="text1" w:themeTint="BF"/>
     </w:rPr>
   </w:style>
-  <w:style w:type="character" w:customStyle="1" w:styleId="QuoteChar">
-    <w:name w:val="Quote Char"/>
-    <w:basedOn w:val="DefaultParagraphFont"/>
-    <w:link w:val="Quote"/>
+  <w:style w:type="character" w:customStyle="1" w:styleId="af2">
+    <w:name w:val="引用 字符"/>
+    <w:basedOn w:val="a0"/>
+    <w:link w:val="af1"/>
     <w:uiPriority w:val="29"/>
-    <w:rsid w:val="00B67A4B"/>
     <w:rPr>
       <w:i/>
       <w:iCs/>
       <w:color w:val="404040" w:themeColor="text1" w:themeTint="BF"/>
     </w:rPr>
   </w:style>
-  <w:style w:type="paragraph" w:styleId="ListParagraph">
+  <w:style w:type="paragraph" w:styleId="af3">
     <w:name w:val="List Paragraph"/>
-    <w:basedOn w:val="Normal"/>
+    <w:basedOn w:val="a"/>
     <w:uiPriority w:val="34"/>
     <w:qFormat/>
-    <w:rsid w:val="00B67A4B"/>
     <w:pPr>
       <w:ind w:left="720"/>
       <w:contextualSpacing/>
     </w:pPr>
   </w:style>
-  <w:style w:type="character" w:styleId="IntenseEmphasis">
-    <w:name w:val="Intense Emphasis"/>
-    <w:basedOn w:val="DefaultParagraphFont"/>
+  <w:style w:type="character" w:customStyle="1" w:styleId="11">
+    <w:name w:val="明显强调1"/>
+    <w:basedOn w:val="a0"/>
     <w:uiPriority w:val="21"/>
     <w:qFormat/>
-    <w:rsid w:val="00B67A4B"/>
     <w:rPr>
       <w:i/>
       <w:iCs/>
       <w:color w:val="0F4761" w:themeColor="accent1" w:themeShade="BF"/>
     </w:rPr>
   </w:style>
-  <w:style w:type="paragraph" w:styleId="IntenseQuote">
+  <w:style w:type="paragraph" w:styleId="af4">
     <w:name w:val="Intense Quote"/>
-    <w:basedOn w:val="Normal"/>
-    <w:next w:val="Normal"/>
-    <w:link w:val="IntenseQuoteChar"/>
+    <w:basedOn w:val="a"/>
+    <w:next w:val="a"/>
+    <w:link w:val="af5"/>
     <w:uiPriority w:val="30"/>
     <w:qFormat/>
-    <w:rsid w:val="00B67A4B"/>
     <w:pPr>
       <w:pBdr>
         <w:top w:val="single" w:sz="4" w:space="10" w:color="0F4761" w:themeColor="accent1" w:themeShade="BF"/>
@@ -3453,24 +4432,22 @@
       <w:color w:val="0F4761" w:themeColor="accent1" w:themeShade="BF"/>
     </w:rPr>
   </w:style>
-  <w:style w:type="character" w:customStyle="1" w:styleId="IntenseQuoteChar">
-    <w:name w:val="Intense Quote Char"/>
-    <w:basedOn w:val="DefaultParagraphFont"/>
-    <w:link w:val="IntenseQuote"/>
+  <w:style w:type="character" w:customStyle="1" w:styleId="af5">
+    <w:name w:val="明显引用 字符"/>
+    <w:basedOn w:val="a0"/>
+    <w:link w:val="af4"/>
     <w:uiPriority w:val="30"/>
-    <w:rsid w:val="00B67A4B"/>
     <w:rPr>
       <w:i/>
       <w:iCs/>
       <w:color w:val="0F4761" w:themeColor="accent1" w:themeShade="BF"/>
     </w:rPr>
   </w:style>
-  <w:style w:type="character" w:styleId="IntenseReference">
-    <w:name w:val="Intense Reference"/>
-    <w:basedOn w:val="DefaultParagraphFont"/>
+  <w:style w:type="character" w:customStyle="1" w:styleId="12">
+    <w:name w:val="明显参考1"/>
+    <w:basedOn w:val="a0"/>
     <w:uiPriority w:val="32"/>
     <w:qFormat/>
-    <w:rsid w:val="00B67A4B"/>
     <w:rPr>
       <w:b/>
       <w:bCs/>
@@ -3479,133 +4456,62 @@
       <w:spacing w:val="5"/>
     </w:rPr>
   </w:style>
-  <w:style w:type="table" w:styleId="TableGrid">
-    <w:name w:val="Table Grid"/>
-    <w:basedOn w:val="TableNormal"/>
-    <w:uiPriority w:val="39"/>
-    <w:rsid w:val="00B67A4B"/>
-    <w:pPr>
-      <w:spacing w:after="0" w:line="240" w:lineRule="auto"/>
-    </w:pPr>
-    <w:tblPr>
-      <w:tblBorders>
-        <w:top w:val="single" w:sz="4" w:space="0" w:color="auto"/>
-        <w:left w:val="single" w:sz="4" w:space="0" w:color="auto"/>
-        <w:bottom w:val="single" w:sz="4" w:space="0" w:color="auto"/>
-        <w:right w:val="single" w:sz="4" w:space="0" w:color="auto"/>
-        <w:insideH w:val="single" w:sz="4" w:space="0" w:color="auto"/>
-        <w:insideV w:val="single" w:sz="4" w:space="0" w:color="auto"/>
-      </w:tblBorders>
-    </w:tblPr>
+  <w:style w:type="character" w:customStyle="1" w:styleId="a8">
+    <w:name w:val="页眉 字符"/>
+    <w:basedOn w:val="a0"/>
+    <w:link w:val="a7"/>
+    <w:uiPriority w:val="99"/>
   </w:style>
-  <w:style w:type="paragraph" w:styleId="Header">
-    <w:name w:val="header"/>
-    <w:basedOn w:val="Normal"/>
-    <w:link w:val="HeaderChar"/>
+  <w:style w:type="character" w:customStyle="1" w:styleId="a6">
+    <w:name w:val="页脚 字符"/>
+    <w:basedOn w:val="a0"/>
+    <w:link w:val="a5"/>
     <w:uiPriority w:val="99"/>
-    <w:unhideWhenUsed/>
-    <w:rsid w:val="00B67A4B"/>
-    <w:pPr>
-      <w:tabs>
-        <w:tab w:val="center" w:pos="4513"/>
-        <w:tab w:val="right" w:pos="9026"/>
-      </w:tabs>
-      <w:spacing w:after="0" w:line="240" w:lineRule="auto"/>
-    </w:pPr>
   </w:style>
-  <w:style w:type="character" w:customStyle="1" w:styleId="HeaderChar">
-    <w:name w:val="Header Char"/>
-    <w:basedOn w:val="DefaultParagraphFont"/>
-    <w:link w:val="Header"/>
+  <w:style w:type="character" w:customStyle="1" w:styleId="a4">
+    <w:name w:val="批注文字 字符"/>
+    <w:basedOn w:val="a0"/>
+    <w:link w:val="a3"/>
     <w:uiPriority w:val="99"/>
-    <w:rsid w:val="00B67A4B"/>
-  </w:style>
-  <w:style w:type="paragraph" w:styleId="Footer">
-    <w:name w:val="footer"/>
-    <w:basedOn w:val="Normal"/>
-    <w:link w:val="FooterChar"/>
-    <w:uiPriority w:val="99"/>
-    <w:unhideWhenUsed/>
-    <w:rsid w:val="00B67A4B"/>
-    <w:pPr>
-      <w:tabs>
-        <w:tab w:val="center" w:pos="4513"/>
-        <w:tab w:val="right" w:pos="9026"/>
-      </w:tabs>
-      <w:spacing w:after="0" w:line="240" w:lineRule="auto"/>
-    </w:pPr>
-  </w:style>
-  <w:style w:type="character" w:customStyle="1" w:styleId="FooterChar">
-    <w:name w:val="Footer Char"/>
-    <w:basedOn w:val="DefaultParagraphFont"/>
-    <w:link w:val="Footer"/>
-    <w:uiPriority w:val="99"/>
-    <w:rsid w:val="00B67A4B"/>
-  </w:style>
-  <w:style w:type="character" w:styleId="CommentReference">
-    <w:name w:val="annotation reference"/>
-    <w:basedOn w:val="DefaultParagraphFont"/>
-    <w:uiPriority w:val="99"/>
-    <w:semiHidden/>
-    <w:unhideWhenUsed/>
-    <w:rsid w:val="007276EC"/>
-    <w:rPr>
-      <w:sz w:val="16"/>
-      <w:szCs w:val="16"/>
-    </w:rPr>
-  </w:style>
-  <w:style w:type="paragraph" w:styleId="CommentText">
-    <w:name w:val="annotation text"/>
-    <w:basedOn w:val="Normal"/>
-    <w:link w:val="CommentTextChar"/>
-    <w:uiPriority w:val="99"/>
-    <w:unhideWhenUsed/>
-    <w:rsid w:val="007276EC"/>
-    <w:pPr>
-      <w:spacing w:line="240" w:lineRule="auto"/>
-    </w:pPr>
     <w:rPr>
       <w:sz w:val="20"/>
       <w:szCs w:val="20"/>
     </w:rPr>
   </w:style>
-  <w:style w:type="character" w:customStyle="1" w:styleId="CommentTextChar">
-    <w:name w:val="Comment Text Char"/>
-    <w:basedOn w:val="DefaultParagraphFont"/>
-    <w:link w:val="CommentText"/>
-    <w:uiPriority w:val="99"/>
-    <w:rsid w:val="007276EC"/>
-    <w:rPr>
-      <w:sz w:val="20"/>
-      <w:szCs w:val="20"/>
-    </w:rPr>
-  </w:style>
-  <w:style w:type="paragraph" w:styleId="CommentSubject">
-    <w:name w:val="annotation subject"/>
-    <w:basedOn w:val="CommentText"/>
-    <w:next w:val="CommentText"/>
-    <w:link w:val="CommentSubjectChar"/>
+  <w:style w:type="character" w:customStyle="1" w:styleId="ae">
+    <w:name w:val="批注主题 字符"/>
+    <w:basedOn w:val="a4"/>
+    <w:link w:val="ad"/>
     <w:uiPriority w:val="99"/>
     <w:semiHidden/>
-    <w:unhideWhenUsed/>
-    <w:rsid w:val="007276EC"/>
-    <w:rPr>
-      <w:b/>
-      <w:bCs/>
-    </w:rPr>
-  </w:style>
-  <w:style w:type="character" w:customStyle="1" w:styleId="CommentSubjectChar">
-    <w:name w:val="Comment Subject Char"/>
-    <w:basedOn w:val="CommentTextChar"/>
-    <w:link w:val="CommentSubject"/>
-    <w:uiPriority w:val="99"/>
-    <w:semiHidden/>
-    <w:rsid w:val="007276EC"/>
     <w:rPr>
       <w:b/>
       <w:bCs/>
       <w:sz w:val="20"/>
       <w:szCs w:val="20"/>
+    </w:rPr>
+  </w:style>
+  <w:style w:type="character" w:styleId="af6">
+    <w:name w:val="Hyperlink"/>
+    <w:basedOn w:val="a0"/>
+    <w:uiPriority w:val="99"/>
+    <w:unhideWhenUsed/>
+    <w:rsid w:val="001E2EA9"/>
+    <w:rPr>
+      <w:color w:val="467886" w:themeColor="hyperlink"/>
+      <w:u w:val="single"/>
+    </w:rPr>
+  </w:style>
+  <w:style w:type="character" w:styleId="af7">
+    <w:name w:val="Unresolved Mention"/>
+    <w:basedOn w:val="a0"/>
+    <w:uiPriority w:val="99"/>
+    <w:semiHidden/>
+    <w:unhideWhenUsed/>
+    <w:rsid w:val="001E2EA9"/>
+    <w:rPr>
+      <w:color w:val="605E5C"/>
+      <w:shd w:val="clear" w:color="auto" w:fill="E1DFDD"/>
     </w:rPr>
   </w:style>
 </w:styles>
@@ -3654,7 +4560,7 @@
     </a:clrScheme>
     <a:fontScheme name="Office">
       <a:majorFont>
-        <a:latin typeface="Aptos Display" panose="02110004020202020204"/>
+        <a:latin typeface="Aptos Display"/>
         <a:ea typeface=""/>
         <a:cs typeface=""/>
         <a:font script="Jpan" typeface="游ゴシック Light"/>
@@ -3687,26 +4593,9 @@
         <a:font script="Viet" typeface="Times New Roman"/>
         <a:font script="Uigh" typeface="Microsoft Uighur"/>
         <a:font script="Geor" typeface="Sylfaen"/>
-        <a:font script="Armn" typeface="Arial"/>
-        <a:font script="Bugi" typeface="Leelawadee UI"/>
-        <a:font script="Bopo" typeface="Microsoft JhengHei"/>
-        <a:font script="Java" typeface="Javanese Text"/>
-        <a:font script="Lisu" typeface="Segoe UI"/>
-        <a:font script="Mymr" typeface="Myanmar Text"/>
-        <a:font script="Nkoo" typeface="Ebrima"/>
-        <a:font script="Olck" typeface="Nirmala UI"/>
-        <a:font script="Osma" typeface="Ebrima"/>
-        <a:font script="Phag" typeface="Phagspa"/>
-        <a:font script="Syrn" typeface="Estrangelo Edessa"/>
-        <a:font script="Syrj" typeface="Estrangelo Edessa"/>
-        <a:font script="Syre" typeface="Estrangelo Edessa"/>
-        <a:font script="Sora" typeface="Nirmala UI"/>
-        <a:font script="Tale" typeface="Microsoft Tai Le"/>
-        <a:font script="Talu" typeface="Microsoft New Tai Lue"/>
-        <a:font script="Tfng" typeface="Ebrima"/>
       </a:majorFont>
       <a:minorFont>
-        <a:latin typeface="Aptos" panose="02110004020202020204"/>
+        <a:latin typeface="Aptos"/>
         <a:ea typeface=""/>
         <a:cs typeface=""/>
         <a:font script="Jpan" typeface="游明朝"/>
@@ -3739,23 +4628,6 @@
         <a:font script="Viet" typeface="Arial"/>
         <a:font script="Uigh" typeface="Microsoft Uighur"/>
         <a:font script="Geor" typeface="Sylfaen"/>
-        <a:font script="Armn" typeface="Arial"/>
-        <a:font script="Bugi" typeface="Leelawadee UI"/>
-        <a:font script="Bopo" typeface="Microsoft JhengHei"/>
-        <a:font script="Java" typeface="Javanese Text"/>
-        <a:font script="Lisu" typeface="Segoe UI"/>
-        <a:font script="Mymr" typeface="Myanmar Text"/>
-        <a:font script="Nkoo" typeface="Ebrima"/>
-        <a:font script="Olck" typeface="Nirmala UI"/>
-        <a:font script="Osma" typeface="Ebrima"/>
-        <a:font script="Phag" typeface="Phagspa"/>
-        <a:font script="Syrn" typeface="Estrangelo Edessa"/>
-        <a:font script="Syrj" typeface="Estrangelo Edessa"/>
-        <a:font script="Syre" typeface="Estrangelo Edessa"/>
-        <a:font script="Sora" typeface="Nirmala UI"/>
-        <a:font script="Tale" typeface="Microsoft Tai Le"/>
-        <a:font script="Talu" typeface="Microsoft New Tai Lue"/>
-        <a:font script="Tfng" typeface="Ebrima"/>
       </a:minorFont>
     </a:fontScheme>
     <a:fmtScheme name="Office">
@@ -3918,15 +4790,21 @@
     </a:lnDef>
   </a:objectDefaults>
   <a:extraClrSchemeLst/>
-  <a:extLst>
-    <a:ext uri="{05A4C25C-085E-4340-85A3-A5531E510DB2}">
-      <thm15:themeFamily xmlns:thm15="http://schemas.microsoft.com/office/thememl/2012/main" name="Office Theme" id="{2E142A2C-CD16-42D6-873A-C26D2A0506FA}" vid="{1BDDFF52-6CD6-40A5-AB3C-68EB2F1E4D0A}"/>
-    </a:ext>
-  </a:extLst>
 </a:theme>
 </file>
 
 <file path=customXml/item1.xml><?xml version="1.0" encoding="utf-8"?>
+<s:customData xmlns="http://www.wps.cn/officeDocument/2013/wpsCustomData" xmlns:s="http://www.wps.cn/officeDocument/2013/wpsCustomData">
+  <customSectProps>
+    <customSectPr/>
+  </customSectProps>
+  <customShpExts>
+    <customShpInfo spid="_x0000_s1026" textRotate="1"/>
+  </customShpExts>
+</s:customData>
+</file>
+
+<file path=customXml/item2.xml><?xml version="1.0" encoding="utf-8"?>
 <?mso-contentType ?>
 <FormTemplates xmlns="http://schemas.microsoft.com/sharepoint/v3/contenttype/forms">
   <Display>DocumentLibraryForm</Display>
@@ -3935,13 +4813,13 @@
 </FormTemplates>
 </file>
 
-<file path=customXml/item2.xml><?xml version="1.0" encoding="utf-8"?>
+<file path=customXml/item3.xml><?xml version="1.0" encoding="utf-8"?>
 <p:properties xmlns:p="http://schemas.microsoft.com/office/2006/metadata/properties" xmlns:xsi="http://www.w3.org/2001/XMLSchema-instance" xmlns:pc="http://schemas.microsoft.com/office/infopath/2007/PartnerControls">
   <documentManagement/>
 </p:properties>
 </file>
 
-<file path=customXml/item3.xml><?xml version="1.0" encoding="utf-8"?>
+<file path=customXml/item4.xml><?xml version="1.0" encoding="utf-8"?>
 <ct:contentTypeSchema xmlns:ct="http://schemas.microsoft.com/office/2006/metadata/contentType" xmlns:ma="http://schemas.microsoft.com/office/2006/metadata/properties/metaAttributes" ct:_="" ma:_="" ma:contentTypeName="Document" ma:contentTypeID="0x010100D6545C4DACC92340AB17033E3A6DD483" ma:contentTypeVersion="7" ma:contentTypeDescription="Create a new document." ma:contentTypeScope="" ma:versionID="6f6f15b7efb541e43d43c9c2c61b15c3">
   <xsd:schema xmlns:xsd="http://www.w3.org/2001/XMLSchema" xmlns:xs="http://www.w3.org/2001/XMLSchema" xmlns:p="http://schemas.microsoft.com/office/2006/metadata/properties" xmlns:ns2="dcad1f52-99d9-4eec-95fc-8866ed2e151b" targetNamespace="http://schemas.microsoft.com/office/2006/metadata/properties" ma:root="true" ma:fieldsID="aae3021ca0d968f6dd92c1313e02e8e7" ns2:_="">
     <xsd:import namespace="dcad1f52-99d9-4eec-95fc-8866ed2e151b"/>
@@ -4104,6 +4982,14 @@
 </file>
 
 <file path=customXml/itemProps1.xml><?xml version="1.0" encoding="utf-8"?>
+<ds:datastoreItem xmlns:ds="http://schemas.openxmlformats.org/officeDocument/2006/customXml" ds:itemID="{B1977F7D-205B-4081-913C-38D41E755F92}">
+  <ds:schemaRefs>
+    <ds:schemaRef ds:uri="http://www.wps.cn/officeDocument/2013/wpsCustomData"/>
+  </ds:schemaRefs>
+</ds:datastoreItem>
+</file>
+
+<file path=customXml/itemProps2.xml><?xml version="1.0" encoding="utf-8"?>
 <ds:datastoreItem xmlns:ds="http://schemas.openxmlformats.org/officeDocument/2006/customXml" ds:itemID="{7BDF9320-02E3-45FE-BA80-EB3A0EF3B181}">
   <ds:schemaRefs>
     <ds:schemaRef ds:uri="http://schemas.microsoft.com/sharepoint/v3/contenttype/forms"/>
@@ -4111,7 +4997,7 @@
 </ds:datastoreItem>
 </file>
 
-<file path=customXml/itemProps2.xml><?xml version="1.0" encoding="utf-8"?>
+<file path=customXml/itemProps3.xml><?xml version="1.0" encoding="utf-8"?>
 <ds:datastoreItem xmlns:ds="http://schemas.openxmlformats.org/officeDocument/2006/customXml" ds:itemID="{8E01AADA-C075-4CD4-AE01-CA261893014F}">
   <ds:schemaRefs>
     <ds:schemaRef ds:uri="http://schemas.microsoft.com/office/2006/metadata/properties"/>
@@ -4120,7 +5006,7 @@
 </ds:datastoreItem>
 </file>
 
-<file path=customXml/itemProps3.xml><?xml version="1.0" encoding="utf-8"?>
+<file path=customXml/itemProps4.xml><?xml version="1.0" encoding="utf-8"?>
 <ds:datastoreItem xmlns:ds="http://schemas.openxmlformats.org/officeDocument/2006/customXml" ds:itemID="{420077C5-86C4-408B-8C0D-1FE579DE108E}">
   <ds:schemaRefs>
     <ds:schemaRef ds:uri="http://schemas.microsoft.com/office/2006/metadata/contentType"/>

</xml_diff>

<commit_message>
Add narrative paragraphs to all markdown cells for documentation
</commit_message>
<xml_diff>
--- a/MLDP Program Codes Submission Declaration.docx
+++ b/MLDP Program Codes Submission Declaration.docx
@@ -1278,10 +1278,10 @@
                   <v:path o:extrusionok="f" gradientshapeok="t" o:connecttype="rect"/>
                   <o:lock v:ext="edit" aspectratio="t"/>
                 </v:shapetype>
-                <v:shape id="_x0000_i1025" type="#_x0000_t75" style="width:74.5pt;height:49.5pt" o:ole="">
+                <v:shape id="_x0000_i1025" type="#_x0000_t75" style="width:74.85pt;height:49.2pt" o:ole="">
                   <v:imagedata r:id="rId13" o:title=""/>
                 </v:shape>
-                <o:OLEObject Type="Embed" ProgID="Acrobat.Document.DC" ShapeID="_x0000_i1025" DrawAspect="Icon" ObjectID="_1832467279" r:id="rId14"/>
+                <o:OLEObject Type="Embed" ProgID="Acrobat.Document.DC" ShapeID="_x0000_i1025" DrawAspect="Icon" ObjectID="_1832475341" r:id="rId14"/>
               </w:object>
             </w:r>
           </w:p>
@@ -1929,7 +1929,6 @@
     <w:p>
       <w:pPr>
         <w:rPr>
-          <w:rFonts w:hint="eastAsia"/>
           <w:b/>
           <w:bCs/>
           <w:sz w:val="22"/>
@@ -2021,7 +2020,7 @@
             <w:pPr>
               <w:spacing w:after="0" w:line="240" w:lineRule="auto"/>
               <w:rPr>
-                <w:rFonts w:ascii="Arial" w:hAnsi="Arial" w:cs="Arial" w:hint="eastAsia"/>
+                <w:rFonts w:ascii="Arial" w:hAnsi="Arial" w:cs="Arial"/>
                 <w:sz w:val="22"/>
                 <w:szCs w:val="22"/>
               </w:rPr>
@@ -2084,7 +2083,7 @@
             <w:pPr>
               <w:spacing w:after="0" w:line="240" w:lineRule="auto"/>
               <w:rPr>
-                <w:rFonts w:ascii="Arial" w:hAnsi="Arial" w:cs="Arial" w:hint="eastAsia"/>
+                <w:rFonts w:ascii="Arial" w:hAnsi="Arial" w:cs="Arial"/>
                 <w:sz w:val="22"/>
                 <w:szCs w:val="22"/>
               </w:rPr>
@@ -2159,7 +2158,7 @@
             <w:pPr>
               <w:spacing w:after="0" w:line="240" w:lineRule="auto"/>
               <w:rPr>
-                <w:rFonts w:ascii="Arial" w:hAnsi="Arial" w:cs="Arial" w:hint="eastAsia"/>
+                <w:rFonts w:ascii="Arial" w:hAnsi="Arial" w:cs="Arial"/>
                 <w:sz w:val="22"/>
                 <w:szCs w:val="22"/>
               </w:rPr>
@@ -2235,18 +2234,18 @@
           <w14:ligatures w14:val="none"/>
         </w:rPr>
         <w:drawing>
-          <wp:anchor distT="0" distB="0" distL="114300" distR="114300" simplePos="0" relativeHeight="251658240" behindDoc="0" locked="0" layoutInCell="1" allowOverlap="1" wp14:anchorId="7B29B375" wp14:editId="348AE263">
+          <wp:anchor distT="0" distB="0" distL="114300" distR="114300" simplePos="0" relativeHeight="251672576" behindDoc="0" locked="0" layoutInCell="1" allowOverlap="1" wp14:anchorId="71910E05" wp14:editId="2455A37C">
             <wp:simplePos x="0" y="0"/>
             <wp:positionH relativeFrom="margin">
-              <wp:posOffset>-32385</wp:posOffset>
+              <wp:align>left</wp:align>
             </wp:positionH>
             <wp:positionV relativeFrom="paragraph">
-              <wp:posOffset>261620</wp:posOffset>
+              <wp:posOffset>4799965</wp:posOffset>
             </wp:positionV>
-            <wp:extent cx="4202430" cy="2458085"/>
-            <wp:effectExtent l="0" t="0" r="7620" b="0"/>
+            <wp:extent cx="3919855" cy="2195830"/>
+            <wp:effectExtent l="0" t="0" r="4445" b="0"/>
             <wp:wrapTopAndBottom/>
-            <wp:docPr id="818840751" name="图片 1" descr="图形用户界面, 应用程序&#10;&#10;AI 生成的内容可能不正确。"/>
+            <wp:docPr id="859265003" name="图片 1" descr="图形用户界面&#10;&#10;AI 生成的内容可能不正确。"/>
             <wp:cNvGraphicFramePr>
               <a:graphicFrameLocks xmlns:a="http://schemas.openxmlformats.org/drawingml/2006/main" noChangeAspect="1"/>
             </wp:cNvGraphicFramePr>
@@ -2254,7 +2253,7 @@
               <a:graphicData uri="http://schemas.openxmlformats.org/drawingml/2006/picture">
                 <pic:pic xmlns:pic="http://schemas.openxmlformats.org/drawingml/2006/picture">
                   <pic:nvPicPr>
-                    <pic:cNvPr id="818840751" name="图片 1" descr="图形用户界面, 应用程序&#10;&#10;AI 生成的内容可能不正确。"/>
+                    <pic:cNvPr id="859265003" name="图片 1" descr="图形用户界面&#10;&#10;AI 生成的内容可能不正确。"/>
                     <pic:cNvPicPr/>
                   </pic:nvPicPr>
                   <pic:blipFill>
@@ -2272,7 +2271,7 @@
                   <pic:spPr>
                     <a:xfrm>
                       <a:off x="0" y="0"/>
-                      <a:ext cx="4202430" cy="2458085"/>
+                      <a:ext cx="3919855" cy="2195830"/>
                     </a:xfrm>
                     <a:prstGeom prst="rect">
                       <a:avLst/>
@@ -2292,43 +2291,22 @@
       </w:r>
       <w:r>
         <w:rPr>
-          <w:rFonts w:ascii="Arial" w:hAnsi="Arial" w:cs="Arial"/>
-          <w:b/>
-          <w:bCs/>
-          <w:sz w:val="22"/>
-          <w:szCs w:val="22"/>
-        </w:rPr>
-        <w:t>(1) Before any option is selected</w:t>
-      </w:r>
-    </w:p>
-    <w:p>
-      <w:pPr>
-        <w:rPr>
-          <w:rFonts w:ascii="Arial" w:hAnsi="Arial" w:cs="Arial"/>
-          <w:b/>
-          <w:bCs/>
-          <w:sz w:val="22"/>
-          <w:szCs w:val="22"/>
-        </w:rPr>
-      </w:pPr>
-      <w:r>
-        <w:rPr>
           <w:noProof/>
           <w14:ligatures w14:val="none"/>
         </w:rPr>
         <w:drawing>
-          <wp:anchor distT="0" distB="0" distL="114300" distR="114300" simplePos="0" relativeHeight="251660288" behindDoc="0" locked="0" layoutInCell="1" allowOverlap="1" wp14:anchorId="5BCBAD34" wp14:editId="118BA022">
+          <wp:anchor distT="0" distB="0" distL="114300" distR="114300" simplePos="0" relativeHeight="251671552" behindDoc="0" locked="0" layoutInCell="1" allowOverlap="1" wp14:anchorId="0521288C" wp14:editId="28E640EE">
             <wp:simplePos x="0" y="0"/>
-            <wp:positionH relativeFrom="column">
-              <wp:posOffset>-63500</wp:posOffset>
+            <wp:positionH relativeFrom="margin">
+              <wp:align>left</wp:align>
             </wp:positionH>
             <wp:positionV relativeFrom="paragraph">
-              <wp:posOffset>4827270</wp:posOffset>
+              <wp:posOffset>2287282</wp:posOffset>
             </wp:positionV>
-            <wp:extent cx="4542155" cy="2378075"/>
-            <wp:effectExtent l="0" t="0" r="0" b="3175"/>
+            <wp:extent cx="4399915" cy="2560955"/>
+            <wp:effectExtent l="0" t="0" r="635" b="0"/>
             <wp:wrapTopAndBottom/>
-            <wp:docPr id="483877798" name="图片 1" descr="图表, 直方图&#10;&#10;AI 生成的内容可能不正确。"/>
+            <wp:docPr id="2078178247" name="图片 1" descr="图表, 条形图&#10;&#10;AI 生成的内容可能不正确。"/>
             <wp:cNvGraphicFramePr>
               <a:graphicFrameLocks xmlns:a="http://schemas.openxmlformats.org/drawingml/2006/main" noChangeAspect="1"/>
             </wp:cNvGraphicFramePr>
@@ -2336,7 +2314,7 @@
               <a:graphicData uri="http://schemas.openxmlformats.org/drawingml/2006/picture">
                 <pic:pic xmlns:pic="http://schemas.openxmlformats.org/drawingml/2006/picture">
                   <pic:nvPicPr>
-                    <pic:cNvPr id="483877798" name="图片 1" descr="图表, 直方图&#10;&#10;AI 生成的内容可能不正确。"/>
+                    <pic:cNvPr id="2078178247" name="图片 1" descr="图表, 条形图&#10;&#10;AI 生成的内容可能不正确。"/>
                     <pic:cNvPicPr/>
                   </pic:nvPicPr>
                   <pic:blipFill>
@@ -2354,7 +2332,7 @@
                   <pic:spPr>
                     <a:xfrm>
                       <a:off x="0" y="0"/>
-                      <a:ext cx="4542155" cy="2378075"/>
+                      <a:ext cx="4399915" cy="2560955"/>
                     </a:xfrm>
                     <a:prstGeom prst="rect">
                       <a:avLst/>
@@ -2378,18 +2356,18 @@
           <w14:ligatures w14:val="none"/>
         </w:rPr>
         <w:drawing>
-          <wp:anchor distT="0" distB="0" distL="114300" distR="114300" simplePos="0" relativeHeight="251659264" behindDoc="0" locked="0" layoutInCell="1" allowOverlap="1" wp14:anchorId="1844D050" wp14:editId="47C2A6F3">
+          <wp:anchor distT="0" distB="0" distL="114300" distR="114300" simplePos="0" relativeHeight="251670528" behindDoc="0" locked="0" layoutInCell="1" allowOverlap="1" wp14:anchorId="737133C2" wp14:editId="4E5EE0E3">
             <wp:simplePos x="0" y="0"/>
             <wp:positionH relativeFrom="margin">
-              <wp:align>left</wp:align>
+              <wp:posOffset>-17780</wp:posOffset>
             </wp:positionH>
             <wp:positionV relativeFrom="paragraph">
-              <wp:posOffset>2623820</wp:posOffset>
+              <wp:posOffset>162610</wp:posOffset>
             </wp:positionV>
-            <wp:extent cx="4159250" cy="2205355"/>
-            <wp:effectExtent l="0" t="0" r="0" b="4445"/>
+            <wp:extent cx="4272915" cy="2272030"/>
+            <wp:effectExtent l="0" t="0" r="0" b="0"/>
             <wp:wrapTopAndBottom/>
-            <wp:docPr id="1542234455" name="图片 1" descr="图片包含 图表&#10;&#10;AI 生成的内容可能不正确。"/>
+            <wp:docPr id="775302369" name="图片 1" descr="图形用户界面, 应用程序, Teams&#10;&#10;AI 生成的内容可能不正确。"/>
             <wp:cNvGraphicFramePr>
               <a:graphicFrameLocks xmlns:a="http://schemas.openxmlformats.org/drawingml/2006/main" noChangeAspect="1"/>
             </wp:cNvGraphicFramePr>
@@ -2397,7 +2375,7 @@
               <a:graphicData uri="http://schemas.openxmlformats.org/drawingml/2006/picture">
                 <pic:pic xmlns:pic="http://schemas.openxmlformats.org/drawingml/2006/picture">
                   <pic:nvPicPr>
-                    <pic:cNvPr id="1542234455" name="图片 1" descr="图片包含 图表&#10;&#10;AI 生成的内容可能不正确。"/>
+                    <pic:cNvPr id="775302369" name="图片 1" descr="图形用户界面, 应用程序, Teams&#10;&#10;AI 生成的内容可能不正确。"/>
                     <pic:cNvPicPr/>
                   </pic:nvPicPr>
                   <pic:blipFill>
@@ -2415,7 +2393,7 @@
                   <pic:spPr>
                     <a:xfrm>
                       <a:off x="0" y="0"/>
-                      <a:ext cx="4159250" cy="2205355"/>
+                      <a:ext cx="4272915" cy="2272030"/>
                     </a:xfrm>
                     <a:prstGeom prst="rect">
                       <a:avLst/>
@@ -2433,9 +2411,7 @@
           </wp:anchor>
         </w:drawing>
       </w:r>
-    </w:p>
-    <w:p>
-      <w:pPr>
+      <w:r>
         <w:rPr>
           <w:rFonts w:ascii="Arial" w:hAnsi="Arial" w:cs="Arial"/>
           <w:b/>
@@ -2443,8 +2419,11 @@
           <w:sz w:val="22"/>
           <w:szCs w:val="22"/>
         </w:rPr>
-      </w:pPr>
-      <w:r>
+        <w:t>(1) Before any option is selected</w:t>
+      </w:r>
+    </w:p>
+    <w:p>
+      <w:pPr>
         <w:rPr>
           <w:rFonts w:ascii="Arial" w:hAnsi="Arial" w:cs="Arial"/>
           <w:b/>
@@ -2452,14 +2431,12 @@
           <w:sz w:val="22"/>
           <w:szCs w:val="22"/>
         </w:rPr>
-        <w:lastRenderedPageBreak/>
-        <w:t>(2) After an option is selected (should show a prediction)</w:t>
-      </w:r>
-    </w:p>
-    <w:p>
-      <w:pPr>
-        <w:rPr>
-          <w:rFonts w:ascii="Arial" w:hAnsi="Arial" w:cs="Arial" w:hint="eastAsia"/>
+      </w:pPr>
+    </w:p>
+    <w:p>
+      <w:pPr>
+        <w:rPr>
+          <w:rFonts w:ascii="Arial" w:hAnsi="Arial" w:cs="Arial"/>
           <w:b/>
           <w:bCs/>
           <w:sz w:val="22"/>
@@ -2468,13 +2445,13 @@
       </w:pPr>
       <w:r>
         <w:rPr>
-          <w:rFonts w:ascii="Arial" w:hAnsi="Arial" w:cs="Arial" w:hint="eastAsia"/>
+          <w:rFonts w:ascii="Arial" w:hAnsi="Arial" w:cs="Arial"/>
           <w:b/>
           <w:bCs/>
           <w:sz w:val="22"/>
           <w:szCs w:val="22"/>
         </w:rPr>
-        <w:t>Pre-set data</w:t>
+        <w:t>(2) After an option is selected (should show a prediction)</w:t>
       </w:r>
     </w:p>
     <w:p>
@@ -2489,22 +2466,43 @@
       </w:pPr>
       <w:r>
         <w:rPr>
+          <w:rFonts w:ascii="Arial" w:hAnsi="Arial" w:cs="Arial" w:hint="eastAsia"/>
+          <w:b/>
+          <w:bCs/>
+          <w:sz w:val="22"/>
+          <w:szCs w:val="22"/>
+        </w:rPr>
+        <w:t>Pre-set data</w:t>
+      </w:r>
+    </w:p>
+    <w:p>
+      <w:pPr>
+        <w:rPr>
+          <w:rFonts w:ascii="Arial" w:hAnsi="Arial" w:cs="Arial"/>
+          <w:b/>
+          <w:bCs/>
+          <w:sz w:val="22"/>
+          <w:szCs w:val="22"/>
+        </w:rPr>
+      </w:pPr>
+      <w:r>
+        <w:rPr>
           <w:noProof/>
           <w14:ligatures w14:val="none"/>
         </w:rPr>
         <w:drawing>
-          <wp:anchor distT="0" distB="0" distL="114300" distR="114300" simplePos="0" relativeHeight="251664384" behindDoc="0" locked="0" layoutInCell="1" allowOverlap="1" wp14:anchorId="779F9431" wp14:editId="49F62086">
+          <wp:anchor distT="0" distB="0" distL="114300" distR="114300" simplePos="0" relativeHeight="251674624" behindDoc="0" locked="0" layoutInCell="1" allowOverlap="1" wp14:anchorId="4D6E23CB" wp14:editId="4AB9A0E9">
             <wp:simplePos x="0" y="0"/>
             <wp:positionH relativeFrom="column">
               <wp:posOffset>0</wp:posOffset>
             </wp:positionH>
             <wp:positionV relativeFrom="paragraph">
-              <wp:posOffset>3185795</wp:posOffset>
+              <wp:posOffset>3256362</wp:posOffset>
             </wp:positionV>
-            <wp:extent cx="5731510" cy="3400425"/>
-            <wp:effectExtent l="0" t="0" r="2540" b="9525"/>
+            <wp:extent cx="5731510" cy="3441700"/>
+            <wp:effectExtent l="0" t="0" r="2540" b="6350"/>
             <wp:wrapTopAndBottom/>
-            <wp:docPr id="1858074898" name="图片 1" descr="图片包含 图形用户界面&#10;&#10;AI 生成的内容可能不正确。"/>
+            <wp:docPr id="735879835" name="图片 1" descr="图形用户界面, 应用程序&#10;&#10;AI 生成的内容可能不正确。"/>
             <wp:cNvGraphicFramePr>
               <a:graphicFrameLocks xmlns:a="http://schemas.openxmlformats.org/drawingml/2006/main" noChangeAspect="1"/>
             </wp:cNvGraphicFramePr>
@@ -2512,7 +2510,7 @@
               <a:graphicData uri="http://schemas.openxmlformats.org/drawingml/2006/picture">
                 <pic:pic xmlns:pic="http://schemas.openxmlformats.org/drawingml/2006/picture">
                   <pic:nvPicPr>
-                    <pic:cNvPr id="1858074898" name="图片 1" descr="图片包含 图形用户界面&#10;&#10;AI 生成的内容可能不正确。"/>
+                    <pic:cNvPr id="735879835" name="图片 1" descr="图形用户界面, 应用程序&#10;&#10;AI 生成的内容可能不正确。"/>
                     <pic:cNvPicPr/>
                   </pic:nvPicPr>
                   <pic:blipFill>
@@ -2530,7 +2528,7 @@
                   <pic:spPr>
                     <a:xfrm>
                       <a:off x="0" y="0"/>
-                      <a:ext cx="5731510" cy="3400425"/>
+                      <a:ext cx="5731510" cy="3441700"/>
                     </a:xfrm>
                     <a:prstGeom prst="rect">
                       <a:avLst/>
@@ -2548,18 +2546,18 @@
           <w14:ligatures w14:val="none"/>
         </w:rPr>
         <w:drawing>
-          <wp:anchor distT="0" distB="0" distL="114300" distR="114300" simplePos="0" relativeHeight="251663360" behindDoc="0" locked="0" layoutInCell="1" allowOverlap="1" wp14:anchorId="1AF88CC2" wp14:editId="1F77975A">
+          <wp:anchor distT="0" distB="0" distL="114300" distR="114300" simplePos="0" relativeHeight="251673600" behindDoc="0" locked="0" layoutInCell="1" allowOverlap="1" wp14:anchorId="043959E4" wp14:editId="7605772B">
             <wp:simplePos x="0" y="0"/>
             <wp:positionH relativeFrom="column">
               <wp:posOffset>0</wp:posOffset>
             </wp:positionH>
             <wp:positionV relativeFrom="paragraph">
-              <wp:posOffset>-1905</wp:posOffset>
+              <wp:posOffset>-2886</wp:posOffset>
             </wp:positionV>
-            <wp:extent cx="5731510" cy="3185795"/>
+            <wp:extent cx="5731510" cy="3262630"/>
             <wp:effectExtent l="0" t="0" r="2540" b="0"/>
             <wp:wrapTopAndBottom/>
-            <wp:docPr id="597768652" name="图片 1" descr="图形用户界面, 应用程序&#10;&#10;AI 生成的内容可能不正确。"/>
+            <wp:docPr id="530082154" name="图片 1" descr="图形用户界面, 应用程序&#10;&#10;AI 生成的内容可能不正确。"/>
             <wp:cNvGraphicFramePr>
               <a:graphicFrameLocks xmlns:a="http://schemas.openxmlformats.org/drawingml/2006/main" noChangeAspect="1"/>
             </wp:cNvGraphicFramePr>
@@ -2567,7 +2565,7 @@
               <a:graphicData uri="http://schemas.openxmlformats.org/drawingml/2006/picture">
                 <pic:pic xmlns:pic="http://schemas.openxmlformats.org/drawingml/2006/picture">
                   <pic:nvPicPr>
-                    <pic:cNvPr id="597768652" name="图片 1" descr="图形用户界面, 应用程序&#10;&#10;AI 生成的内容可能不正确。"/>
+                    <pic:cNvPr id="530082154" name="图片 1" descr="图形用户界面, 应用程序&#10;&#10;AI 生成的内容可能不正确。"/>
                     <pic:cNvPicPr/>
                   </pic:nvPicPr>
                   <pic:blipFill>
@@ -2585,7 +2583,7 @@
                   <pic:spPr>
                     <a:xfrm>
                       <a:off x="0" y="0"/>
-                      <a:ext cx="5731510" cy="3185795"/>
+                      <a:ext cx="5731510" cy="3262630"/>
                     </a:xfrm>
                     <a:prstGeom prst="rect">
                       <a:avLst/>
@@ -2622,7 +2620,7 @@
     <w:p>
       <w:pPr>
         <w:rPr>
-          <w:rFonts w:ascii="Arial" w:hAnsi="Arial" w:cs="Arial" w:hint="eastAsia"/>
+          <w:rFonts w:ascii="Arial" w:hAnsi="Arial" w:cs="Arial"/>
           <w:b/>
           <w:bCs/>
           <w:sz w:val="22"/>
@@ -2636,18 +2634,18 @@
         </w:rPr>
         <w:lastRenderedPageBreak/>
         <w:drawing>
-          <wp:anchor distT="0" distB="0" distL="114300" distR="114300" simplePos="0" relativeHeight="251662336" behindDoc="0" locked="0" layoutInCell="1" allowOverlap="1" wp14:anchorId="09EA1C05" wp14:editId="338F6738">
+          <wp:anchor distT="0" distB="0" distL="114300" distR="114300" simplePos="0" relativeHeight="251676672" behindDoc="0" locked="0" layoutInCell="1" allowOverlap="1" wp14:anchorId="350D340D" wp14:editId="2844E4AD">
             <wp:simplePos x="0" y="0"/>
             <wp:positionH relativeFrom="margin">
               <wp:align>left</wp:align>
             </wp:positionH>
             <wp:positionV relativeFrom="paragraph">
-              <wp:posOffset>2432050</wp:posOffset>
+              <wp:posOffset>3150235</wp:posOffset>
             </wp:positionV>
-            <wp:extent cx="4521200" cy="2419985"/>
+            <wp:extent cx="5241925" cy="3109595"/>
             <wp:effectExtent l="0" t="0" r="0" b="0"/>
             <wp:wrapTopAndBottom/>
-            <wp:docPr id="1418178506" name="图片 1" descr="图片包含 图形用户界面&#10;&#10;AI 生成的内容可能不正确。"/>
+            <wp:docPr id="1395071313" name="图片 1" descr="图表&#10;&#10;AI 生成的内容可能不正确。"/>
             <wp:cNvGraphicFramePr>
               <a:graphicFrameLocks xmlns:a="http://schemas.openxmlformats.org/drawingml/2006/main" noChangeAspect="1"/>
             </wp:cNvGraphicFramePr>
@@ -2655,7 +2653,7 @@
               <a:graphicData uri="http://schemas.openxmlformats.org/drawingml/2006/picture">
                 <pic:pic xmlns:pic="http://schemas.openxmlformats.org/drawingml/2006/picture">
                   <pic:nvPicPr>
-                    <pic:cNvPr id="1418178506" name="图片 1" descr="图片包含 图形用户界面&#10;&#10;AI 生成的内容可能不正确。"/>
+                    <pic:cNvPr id="1395071313" name="图片 1" descr="图表&#10;&#10;AI 生成的内容可能不正确。"/>
                     <pic:cNvPicPr/>
                   </pic:nvPicPr>
                   <pic:blipFill>
@@ -2673,7 +2671,7 @@
                   <pic:spPr>
                     <a:xfrm>
                       <a:off x="0" y="0"/>
-                      <a:ext cx="4521200" cy="2419985"/>
+                      <a:ext cx="5241925" cy="3109595"/>
                     </a:xfrm>
                     <a:prstGeom prst="rect">
                       <a:avLst/>
@@ -2697,10 +2695,18 @@
           <w14:ligatures w14:val="none"/>
         </w:rPr>
         <w:drawing>
-          <wp:inline distT="0" distB="0" distL="0" distR="0" wp14:anchorId="33B98BDA" wp14:editId="641471EF">
-            <wp:extent cx="4260850" cy="2252689"/>
-            <wp:effectExtent l="0" t="0" r="6350" b="0"/>
-            <wp:docPr id="1242605016" name="图片 1" descr="图形用户界面&#10;&#10;AI 生成的内容可能不正确。"/>
+          <wp:anchor distT="0" distB="0" distL="114300" distR="114300" simplePos="0" relativeHeight="251675648" behindDoc="0" locked="0" layoutInCell="1" allowOverlap="1" wp14:anchorId="2EF44D61" wp14:editId="4D469813">
+            <wp:simplePos x="0" y="0"/>
+            <wp:positionH relativeFrom="column">
+              <wp:posOffset>0</wp:posOffset>
+            </wp:positionH>
+            <wp:positionV relativeFrom="paragraph">
+              <wp:posOffset>0</wp:posOffset>
+            </wp:positionV>
+            <wp:extent cx="5731510" cy="3147060"/>
+            <wp:effectExtent l="0" t="0" r="2540" b="0"/>
+            <wp:wrapTopAndBottom/>
+            <wp:docPr id="1705530842" name="图片 1" descr="图形用户界面, 应用程序&#10;&#10;AI 生成的内容可能不正确。"/>
             <wp:cNvGraphicFramePr>
               <a:graphicFrameLocks xmlns:a="http://schemas.openxmlformats.org/drawingml/2006/main" noChangeAspect="1"/>
             </wp:cNvGraphicFramePr>
@@ -2708,11 +2714,17 @@
               <a:graphicData uri="http://schemas.openxmlformats.org/drawingml/2006/picture">
                 <pic:pic xmlns:pic="http://schemas.openxmlformats.org/drawingml/2006/picture">
                   <pic:nvPicPr>
-                    <pic:cNvPr id="1242605016" name="图片 1" descr="图形用户界面&#10;&#10;AI 生成的内容可能不正确。"/>
+                    <pic:cNvPr id="1705530842" name="图片 1" descr="图形用户界面, 应用程序&#10;&#10;AI 生成的内容可能不正确。"/>
                     <pic:cNvPicPr/>
                   </pic:nvPicPr>
                   <pic:blipFill>
-                    <a:blip r:embed="rId25"/>
+                    <a:blip r:embed="rId25" cstate="print">
+                      <a:extLst>
+                        <a:ext uri="{28A0092B-C50C-407E-A947-70E740481C1C}">
+                          <a14:useLocalDpi xmlns:a14="http://schemas.microsoft.com/office/drawing/2010/main" val="0"/>
+                        </a:ext>
+                      </a:extLst>
+                    </a:blip>
                     <a:stretch>
                       <a:fillRect/>
                     </a:stretch>
@@ -2720,7 +2732,7 @@
                   <pic:spPr>
                     <a:xfrm>
                       <a:off x="0" y="0"/>
-                      <a:ext cx="4268385" cy="2256673"/>
+                      <a:ext cx="5731510" cy="3147060"/>
                     </a:xfrm>
                     <a:prstGeom prst="rect">
                       <a:avLst/>
@@ -2729,7 +2741,7 @@
                 </pic:pic>
               </a:graphicData>
             </a:graphic>
-          </wp:inline>
+          </wp:anchor>
         </w:drawing>
       </w:r>
     </w:p>
@@ -2778,7 +2790,7 @@
     <w:p>
       <w:pPr>
         <w:rPr>
-          <w:rFonts w:ascii="Arial" w:hAnsi="Arial" w:cs="Arial" w:hint="eastAsia"/>
+          <w:rFonts w:ascii="Arial" w:hAnsi="Arial" w:cs="Arial"/>
           <w:b/>
           <w:bCs/>
           <w:sz w:val="22"/>
@@ -2806,16 +2818,53 @@
           <w:szCs w:val="22"/>
         </w:rPr>
       </w:pPr>
+    </w:p>
+    <w:p>
+      <w:pPr>
+        <w:rPr>
+          <w:rFonts w:ascii="Arial" w:hAnsi="Arial" w:cs="Arial"/>
+          <w:sz w:val="22"/>
+          <w:szCs w:val="22"/>
+        </w:rPr>
+      </w:pPr>
+      <w:r>
+        <w:rPr>
+          <w:rFonts w:ascii="Arial" w:hAnsi="Arial" w:cs="Arial"/>
+          <w:sz w:val="22"/>
+          <w:szCs w:val="22"/>
+        </w:rPr>
+        <w:br w:type="page"/>
+      </w:r>
+    </w:p>
+    <w:p>
+      <w:pPr>
+        <w:rPr>
+          <w:rFonts w:ascii="Arial" w:hAnsi="Arial" w:cs="Arial"/>
+          <w:b/>
+          <w:bCs/>
+          <w:sz w:val="22"/>
+          <w:szCs w:val="22"/>
+        </w:rPr>
+      </w:pPr>
       <w:r>
         <w:rPr>
           <w:noProof/>
           <w14:ligatures w14:val="none"/>
         </w:rPr>
+        <w:lastRenderedPageBreak/>
         <w:drawing>
-          <wp:inline distT="0" distB="0" distL="0" distR="0" wp14:anchorId="081FBEBD" wp14:editId="27B22A79">
-            <wp:extent cx="5321300" cy="3059777"/>
-            <wp:effectExtent l="0" t="0" r="0" b="7620"/>
-            <wp:docPr id="361361061" name="图片 1" descr="图形用户界面, 应用程序&#10;&#10;AI 生成的内容可能不正确。"/>
+          <wp:anchor distT="0" distB="0" distL="114300" distR="114300" simplePos="0" relativeHeight="251680768" behindDoc="0" locked="0" layoutInCell="1" allowOverlap="1" wp14:anchorId="4CC67014" wp14:editId="69CF358F">
+            <wp:simplePos x="0" y="0"/>
+            <wp:positionH relativeFrom="margin">
+              <wp:align>left</wp:align>
+            </wp:positionH>
+            <wp:positionV relativeFrom="paragraph">
+              <wp:posOffset>5205730</wp:posOffset>
+            </wp:positionV>
+            <wp:extent cx="5748655" cy="2858770"/>
+            <wp:effectExtent l="0" t="0" r="4445" b="0"/>
+            <wp:wrapTopAndBottom/>
+            <wp:docPr id="305723370" name="图片 1" descr="图形用户界面, 应用程序&#10;&#10;AI 生成的内容可能不正确。"/>
             <wp:cNvGraphicFramePr>
               <a:graphicFrameLocks xmlns:a="http://schemas.openxmlformats.org/drawingml/2006/main" noChangeAspect="1"/>
             </wp:cNvGraphicFramePr>
@@ -2823,11 +2872,17 @@
               <a:graphicData uri="http://schemas.openxmlformats.org/drawingml/2006/picture">
                 <pic:pic xmlns:pic="http://schemas.openxmlformats.org/drawingml/2006/picture">
                   <pic:nvPicPr>
-                    <pic:cNvPr id="361361061" name="图片 1" descr="图形用户界面, 应用程序&#10;&#10;AI 生成的内容可能不正确。"/>
+                    <pic:cNvPr id="305723370" name="图片 1" descr="图形用户界面, 应用程序&#10;&#10;AI 生成的内容可能不正确。"/>
                     <pic:cNvPicPr/>
                   </pic:nvPicPr>
                   <pic:blipFill>
-                    <a:blip r:embed="rId26"/>
+                    <a:blip r:embed="rId26" cstate="print">
+                      <a:extLst>
+                        <a:ext uri="{28A0092B-C50C-407E-A947-70E740481C1C}">
+                          <a14:useLocalDpi xmlns:a14="http://schemas.microsoft.com/office/drawing/2010/main" val="0"/>
+                        </a:ext>
+                      </a:extLst>
+                    </a:blip>
                     <a:stretch>
                       <a:fillRect/>
                     </a:stretch>
@@ -2835,7 +2890,7 @@
                   <pic:spPr>
                     <a:xfrm>
                       <a:off x="0" y="0"/>
-                      <a:ext cx="5323125" cy="3060826"/>
+                      <a:ext cx="5748655" cy="2858770"/>
                     </a:xfrm>
                     <a:prstGeom prst="rect">
                       <a:avLst/>
@@ -2844,39 +2899,33 @@
                 </pic:pic>
               </a:graphicData>
             </a:graphic>
-          </wp:inline>
+            <wp14:sizeRelH relativeFrom="margin">
+              <wp14:pctWidth>0</wp14:pctWidth>
+            </wp14:sizeRelH>
+            <wp14:sizeRelV relativeFrom="margin">
+              <wp14:pctHeight>0</wp14:pctHeight>
+            </wp14:sizeRelV>
+          </wp:anchor>
         </w:drawing>
       </w:r>
-    </w:p>
-    <w:p>
-      <w:pPr>
-        <w:rPr>
-          <w:rFonts w:ascii="Arial" w:hAnsi="Arial" w:cs="Arial"/>
-          <w:b/>
-          <w:bCs/>
-          <w:sz w:val="22"/>
-          <w:szCs w:val="22"/>
-        </w:rPr>
-      </w:pPr>
       <w:r>
         <w:rPr>
           <w:noProof/>
           <w14:ligatures w14:val="none"/>
         </w:rPr>
-        <w:lastRenderedPageBreak/>
         <w:drawing>
-          <wp:anchor distT="0" distB="0" distL="114300" distR="114300" simplePos="0" relativeHeight="251666432" behindDoc="0" locked="0" layoutInCell="1" allowOverlap="1" wp14:anchorId="23D48ECA" wp14:editId="261CA269">
+          <wp:anchor distT="0" distB="0" distL="114300" distR="114300" simplePos="0" relativeHeight="251679744" behindDoc="0" locked="0" layoutInCell="1" allowOverlap="1" wp14:anchorId="059D1DDF" wp14:editId="6C2F3348">
             <wp:simplePos x="0" y="0"/>
             <wp:positionH relativeFrom="margin">
-              <wp:posOffset>-44450</wp:posOffset>
+              <wp:posOffset>-18560</wp:posOffset>
             </wp:positionH>
             <wp:positionV relativeFrom="paragraph">
-              <wp:posOffset>2984500</wp:posOffset>
+              <wp:posOffset>2362891</wp:posOffset>
             </wp:positionV>
-            <wp:extent cx="4851400" cy="2892425"/>
-            <wp:effectExtent l="0" t="0" r="6350" b="3175"/>
+            <wp:extent cx="4336415" cy="2544445"/>
+            <wp:effectExtent l="0" t="0" r="6985" b="8255"/>
             <wp:wrapTopAndBottom/>
-            <wp:docPr id="1898829766" name="图片 1" descr="图形用户界面, 应用程序&#10;&#10;AI 生成的内容可能不正确。"/>
+            <wp:docPr id="1227738265" name="图片 1" descr="图片包含 应用程序&#10;&#10;AI 生成的内容可能不正确。"/>
             <wp:cNvGraphicFramePr>
               <a:graphicFrameLocks xmlns:a="http://schemas.openxmlformats.org/drawingml/2006/main" noChangeAspect="1"/>
             </wp:cNvGraphicFramePr>
@@ -2884,7 +2933,7 @@
               <a:graphicData uri="http://schemas.openxmlformats.org/drawingml/2006/picture">
                 <pic:pic xmlns:pic="http://schemas.openxmlformats.org/drawingml/2006/picture">
                   <pic:nvPicPr>
-                    <pic:cNvPr id="1898829766" name="图片 1" descr="图形用户界面, 应用程序&#10;&#10;AI 生成的内容可能不正确。"/>
+                    <pic:cNvPr id="1227738265" name="图片 1" descr="图片包含 应用程序&#10;&#10;AI 生成的内容可能不正确。"/>
                     <pic:cNvPicPr/>
                   </pic:nvPicPr>
                   <pic:blipFill>
@@ -2902,7 +2951,7 @@
                   <pic:spPr>
                     <a:xfrm>
                       <a:off x="0" y="0"/>
-                      <a:ext cx="4851400" cy="2892425"/>
+                      <a:ext cx="4336415" cy="2544445"/>
                     </a:xfrm>
                     <a:prstGeom prst="rect">
                       <a:avLst/>
@@ -2926,18 +2975,18 @@
           <w14:ligatures w14:val="none"/>
         </w:rPr>
         <w:drawing>
-          <wp:anchor distT="0" distB="0" distL="114300" distR="114300" simplePos="0" relativeHeight="251665408" behindDoc="0" locked="0" layoutInCell="1" allowOverlap="1" wp14:anchorId="30598C0A" wp14:editId="3B437642">
+          <wp:anchor distT="0" distB="0" distL="114300" distR="114300" simplePos="0" relativeHeight="251678720" behindDoc="0" locked="0" layoutInCell="1" allowOverlap="1" wp14:anchorId="71C475B6" wp14:editId="635C6F85">
             <wp:simplePos x="0" y="0"/>
             <wp:positionH relativeFrom="margin">
-              <wp:align>left</wp:align>
+              <wp:posOffset>17780</wp:posOffset>
             </wp:positionH>
             <wp:positionV relativeFrom="paragraph">
               <wp:posOffset>0</wp:posOffset>
             </wp:positionV>
-            <wp:extent cx="4699000" cy="2753995"/>
-            <wp:effectExtent l="0" t="0" r="6350" b="8255"/>
+            <wp:extent cx="4506595" cy="2244725"/>
+            <wp:effectExtent l="0" t="0" r="8255" b="3175"/>
             <wp:wrapTopAndBottom/>
-            <wp:docPr id="245359366" name="图片 1" descr="图形用户界面&#10;&#10;AI 生成的内容可能不正确。"/>
+            <wp:docPr id="958104576" name="图片 1" descr="图形用户界面, 应用程序&#10;&#10;AI 生成的内容可能不正确。"/>
             <wp:cNvGraphicFramePr>
               <a:graphicFrameLocks xmlns:a="http://schemas.openxmlformats.org/drawingml/2006/main" noChangeAspect="1"/>
             </wp:cNvGraphicFramePr>
@@ -2945,7 +2994,7 @@
               <a:graphicData uri="http://schemas.openxmlformats.org/drawingml/2006/picture">
                 <pic:pic xmlns:pic="http://schemas.openxmlformats.org/drawingml/2006/picture">
                   <pic:nvPicPr>
-                    <pic:cNvPr id="245359366" name="图片 1" descr="图形用户界面&#10;&#10;AI 生成的内容可能不正确。"/>
+                    <pic:cNvPr id="958104576" name="图片 1" descr="图形用户界面, 应用程序&#10;&#10;AI 生成的内容可能不正确。"/>
                     <pic:cNvPicPr/>
                   </pic:nvPicPr>
                   <pic:blipFill>
@@ -2963,7 +3012,7 @@
                   <pic:spPr>
                     <a:xfrm>
                       <a:off x="0" y="0"/>
-                      <a:ext cx="4701541" cy="2756096"/>
+                      <a:ext cx="4506595" cy="2244725"/>
                     </a:xfrm>
                     <a:prstGeom prst="rect">
                       <a:avLst/>
@@ -2994,10 +3043,37 @@
     </w:p>
     <w:p>
       <w:pPr>
-        <w:rPr>
-          <w:rFonts w:ascii="Arial" w:hAnsi="Arial" w:cs="Arial"/>
+        <w:spacing w:after="0" w:line="240" w:lineRule="auto"/>
+        <w:rPr>
+          <w:rFonts w:ascii="Arial" w:hAnsi="Arial" w:cs="Arial" w:hint="eastAsia"/>
+          <w:b/>
+          <w:bCs/>
           <w:sz w:val="22"/>
           <w:szCs w:val="22"/>
+          <w:u w:val="single"/>
+        </w:rPr>
+      </w:pPr>
+      <w:r>
+        <w:rPr>
+          <w:rFonts w:ascii="Arial" w:hAnsi="Arial" w:cs="Arial"/>
+          <w:b/>
+          <w:bCs/>
+          <w:sz w:val="22"/>
+          <w:szCs w:val="22"/>
+          <w:u w:val="single"/>
+        </w:rPr>
+        <w:br w:type="page"/>
+      </w:r>
+    </w:p>
+    <w:p>
+      <w:pPr>
+        <w:rPr>
+          <w:rFonts w:ascii="Arial" w:hAnsi="Arial" w:cs="Arial"/>
+          <w:b/>
+          <w:bCs/>
+          <w:sz w:val="22"/>
+          <w:szCs w:val="22"/>
+          <w:u w:val="single"/>
         </w:rPr>
       </w:pPr>
       <w:r>
@@ -3005,19 +3081,20 @@
           <w:noProof/>
           <w14:ligatures w14:val="none"/>
         </w:rPr>
+        <w:lastRenderedPageBreak/>
         <w:drawing>
-          <wp:anchor distT="0" distB="0" distL="114300" distR="114300" simplePos="0" relativeHeight="251667456" behindDoc="0" locked="0" layoutInCell="1" allowOverlap="1" wp14:anchorId="211FED45" wp14:editId="6D49976F">
+          <wp:anchor distT="0" distB="0" distL="114300" distR="114300" simplePos="0" relativeHeight="251681792" behindDoc="0" locked="0" layoutInCell="1" allowOverlap="1" wp14:anchorId="5D69391C" wp14:editId="13EC17DF">
             <wp:simplePos x="0" y="0"/>
             <wp:positionH relativeFrom="margin">
               <wp:align>left</wp:align>
             </wp:positionH>
             <wp:positionV relativeFrom="paragraph">
-              <wp:posOffset>3001645</wp:posOffset>
+              <wp:posOffset>0</wp:posOffset>
             </wp:positionV>
-            <wp:extent cx="4976495" cy="2794000"/>
-            <wp:effectExtent l="0" t="0" r="0" b="6350"/>
+            <wp:extent cx="4354195" cy="2574290"/>
+            <wp:effectExtent l="0" t="0" r="8255" b="0"/>
             <wp:wrapTopAndBottom/>
-            <wp:docPr id="535841218" name="图片 1" descr="图表&#10;&#10;AI 生成的内容可能不正确。"/>
+            <wp:docPr id="596452373" name="图片 1" descr="图形用户界面, 应用程序&#10;&#10;AI 生成的内容可能不正确。"/>
             <wp:cNvGraphicFramePr>
               <a:graphicFrameLocks xmlns:a="http://schemas.openxmlformats.org/drawingml/2006/main" noChangeAspect="1"/>
             </wp:cNvGraphicFramePr>
@@ -3025,7 +3102,7 @@
               <a:graphicData uri="http://schemas.openxmlformats.org/drawingml/2006/picture">
                 <pic:pic xmlns:pic="http://schemas.openxmlformats.org/drawingml/2006/picture">
                   <pic:nvPicPr>
-                    <pic:cNvPr id="535841218" name="图片 1" descr="图表&#10;&#10;AI 生成的内容可能不正确。"/>
+                    <pic:cNvPr id="596452373" name="图片 1" descr="图形用户界面, 应用程序&#10;&#10;AI 生成的内容可能不正确。"/>
                     <pic:cNvPicPr/>
                   </pic:nvPicPr>
                   <pic:blipFill>
@@ -3043,7 +3120,7 @@
                   <pic:spPr>
                     <a:xfrm>
                       <a:off x="0" y="0"/>
-                      <a:ext cx="4976495" cy="2794000"/>
+                      <a:ext cx="4354195" cy="2574290"/>
                     </a:xfrm>
                     <a:prstGeom prst="rect">
                       <a:avLst/>
@@ -3052,16 +3129,14 @@
                 </pic:pic>
               </a:graphicData>
             </a:graphic>
+            <wp14:sizeRelH relativeFrom="margin">
+              <wp14:pctWidth>0</wp14:pctWidth>
+            </wp14:sizeRelH>
+            <wp14:sizeRelV relativeFrom="margin">
+              <wp14:pctHeight>0</wp14:pctHeight>
+            </wp14:sizeRelV>
           </wp:anchor>
         </w:drawing>
-      </w:r>
-      <w:r>
-        <w:rPr>
-          <w:rFonts w:ascii="Arial" w:hAnsi="Arial" w:cs="Arial"/>
-          <w:sz w:val="22"/>
-          <w:szCs w:val="22"/>
-        </w:rPr>
-        <w:br w:type="page"/>
       </w:r>
     </w:p>
     <w:p>
@@ -3075,23 +3150,40 @@
       </w:pPr>
       <w:r>
         <w:rPr>
+          <w:rFonts w:ascii="Arial" w:hAnsi="Arial" w:cs="Arial"/>
+          <w:b/>
+          <w:bCs/>
+          <w:sz w:val="22"/>
+          <w:szCs w:val="22"/>
+          <w:u w:val="single"/>
+        </w:rPr>
+        <w:t>Screenshots of version control or development logs (if applicable)</w:t>
+      </w:r>
+    </w:p>
+    <w:p>
+      <w:pPr>
+        <w:rPr>
+          <w:rFonts w:ascii="Arial" w:hAnsi="Arial" w:cs="Arial"/>
+        </w:rPr>
+      </w:pPr>
+      <w:r>
+        <w:rPr>
           <w:noProof/>
           <w14:ligatures w14:val="none"/>
         </w:rPr>
-        <w:lastRenderedPageBreak/>
         <w:drawing>
-          <wp:anchor distT="0" distB="0" distL="114300" distR="114300" simplePos="0" relativeHeight="251668480" behindDoc="0" locked="0" layoutInCell="1" allowOverlap="1" wp14:anchorId="520D88E8" wp14:editId="7C3ADA07">
+          <wp:anchor distT="0" distB="0" distL="114300" distR="114300" simplePos="0" relativeHeight="251669504" behindDoc="0" locked="0" layoutInCell="1" allowOverlap="1" wp14:anchorId="732EE010" wp14:editId="636AD14B">
             <wp:simplePos x="0" y="0"/>
-            <wp:positionH relativeFrom="column">
-              <wp:posOffset>-177800</wp:posOffset>
+            <wp:positionH relativeFrom="margin">
+              <wp:posOffset>-290195</wp:posOffset>
             </wp:positionH>
             <wp:positionV relativeFrom="paragraph">
-              <wp:posOffset>3587750</wp:posOffset>
+              <wp:posOffset>245110</wp:posOffset>
             </wp:positionV>
-            <wp:extent cx="5731510" cy="3265805"/>
-            <wp:effectExtent l="0" t="0" r="2540" b="0"/>
+            <wp:extent cx="4784725" cy="2498725"/>
+            <wp:effectExtent l="0" t="0" r="0" b="0"/>
             <wp:wrapTopAndBottom/>
-            <wp:docPr id="1919016752" name="图片 1" descr="图形用户界面, 文本&#10;&#10;AI 生成的内容可能不正确。"/>
+            <wp:docPr id="1186276494" name="图片 1" descr="图形用户界面, 文本, 应用程序, 电子邮件&#10;&#10;AI 生成的内容可能不正确。"/>
             <wp:cNvGraphicFramePr>
               <a:graphicFrameLocks xmlns:a="http://schemas.openxmlformats.org/drawingml/2006/main" noChangeAspect="1"/>
             </wp:cNvGraphicFramePr>
@@ -3099,7 +3191,7 @@
               <a:graphicData uri="http://schemas.openxmlformats.org/drawingml/2006/picture">
                 <pic:pic xmlns:pic="http://schemas.openxmlformats.org/drawingml/2006/picture">
                   <pic:nvPicPr>
-                    <pic:cNvPr id="1919016752" name="图片 1" descr="图形用户界面, 文本&#10;&#10;AI 生成的内容可能不正确。"/>
+                    <pic:cNvPr id="1186276494" name="图片 1" descr="图形用户界面, 文本, 应用程序, 电子邮件&#10;&#10;AI 生成的内容可能不正确。"/>
                     <pic:cNvPicPr/>
                   </pic:nvPicPr>
                   <pic:blipFill>
@@ -3117,7 +3209,7 @@
                   <pic:spPr>
                     <a:xfrm>
                       <a:off x="0" y="0"/>
-                      <a:ext cx="5731510" cy="3265805"/>
+                      <a:ext cx="4784725" cy="2498725"/>
                     </a:xfrm>
                     <a:prstGeom prst="rect">
                       <a:avLst/>
@@ -3126,6 +3218,12 @@
                 </pic:pic>
               </a:graphicData>
             </a:graphic>
+            <wp14:sizeRelH relativeFrom="margin">
+              <wp14:pctWidth>0</wp14:pctWidth>
+            </wp14:sizeRelH>
+            <wp14:sizeRelV relativeFrom="margin">
+              <wp14:pctHeight>0</wp14:pctHeight>
+            </wp14:sizeRelV>
           </wp:anchor>
         </w:drawing>
       </w:r>
@@ -3135,18 +3233,18 @@
           <w14:ligatures w14:val="none"/>
         </w:rPr>
         <w:drawing>
-          <wp:anchor distT="0" distB="0" distL="114300" distR="114300" simplePos="0" relativeHeight="251669504" behindDoc="0" locked="0" layoutInCell="1" allowOverlap="1" wp14:anchorId="732EE010" wp14:editId="3B4FB761">
+          <wp:anchor distT="0" distB="0" distL="114300" distR="114300" simplePos="0" relativeHeight="251668480" behindDoc="0" locked="0" layoutInCell="1" allowOverlap="1" wp14:anchorId="520D88E8" wp14:editId="6F492058">
             <wp:simplePos x="0" y="0"/>
             <wp:positionH relativeFrom="margin">
-              <wp:posOffset>31750</wp:posOffset>
+              <wp:posOffset>-588048</wp:posOffset>
             </wp:positionH>
             <wp:positionV relativeFrom="paragraph">
-              <wp:posOffset>374650</wp:posOffset>
+              <wp:posOffset>2904842</wp:posOffset>
             </wp:positionV>
-            <wp:extent cx="5774055" cy="3016250"/>
-            <wp:effectExtent l="0" t="0" r="0" b="0"/>
+            <wp:extent cx="4925060" cy="2806065"/>
+            <wp:effectExtent l="0" t="0" r="8890" b="0"/>
             <wp:wrapTopAndBottom/>
-            <wp:docPr id="1186276494" name="图片 1" descr="图形用户界面, 文本, 应用程序, 电子邮件&#10;&#10;AI 生成的内容可能不正确。"/>
+            <wp:docPr id="1919016752" name="图片 1" descr="图形用户界面, 文本&#10;&#10;AI 生成的内容可能不正确。"/>
             <wp:cNvGraphicFramePr>
               <a:graphicFrameLocks xmlns:a="http://schemas.openxmlformats.org/drawingml/2006/main" noChangeAspect="1"/>
             </wp:cNvGraphicFramePr>
@@ -3154,7 +3252,7 @@
               <a:graphicData uri="http://schemas.openxmlformats.org/drawingml/2006/picture">
                 <pic:pic xmlns:pic="http://schemas.openxmlformats.org/drawingml/2006/picture">
                   <pic:nvPicPr>
-                    <pic:cNvPr id="1186276494" name="图片 1" descr="图形用户界面, 文本, 应用程序, 电子邮件&#10;&#10;AI 生成的内容可能不正确。"/>
+                    <pic:cNvPr id="1919016752" name="图片 1" descr="图形用户界面, 文本&#10;&#10;AI 生成的内容可能不正确。"/>
                     <pic:cNvPicPr/>
                   </pic:nvPicPr>
                   <pic:blipFill>
@@ -3172,7 +3270,7 @@
                   <pic:spPr>
                     <a:xfrm>
                       <a:off x="0" y="0"/>
-                      <a:ext cx="5774055" cy="3016250"/>
+                      <a:ext cx="4925060" cy="2806065"/>
                     </a:xfrm>
                     <a:prstGeom prst="rect">
                       <a:avLst/>
@@ -3190,24 +3288,6 @@
           </wp:anchor>
         </w:drawing>
       </w:r>
-      <w:r>
-        <w:rPr>
-          <w:rFonts w:ascii="Arial" w:hAnsi="Arial" w:cs="Arial"/>
-          <w:b/>
-          <w:bCs/>
-          <w:sz w:val="22"/>
-          <w:szCs w:val="22"/>
-          <w:u w:val="single"/>
-        </w:rPr>
-        <w:t>Screenshots of version control or development logs (if applicable)</w:t>
-      </w:r>
-    </w:p>
-    <w:p>
-      <w:pPr>
-        <w:rPr>
-          <w:rFonts w:ascii="Arial" w:hAnsi="Arial" w:cs="Arial"/>
-        </w:rPr>
-      </w:pPr>
     </w:p>
     <w:sectPr>
       <w:headerReference w:type="default" r:id="rId32"/>
@@ -4805,21 +4885,6 @@
 </file>
 
 <file path=customXml/item2.xml><?xml version="1.0" encoding="utf-8"?>
-<?mso-contentType ?>
-<FormTemplates xmlns="http://schemas.microsoft.com/sharepoint/v3/contenttype/forms">
-  <Display>DocumentLibraryForm</Display>
-  <Edit>DocumentLibraryForm</Edit>
-  <New>DocumentLibraryForm</New>
-</FormTemplates>
-</file>
-
-<file path=customXml/item3.xml><?xml version="1.0" encoding="utf-8"?>
-<p:properties xmlns:p="http://schemas.microsoft.com/office/2006/metadata/properties" xmlns:xsi="http://www.w3.org/2001/XMLSchema-instance" xmlns:pc="http://schemas.microsoft.com/office/infopath/2007/PartnerControls">
-  <documentManagement/>
-</p:properties>
-</file>
-
-<file path=customXml/item4.xml><?xml version="1.0" encoding="utf-8"?>
 <ct:contentTypeSchema xmlns:ct="http://schemas.microsoft.com/office/2006/metadata/contentType" xmlns:ma="http://schemas.microsoft.com/office/2006/metadata/properties/metaAttributes" ct:_="" ma:_="" ma:contentTypeName="Document" ma:contentTypeID="0x010100D6545C4DACC92340AB17033E3A6DD483" ma:contentTypeVersion="7" ma:contentTypeDescription="Create a new document." ma:contentTypeScope="" ma:versionID="6f6f15b7efb541e43d43c9c2c61b15c3">
   <xsd:schema xmlns:xsd="http://www.w3.org/2001/XMLSchema" xmlns:xs="http://www.w3.org/2001/XMLSchema" xmlns:p="http://schemas.microsoft.com/office/2006/metadata/properties" xmlns:ns2="dcad1f52-99d9-4eec-95fc-8866ed2e151b" targetNamespace="http://schemas.microsoft.com/office/2006/metadata/properties" ma:root="true" ma:fieldsID="aae3021ca0d968f6dd92c1313e02e8e7" ns2:_="">
     <xsd:import namespace="dcad1f52-99d9-4eec-95fc-8866ed2e151b"/>
@@ -4981,6 +5046,21 @@
 </ct:contentTypeSchema>
 </file>
 
+<file path=customXml/item3.xml><?xml version="1.0" encoding="utf-8"?>
+<p:properties xmlns:p="http://schemas.microsoft.com/office/2006/metadata/properties" xmlns:xsi="http://www.w3.org/2001/XMLSchema-instance" xmlns:pc="http://schemas.microsoft.com/office/infopath/2007/PartnerControls">
+  <documentManagement/>
+</p:properties>
+</file>
+
+<file path=customXml/item4.xml><?xml version="1.0" encoding="utf-8"?>
+<?mso-contentType ?>
+<FormTemplates xmlns="http://schemas.microsoft.com/sharepoint/v3/contenttype/forms">
+  <Display>DocumentLibraryForm</Display>
+  <Edit>DocumentLibraryForm</Edit>
+  <New>DocumentLibraryForm</New>
+</FormTemplates>
+</file>
+
 <file path=customXml/itemProps1.xml><?xml version="1.0" encoding="utf-8"?>
 <ds:datastoreItem xmlns:ds="http://schemas.openxmlformats.org/officeDocument/2006/customXml" ds:itemID="{B1977F7D-205B-4081-913C-38D41E755F92}">
   <ds:schemaRefs>
@@ -4990,23 +5070,6 @@
 </file>
 
 <file path=customXml/itemProps2.xml><?xml version="1.0" encoding="utf-8"?>
-<ds:datastoreItem xmlns:ds="http://schemas.openxmlformats.org/officeDocument/2006/customXml" ds:itemID="{7BDF9320-02E3-45FE-BA80-EB3A0EF3B181}">
-  <ds:schemaRefs>
-    <ds:schemaRef ds:uri="http://schemas.microsoft.com/sharepoint/v3/contenttype/forms"/>
-  </ds:schemaRefs>
-</ds:datastoreItem>
-</file>
-
-<file path=customXml/itemProps3.xml><?xml version="1.0" encoding="utf-8"?>
-<ds:datastoreItem xmlns:ds="http://schemas.openxmlformats.org/officeDocument/2006/customXml" ds:itemID="{8E01AADA-C075-4CD4-AE01-CA261893014F}">
-  <ds:schemaRefs>
-    <ds:schemaRef ds:uri="http://schemas.microsoft.com/office/2006/metadata/properties"/>
-    <ds:schemaRef ds:uri="http://schemas.microsoft.com/office/infopath/2007/PartnerControls"/>
-  </ds:schemaRefs>
-</ds:datastoreItem>
-</file>
-
-<file path=customXml/itemProps4.xml><?xml version="1.0" encoding="utf-8"?>
 <ds:datastoreItem xmlns:ds="http://schemas.openxmlformats.org/officeDocument/2006/customXml" ds:itemID="{420077C5-86C4-408B-8C0D-1FE579DE108E}">
   <ds:schemaRefs>
     <ds:schemaRef ds:uri="http://schemas.microsoft.com/office/2006/metadata/contentType"/>
@@ -5022,4 +5085,21 @@
     <ds:schemaRef ds:uri="http://schemas.microsoft.com/internal/obd"/>
   </ds:schemaRefs>
 </ds:datastoreItem>
+</file>
+
+<file path=customXml/itemProps3.xml><?xml version="1.0" encoding="utf-8"?>
+<ds:datastoreItem xmlns:ds="http://schemas.openxmlformats.org/officeDocument/2006/customXml" ds:itemID="{8E01AADA-C075-4CD4-AE01-CA261893014F}">
+  <ds:schemaRefs>
+    <ds:schemaRef ds:uri="http://schemas.microsoft.com/office/2006/metadata/properties"/>
+    <ds:schemaRef ds:uri="http://schemas.microsoft.com/office/infopath/2007/PartnerControls"/>
+  </ds:schemaRefs>
+</ds:datastoreItem>
+</file>
+
+<file path=customXml/itemProps4.xml><?xml version="1.0" encoding="utf-8"?>
+<ds:datastoreItem xmlns:ds="http://schemas.openxmlformats.org/officeDocument/2006/customXml" ds:itemID="{7BDF9320-02E3-45FE-BA80-EB3A0EF3B181}">
+  <ds:schemaRefs>
+    <ds:schemaRef ds:uri="http://schemas.microsoft.com/sharepoint/v3/contenttype/forms"/>
+  </ds:schemaRefs>
+</ds:datastoreItem>
 </file>
</xml_diff>